<commit_message>
Date: 15 Jan 2026
</commit_message>
<xml_diff>
--- a/Notes.docx
+++ b/Notes.docx
@@ -5223,6 +5223,94 @@
           <w:szCs w:val="22"/>
         </w:rPr>
       </w:pPr>
+      <w:r>
+        <w:rPr>
+          <w:sz w:val="24"/>
+          <w:szCs w:val="22"/>
+        </w:rPr>
+        <w:t>Synchronization Issue</w:t>
+      </w:r>
+    </w:p>
+    <w:p>
+      <w:pPr>
+        <w:pStyle w:val="ListParagraph"/>
+        <w:numPr>
+          <w:ilvl w:val="0"/>
+          <w:numId w:val="14"/>
+        </w:numPr>
+        <w:rPr>
+          <w:sz w:val="24"/>
+          <w:szCs w:val="22"/>
+        </w:rPr>
+      </w:pPr>
+      <w:r>
+        <w:rPr>
+          <w:sz w:val="24"/>
+          <w:szCs w:val="22"/>
+        </w:rPr>
+        <w:t xml:space="preserve">SessionTimeOutException </w:t>
+      </w:r>
+      <w:r>
+        <w:rPr>
+          <w:sz w:val="24"/>
+          <w:szCs w:val="22"/>
+        </w:rPr>
+        <w:sym w:font="Wingdings" w:char="F0E0"/>
+      </w:r>
+      <w:r>
+        <w:rPr>
+          <w:sz w:val="24"/>
+          <w:szCs w:val="22"/>
+        </w:rPr>
+        <w:t xml:space="preserve"> </w:t>
+      </w:r>
+      <w:r>
+        <w:rPr>
+          <w:b/>
+          <w:bCs/>
+          <w:sz w:val="24"/>
+          <w:szCs w:val="22"/>
+        </w:rPr>
+        <w:t xml:space="preserve">Selenium waits for maximum 30 seconds to load the page via </w:t>
+      </w:r>
+      <w:proofErr w:type="spellStart"/>
+      <w:proofErr w:type="gramStart"/>
+      <w:r>
+        <w:rPr>
+          <w:b/>
+          <w:bCs/>
+          <w:sz w:val="24"/>
+          <w:szCs w:val="22"/>
+        </w:rPr>
+        <w:t>driver.get</w:t>
+      </w:r>
+      <w:proofErr w:type="spellEnd"/>
+      <w:r>
+        <w:rPr>
+          <w:b/>
+          <w:bCs/>
+          <w:sz w:val="24"/>
+          <w:szCs w:val="22"/>
+        </w:rPr>
+        <w:t>(</w:t>
+      </w:r>
+      <w:proofErr w:type="gramEnd"/>
+      <w:r>
+        <w:rPr>
+          <w:b/>
+          <w:bCs/>
+          <w:sz w:val="24"/>
+          <w:szCs w:val="22"/>
+        </w:rPr>
+        <w:t>)</w:t>
+      </w:r>
+      <w:r>
+        <w:rPr>
+          <w:sz w:val="24"/>
+          <w:szCs w:val="22"/>
+        </w:rPr>
+        <w:t>. If the page didn’t get loaded within 30 seconds, the Selenium will throw this exception.</w:t>
+      </w:r>
     </w:p>
     <w:p>
       <w:pPr>
@@ -5732,6 +5820,7 @@
           <w:sz w:val="24"/>
           <w:szCs w:val="22"/>
         </w:rPr>
+        <w:lastRenderedPageBreak/>
         <w:t>Locators:</w:t>
       </w:r>
     </w:p>
@@ -5788,7 +5877,6 @@
           <w:sz w:val="24"/>
           <w:szCs w:val="22"/>
         </w:rPr>
-        <w:lastRenderedPageBreak/>
         <w:t>Actually locators are the strategies to find the control.</w:t>
       </w:r>
     </w:p>
@@ -6404,6 +6492,7 @@
           <w:sz w:val="24"/>
           <w:szCs w:val="22"/>
         </w:rPr>
+        <w:lastRenderedPageBreak/>
         <w:br/>
       </w:r>
     </w:p>
@@ -6438,7 +6527,6 @@
           <w:sz w:val="24"/>
           <w:szCs w:val="22"/>
         </w:rPr>
-        <w:lastRenderedPageBreak/>
         <w:t xml:space="preserve">Pattankodoli Bus Stand </w:t>
       </w:r>
       <w:r>
@@ -7259,7 +7347,6 @@
           <w:sz w:val="24"/>
           <w:szCs w:val="22"/>
         </w:rPr>
-        <w:lastRenderedPageBreak/>
         <w:t>Display selected country</w:t>
       </w:r>
     </w:p>
@@ -7828,85 +7915,587 @@
         </w:rPr>
         <w:br/>
       </w:r>
+      <w:r>
+        <w:rPr>
+          <w:b/>
+          <w:bCs/>
+          <w:sz w:val="24"/>
+          <w:szCs w:val="22"/>
+        </w:rPr>
+        <w:br/>
+        <w:t>OR</w:t>
+      </w:r>
+      <w:r>
+        <w:rPr>
+          <w:b/>
+          <w:bCs/>
+          <w:sz w:val="24"/>
+          <w:szCs w:val="22"/>
+        </w:rPr>
+        <w:br/>
+      </w:r>
+      <w:r>
+        <w:rPr>
+          <w:b/>
+          <w:bCs/>
+          <w:sz w:val="24"/>
+          <w:szCs w:val="22"/>
+        </w:rPr>
+        <w:br/>
+      </w:r>
+      <w:r>
+        <w:rPr>
+          <w:b/>
+          <w:bCs/>
+          <w:sz w:val="24"/>
+          <w:szCs w:val="22"/>
+        </w:rPr>
+        <w:t>wait.until(ExpectedConditions.elementToBeClickable(chkBox)).click();</w:t>
+      </w:r>
+    </w:p>
+    <w:p>
+      <w:pPr>
+        <w:pStyle w:val="ListParagraph"/>
+        <w:numPr>
+          <w:ilvl w:val="0"/>
+          <w:numId w:val="23"/>
+        </w:numPr>
+        <w:rPr>
+          <w:sz w:val="24"/>
+          <w:szCs w:val="22"/>
+        </w:rPr>
+      </w:pPr>
+      <w:r>
+        <w:rPr>
+          <w:sz w:val="24"/>
+          <w:szCs w:val="22"/>
+        </w:rPr>
+        <w:t>FluentWait</w:t>
+      </w:r>
+      <w:r>
+        <w:rPr>
+          <w:sz w:val="24"/>
+          <w:szCs w:val="22"/>
+        </w:rPr>
+        <w:t xml:space="preserve"> – It is advanced version of ExplicitWait </w:t>
+      </w:r>
+    </w:p>
+    <w:p>
+      <w:pPr>
+        <w:pStyle w:val="ListParagraph"/>
+        <w:numPr>
+          <w:ilvl w:val="1"/>
+          <w:numId w:val="23"/>
+        </w:numPr>
+        <w:rPr>
+          <w:sz w:val="24"/>
+          <w:szCs w:val="22"/>
+        </w:rPr>
+      </w:pPr>
+      <w:r>
+        <w:rPr>
+          <w:sz w:val="24"/>
+          <w:szCs w:val="22"/>
+        </w:rPr>
+        <w:t>It is applicable to single statement only</w:t>
+      </w:r>
+    </w:p>
+    <w:p>
+      <w:pPr>
+        <w:pStyle w:val="ListParagraph"/>
+        <w:numPr>
+          <w:ilvl w:val="1"/>
+          <w:numId w:val="23"/>
+        </w:numPr>
+        <w:rPr>
+          <w:sz w:val="24"/>
+          <w:szCs w:val="22"/>
+        </w:rPr>
+      </w:pPr>
+      <w:r>
+        <w:rPr>
+          <w:sz w:val="24"/>
+          <w:szCs w:val="22"/>
+        </w:rPr>
+        <w:t>Will not take mandatory delay</w:t>
+      </w:r>
+    </w:p>
+    <w:p>
+      <w:pPr>
+        <w:pStyle w:val="ListParagraph"/>
+        <w:numPr>
+          <w:ilvl w:val="1"/>
+          <w:numId w:val="23"/>
+        </w:numPr>
+        <w:rPr>
+          <w:sz w:val="24"/>
+          <w:szCs w:val="22"/>
+        </w:rPr>
+      </w:pPr>
+      <w:r>
+        <w:rPr>
+          <w:sz w:val="24"/>
+          <w:szCs w:val="22"/>
+        </w:rPr>
+        <w:t xml:space="preserve">We can specify the condition for wait. (ElementToBeClickable, AlertIsPresent, </w:t>
+      </w:r>
+      <w:proofErr w:type="spellStart"/>
+      <w:r>
+        <w:rPr>
+          <w:sz w:val="24"/>
+          <w:szCs w:val="22"/>
+        </w:rPr>
+        <w:t>VisibilityOfElementLocated</w:t>
+      </w:r>
+      <w:proofErr w:type="spellEnd"/>
+      <w:r>
+        <w:rPr>
+          <w:sz w:val="24"/>
+          <w:szCs w:val="22"/>
+        </w:rPr>
+        <w:t>)</w:t>
+      </w:r>
+    </w:p>
+    <w:p>
+      <w:pPr>
+        <w:pStyle w:val="ListParagraph"/>
+        <w:numPr>
+          <w:ilvl w:val="1"/>
+          <w:numId w:val="23"/>
+        </w:numPr>
+        <w:rPr>
+          <w:sz w:val="24"/>
+          <w:szCs w:val="22"/>
+        </w:rPr>
+      </w:pPr>
+      <w:r>
+        <w:rPr>
+          <w:sz w:val="24"/>
+          <w:szCs w:val="22"/>
+        </w:rPr>
+        <w:t>We can handle some specific exception as well.</w:t>
+      </w:r>
+      <w:r>
+        <w:rPr>
+          <w:sz w:val="24"/>
+          <w:szCs w:val="22"/>
+        </w:rPr>
+        <w:br/>
+        <w:t xml:space="preserve">w – withTimeout </w:t>
+      </w:r>
+      <w:r>
+        <w:rPr>
+          <w:sz w:val="24"/>
+          <w:szCs w:val="22"/>
+        </w:rPr>
+        <w:br/>
+      </w:r>
+      <w:proofErr w:type="spellStart"/>
+      <w:r>
+        <w:rPr>
+          <w:sz w:val="24"/>
+          <w:szCs w:val="22"/>
+        </w:rPr>
+        <w:t>i</w:t>
+      </w:r>
+      <w:proofErr w:type="spellEnd"/>
+      <w:r>
+        <w:rPr>
+          <w:sz w:val="24"/>
+          <w:szCs w:val="22"/>
+        </w:rPr>
+        <w:t xml:space="preserve"> – ignoring </w:t>
+      </w:r>
+      <w:r>
+        <w:rPr>
+          <w:sz w:val="24"/>
+          <w:szCs w:val="22"/>
+        </w:rPr>
+        <w:br/>
+      </w:r>
+      <w:r>
+        <w:rPr>
+          <w:sz w:val="24"/>
+          <w:szCs w:val="22"/>
+        </w:rPr>
+        <w:lastRenderedPageBreak/>
+        <w:t xml:space="preserve">p – pollingEvery </w:t>
+      </w:r>
+      <w:r>
+        <w:rPr>
+          <w:sz w:val="24"/>
+          <w:szCs w:val="22"/>
+        </w:rPr>
+        <w:br/>
+        <w:t xml:space="preserve">u – until </w:t>
+      </w:r>
+      <w:r>
+        <w:rPr>
+          <w:sz w:val="24"/>
+          <w:szCs w:val="22"/>
+        </w:rPr>
+        <w:br/>
+      </w:r>
+    </w:p>
+    <w:p>
+      <w:pPr>
+        <w:pStyle w:val="ListParagraph"/>
+        <w:ind w:left="1440"/>
+        <w:rPr>
+          <w:sz w:val="24"/>
+          <w:szCs w:val="22"/>
+        </w:rPr>
+      </w:pPr>
+    </w:p>
+    <w:p>
+      <w:pPr>
+        <w:pStyle w:val="ListParagraph"/>
+        <w:ind w:left="1440"/>
+        <w:rPr>
+          <w:sz w:val="24"/>
+          <w:szCs w:val="22"/>
+        </w:rPr>
+      </w:pPr>
+    </w:p>
+    <w:p>
+      <w:pPr>
+        <w:pStyle w:val="ListParagraph"/>
+        <w:ind w:left="1440"/>
+        <w:rPr>
+          <w:sz w:val="24"/>
+          <w:szCs w:val="22"/>
+        </w:rPr>
+      </w:pPr>
+      <w:r>
+        <w:rPr>
+          <w:sz w:val="24"/>
+          <w:szCs w:val="22"/>
+        </w:rPr>
+        <w:t>FluentWait&lt;WebDriver&gt;wait = new FluentWait&lt;</w:t>
+      </w:r>
+      <w:proofErr w:type="gramStart"/>
+      <w:r>
+        <w:rPr>
+          <w:sz w:val="24"/>
+          <w:szCs w:val="22"/>
+        </w:rPr>
+        <w:t>&gt;(</w:t>
+      </w:r>
+      <w:proofErr w:type="gramEnd"/>
+      <w:r>
+        <w:rPr>
+          <w:sz w:val="24"/>
+          <w:szCs w:val="22"/>
+        </w:rPr>
+        <w:t>driver);</w:t>
+      </w:r>
+    </w:p>
+    <w:p>
+      <w:pPr>
+        <w:ind w:left="1080"/>
+        <w:rPr>
+          <w:sz w:val="24"/>
+          <w:szCs w:val="22"/>
+        </w:rPr>
+      </w:pPr>
+      <w:r>
+        <w:rPr>
+          <w:sz w:val="24"/>
+          <w:szCs w:val="22"/>
+        </w:rPr>
+        <w:t xml:space="preserve">        </w:t>
+      </w:r>
+      <w:proofErr w:type="spellStart"/>
+      <w:proofErr w:type="gramStart"/>
+      <w:r>
+        <w:rPr>
+          <w:sz w:val="24"/>
+          <w:szCs w:val="22"/>
+        </w:rPr>
+        <w:t>wait.withTimeout</w:t>
+      </w:r>
+      <w:proofErr w:type="spellEnd"/>
+      <w:r>
+        <w:rPr>
+          <w:sz w:val="24"/>
+          <w:szCs w:val="22"/>
+        </w:rPr>
+        <w:t>(</w:t>
+      </w:r>
+      <w:proofErr w:type="spellStart"/>
+      <w:proofErr w:type="gramEnd"/>
+      <w:r>
+        <w:rPr>
+          <w:sz w:val="24"/>
+          <w:szCs w:val="22"/>
+        </w:rPr>
+        <w:t>Duration.ofSeconds</w:t>
+      </w:r>
+      <w:proofErr w:type="spellEnd"/>
+      <w:r>
+        <w:rPr>
+          <w:sz w:val="24"/>
+          <w:szCs w:val="22"/>
+        </w:rPr>
+        <w:t>(10))</w:t>
+      </w:r>
+    </w:p>
+    <w:p>
+      <w:pPr>
+        <w:ind w:left="1080"/>
+        <w:rPr>
+          <w:sz w:val="24"/>
+          <w:szCs w:val="22"/>
+        </w:rPr>
+      </w:pPr>
+      <w:r>
+        <w:rPr>
+          <w:sz w:val="24"/>
+          <w:szCs w:val="22"/>
+        </w:rPr>
+        <w:t xml:space="preserve">        </w:t>
+      </w:r>
+      <w:r>
+        <w:rPr>
+          <w:sz w:val="24"/>
+          <w:szCs w:val="22"/>
+        </w:rPr>
+        <w:t>.</w:t>
+      </w:r>
+      <w:proofErr w:type="gramStart"/>
+      <w:r>
+        <w:rPr>
+          <w:sz w:val="24"/>
+          <w:szCs w:val="22"/>
+        </w:rPr>
+        <w:t>ignoring(</w:t>
+      </w:r>
+      <w:proofErr w:type="spellStart"/>
+      <w:proofErr w:type="gramEnd"/>
+      <w:r>
+        <w:rPr>
+          <w:sz w:val="24"/>
+          <w:szCs w:val="22"/>
+        </w:rPr>
+        <w:t>NoSuchElementException.class</w:t>
+      </w:r>
+      <w:proofErr w:type="spellEnd"/>
+      <w:r>
+        <w:rPr>
+          <w:sz w:val="24"/>
+          <w:szCs w:val="22"/>
+        </w:rPr>
+        <w:t>)</w:t>
+      </w:r>
+    </w:p>
+    <w:p>
+      <w:pPr>
+        <w:ind w:left="1440"/>
+        <w:rPr>
+          <w:sz w:val="24"/>
+          <w:szCs w:val="22"/>
+        </w:rPr>
+      </w:pPr>
+      <w:r>
+        <w:rPr>
+          <w:sz w:val="24"/>
+          <w:szCs w:val="22"/>
+        </w:rPr>
+        <w:t>.pollingEvery(</w:t>
+      </w:r>
+      <w:proofErr w:type="spellStart"/>
+      <w:r>
+        <w:rPr>
+          <w:sz w:val="24"/>
+          <w:szCs w:val="22"/>
+        </w:rPr>
+        <w:t>Duration.ofMillis</w:t>
+      </w:r>
+      <w:proofErr w:type="spellEnd"/>
+      <w:r>
+        <w:rPr>
+          <w:sz w:val="24"/>
+          <w:szCs w:val="22"/>
+        </w:rPr>
+        <w:t>(1))                .until(ExpectedConditions.visibilityOfElementLocated(By.name("username"))).sendKeys("admin");</w:t>
+      </w:r>
+    </w:p>
+    <w:p>
+      <w:pPr>
+        <w:ind w:left="1080"/>
+        <w:rPr>
+          <w:sz w:val="24"/>
+          <w:szCs w:val="22"/>
+        </w:rPr>
+      </w:pPr>
+      <w:r>
+        <w:rPr>
+          <w:sz w:val="24"/>
+          <w:szCs w:val="22"/>
+        </w:rPr>
+        <w:t xml:space="preserve">        </w:t>
+      </w:r>
+    </w:p>
+    <w:p>
+      <w:pPr>
+        <w:pStyle w:val="ListParagraph"/>
+        <w:numPr>
+          <w:ilvl w:val="0"/>
+          <w:numId w:val="23"/>
+        </w:numPr>
+        <w:rPr>
+          <w:sz w:val="24"/>
+          <w:szCs w:val="22"/>
+        </w:rPr>
+      </w:pPr>
+      <w:r>
+        <w:rPr>
+          <w:sz w:val="24"/>
+          <w:szCs w:val="22"/>
+        </w:rPr>
+        <w:t>PageLoadTimeout</w:t>
+      </w:r>
+      <w:r>
+        <w:rPr>
+          <w:sz w:val="24"/>
+          <w:szCs w:val="22"/>
+        </w:rPr>
+        <w:t xml:space="preserve"> </w:t>
+      </w:r>
+      <w:r>
+        <w:rPr>
+          <w:sz w:val="24"/>
+          <w:szCs w:val="22"/>
+        </w:rPr>
+        <w:sym w:font="Wingdings" w:char="F0E0"/>
+      </w:r>
+      <w:r>
+        <w:rPr>
+          <w:sz w:val="24"/>
+          <w:szCs w:val="22"/>
+        </w:rPr>
+        <w:t xml:space="preserve"> Used to avoid SessionTimeoutException, for adding more wait till the page get loaded completely. </w:t>
+      </w:r>
+    </w:p>
+    <w:p>
+      <w:pPr>
+        <w:ind w:firstLine="360"/>
+        <w:rPr>
+          <w:b/>
+          <w:bCs/>
+          <w:sz w:val="24"/>
+          <w:szCs w:val="22"/>
+        </w:rPr>
+      </w:pPr>
+      <w:proofErr w:type="spellStart"/>
+      <w:proofErr w:type="gramStart"/>
+      <w:r>
+        <w:rPr>
+          <w:b/>
+          <w:bCs/>
+          <w:sz w:val="24"/>
+          <w:szCs w:val="22"/>
+        </w:rPr>
+        <w:t>driver.get</w:t>
+      </w:r>
+      <w:proofErr w:type="spellEnd"/>
+      <w:r>
+        <w:rPr>
+          <w:b/>
+          <w:bCs/>
+          <w:sz w:val="24"/>
+          <w:szCs w:val="22"/>
+        </w:rPr>
+        <w:t>(</w:t>
+      </w:r>
+      <w:proofErr w:type="gramEnd"/>
+      <w:r>
+        <w:rPr>
+          <w:b/>
+          <w:bCs/>
+          <w:sz w:val="24"/>
+          <w:szCs w:val="22"/>
+        </w:rPr>
+        <w:t>"https://omayo.blogspot.com/");</w:t>
+      </w:r>
+    </w:p>
+    <w:p>
+      <w:pPr>
+        <w:rPr>
+          <w:sz w:val="24"/>
+          <w:szCs w:val="22"/>
+        </w:rPr>
+      </w:pPr>
+      <w:r>
+        <w:rPr>
+          <w:b/>
+          <w:bCs/>
+          <w:sz w:val="24"/>
+          <w:szCs w:val="22"/>
+        </w:rPr>
+        <w:t xml:space="preserve">        </w:t>
+      </w:r>
+      <w:proofErr w:type="gramStart"/>
+      <w:r>
+        <w:rPr>
+          <w:b/>
+          <w:bCs/>
+          <w:sz w:val="24"/>
+          <w:szCs w:val="22"/>
+        </w:rPr>
+        <w:t>driver.manage(</w:t>
+      </w:r>
+      <w:proofErr w:type="gramEnd"/>
+      <w:r>
+        <w:rPr>
+          <w:b/>
+          <w:bCs/>
+          <w:sz w:val="24"/>
+          <w:szCs w:val="22"/>
+        </w:rPr>
+        <w:t>).timeouts().pageLoadTimeout(Duration.ofSeconds(20));</w:t>
+      </w:r>
+      <w:r>
+        <w:rPr>
+          <w:sz w:val="24"/>
+          <w:szCs w:val="22"/>
+        </w:rPr>
+        <w:tab/>
+      </w:r>
+    </w:p>
+    <w:p>
+      <w:pPr>
+        <w:rPr>
+          <w:sz w:val="24"/>
+          <w:szCs w:val="22"/>
+        </w:rPr>
+      </w:pPr>
+    </w:p>
+    <w:p>
+      <w:pPr>
+        <w:rPr>
+          <w:sz w:val="24"/>
+          <w:szCs w:val="22"/>
+        </w:rPr>
+      </w:pPr>
+    </w:p>
+    <w:p>
+      <w:pPr>
+        <w:rPr>
+          <w:sz w:val="24"/>
+          <w:szCs w:val="22"/>
+        </w:rPr>
+      </w:pPr>
       <w:bookmarkStart w:id="0" w:name="_GoBack"/>
       <w:bookmarkEnd w:id="0"/>
-      <w:r>
-        <w:rPr>
-          <w:b/>
-          <w:bCs/>
-          <w:sz w:val="24"/>
-          <w:szCs w:val="22"/>
-        </w:rPr>
-        <w:br/>
-        <w:t>OR</w:t>
-      </w:r>
-      <w:r>
-        <w:rPr>
-          <w:b/>
-          <w:bCs/>
-          <w:sz w:val="24"/>
-          <w:szCs w:val="22"/>
-        </w:rPr>
-        <w:br/>
-      </w:r>
-      <w:r>
-        <w:rPr>
-          <w:b/>
-          <w:bCs/>
-          <w:sz w:val="24"/>
-          <w:szCs w:val="22"/>
-        </w:rPr>
-        <w:br/>
-      </w:r>
-      <w:r>
-        <w:rPr>
-          <w:b/>
-          <w:bCs/>
-          <w:sz w:val="24"/>
-          <w:szCs w:val="22"/>
-        </w:rPr>
-        <w:t>wait.until(ExpectedConditions.elementToBeClickable(chkBox)).click();</w:t>
-      </w:r>
-    </w:p>
-    <w:p>
-      <w:pPr>
-        <w:pStyle w:val="ListParagraph"/>
-        <w:numPr>
-          <w:ilvl w:val="0"/>
-          <w:numId w:val="23"/>
-        </w:numPr>
-        <w:rPr>
-          <w:sz w:val="24"/>
-          <w:szCs w:val="22"/>
-        </w:rPr>
-      </w:pPr>
-      <w:r>
-        <w:rPr>
-          <w:sz w:val="24"/>
-          <w:szCs w:val="22"/>
-        </w:rPr>
-        <w:t>FluentWait</w:t>
-      </w:r>
-    </w:p>
-    <w:p>
-      <w:pPr>
-        <w:pStyle w:val="ListParagraph"/>
-        <w:numPr>
-          <w:ilvl w:val="0"/>
-          <w:numId w:val="23"/>
-        </w:numPr>
-        <w:rPr>
-          <w:sz w:val="24"/>
-          <w:szCs w:val="22"/>
-        </w:rPr>
-      </w:pPr>
-      <w:r>
-        <w:rPr>
-          <w:sz w:val="24"/>
-          <w:szCs w:val="22"/>
-        </w:rPr>
-        <w:t>PageLoadTimeout</w:t>
-      </w:r>
+    </w:p>
+    <w:p>
+      <w:pPr>
+        <w:rPr>
+          <w:sz w:val="24"/>
+          <w:szCs w:val="22"/>
+        </w:rPr>
+      </w:pPr>
     </w:p>
     <w:p>
       <w:pPr>

</xml_diff>

<commit_message>
Date: 22 Jan 2026
</commit_message>
<xml_diff>
--- a/Notes.docx
+++ b/Notes.docx
@@ -5208,6 +5208,56 @@
           <w:szCs w:val="22"/>
         </w:rPr>
         <w:t>: If the control is hidden by some another control (like advertisement) on the page then Selenium will throw this exception.</w:t>
+      </w:r>
+    </w:p>
+    <w:p>
+      <w:pPr>
+        <w:pStyle w:val="ListParagraph"/>
+        <w:numPr>
+          <w:ilvl w:val="0"/>
+          <w:numId w:val="14"/>
+        </w:numPr>
+        <w:rPr>
+          <w:sz w:val="24"/>
+          <w:szCs w:val="22"/>
+        </w:rPr>
+      </w:pPr>
+      <w:r>
+        <w:rPr>
+          <w:sz w:val="24"/>
+          <w:szCs w:val="22"/>
+        </w:rPr>
+        <w:t>NoAlertPresentException</w:t>
+      </w:r>
+      <w:r>
+        <w:rPr>
+          <w:sz w:val="24"/>
+          <w:szCs w:val="22"/>
+        </w:rPr>
+        <w:t xml:space="preserve"> </w:t>
+      </w:r>
+      <w:r>
+        <w:rPr>
+          <w:sz w:val="24"/>
+          <w:szCs w:val="22"/>
+        </w:rPr>
+        <w:sym w:font="Wingdings" w:char="F0E0"/>
+      </w:r>
+      <w:r>
+        <w:rPr>
+          <w:sz w:val="24"/>
+          <w:szCs w:val="22"/>
+        </w:rPr>
+        <w:t xml:space="preserve"> You are trying to handle an alert but currently</w:t>
+      </w:r>
+      <w:bookmarkStart w:id="0" w:name="_GoBack"/>
+      <w:bookmarkEnd w:id="0"/>
+      <w:r>
+        <w:rPr>
+          <w:sz w:val="24"/>
+          <w:szCs w:val="22"/>
+        </w:rPr>
+        <w:t xml:space="preserve"> there is no any alert on the page.</w:t>
       </w:r>
     </w:p>
     <w:p>
@@ -5555,6 +5605,7 @@
           <w:sz w:val="24"/>
           <w:szCs w:val="22"/>
         </w:rPr>
+        <w:lastRenderedPageBreak/>
         <w:t xml:space="preserve">isSelected() </w:t>
       </w:r>
       <w:r>
@@ -5589,7 +5640,6 @@
           <w:sz w:val="24"/>
           <w:szCs w:val="22"/>
         </w:rPr>
-        <w:lastRenderedPageBreak/>
         <w:t xml:space="preserve">isEnabled() </w:t>
       </w:r>
       <w:r>
@@ -6187,6 +6237,7 @@
           <w:sz w:val="24"/>
           <w:szCs w:val="22"/>
         </w:rPr>
+        <w:lastRenderedPageBreak/>
         <w:t>^ - Starts with</w:t>
       </w:r>
     </w:p>
@@ -6227,7 +6278,6 @@
           <w:sz w:val="24"/>
           <w:szCs w:val="22"/>
         </w:rPr>
-        <w:lastRenderedPageBreak/>
         <w:t>* - Contains</w:t>
       </w:r>
     </w:p>
@@ -6938,6 +6988,7 @@
           <w:sz w:val="24"/>
           <w:szCs w:val="22"/>
         </w:rPr>
+        <w:lastRenderedPageBreak/>
         <w:t>deselectByIndex()</w:t>
       </w:r>
     </w:p>
@@ -6978,7 +7029,6 @@
           <w:sz w:val="24"/>
           <w:szCs w:val="22"/>
         </w:rPr>
-        <w:lastRenderedPageBreak/>
         <w:t>deselectByContainsVisibleText()</w:t>
       </w:r>
     </w:p>
@@ -7625,6 +7675,7 @@
           <w:sz w:val="24"/>
           <w:szCs w:val="22"/>
         </w:rPr>
+        <w:lastRenderedPageBreak/>
         <w:t>We can specify the condition for wait. (ElementToBeClickable, AlertIsPresent, VisibilityOfElementLocated)</w:t>
       </w:r>
     </w:p>
@@ -7645,7 +7696,6 @@
           <w:sz w:val="24"/>
           <w:szCs w:val="22"/>
         </w:rPr>
-        <w:lastRenderedPageBreak/>
         <w:t>We can handle some specific exception as well.</w:t>
       </w:r>
       <w:r>
@@ -8228,6 +8278,7 @@
           <w:szCs w:val="23"/>
           <w:lang w:eastAsia="en-IN"/>
         </w:rPr>
+        <w:lastRenderedPageBreak/>
         <w:br/>
       </w:r>
       <w:r>
@@ -8260,8 +8311,483 @@
           <w:szCs w:val="22"/>
         </w:rPr>
       </w:pPr>
-      <w:bookmarkStart w:id="0" w:name="_GoBack"/>
-      <w:bookmarkEnd w:id="0"/>
+      <w:r>
+        <w:rPr>
+          <w:b/>
+          <w:bCs/>
+          <w:sz w:val="24"/>
+          <w:szCs w:val="22"/>
+        </w:rPr>
+        <w:t>OR</w:t>
+      </w:r>
+    </w:p>
+    <w:p>
+      <w:pPr>
+        <w:shd w:val="clear" w:color="auto" w:fill="1E1F22"/>
+        <w:tabs>
+          <w:tab w:val="left" w:pos="916"/>
+          <w:tab w:val="left" w:pos="1832"/>
+          <w:tab w:val="left" w:pos="2748"/>
+          <w:tab w:val="left" w:pos="3664"/>
+          <w:tab w:val="left" w:pos="4580"/>
+          <w:tab w:val="left" w:pos="5496"/>
+          <w:tab w:val="left" w:pos="6412"/>
+          <w:tab w:val="left" w:pos="7328"/>
+          <w:tab w:val="left" w:pos="8244"/>
+          <w:tab w:val="left" w:pos="9160"/>
+          <w:tab w:val="left" w:pos="10076"/>
+          <w:tab w:val="left" w:pos="10992"/>
+          <w:tab w:val="left" w:pos="11908"/>
+          <w:tab w:val="left" w:pos="12824"/>
+          <w:tab w:val="left" w:pos="13740"/>
+          <w:tab w:val="left" w:pos="14656"/>
+        </w:tabs>
+        <w:spacing w:after="0" w:line="240" w:lineRule="auto"/>
+        <w:rPr>
+          <w:rFonts w:ascii="Courier New" w:eastAsia="Times New Roman" w:hAnsi="Courier New" w:cs="Courier New"/>
+          <w:color w:val="BCBEC4"/>
+          <w:sz w:val="23"/>
+          <w:szCs w:val="23"/>
+          <w:lang w:eastAsia="en-IN"/>
+        </w:rPr>
+      </w:pPr>
+      <w:r>
+        <w:rPr>
+          <w:rFonts w:ascii="Courier New" w:eastAsia="Times New Roman" w:hAnsi="Courier New" w:cs="Courier New"/>
+          <w:color w:val="BCBEC4"/>
+          <w:sz w:val="23"/>
+          <w:szCs w:val="23"/>
+          <w:lang w:eastAsia="en-IN"/>
+        </w:rPr>
+        <w:t>Iterator&lt;String&gt;itr = windows.iterator();</w:t>
+      </w:r>
+      <w:r>
+        <w:rPr>
+          <w:rFonts w:ascii="Courier New" w:eastAsia="Times New Roman" w:hAnsi="Courier New" w:cs="Courier New"/>
+          <w:color w:val="BCBEC4"/>
+          <w:sz w:val="23"/>
+          <w:szCs w:val="23"/>
+          <w:lang w:eastAsia="en-IN"/>
+        </w:rPr>
+        <w:br/>
+      </w:r>
+      <w:r>
+        <w:rPr>
+          <w:rFonts w:ascii="Courier New" w:eastAsia="Times New Roman" w:hAnsi="Courier New" w:cs="Courier New"/>
+          <w:color w:val="7A7E85"/>
+          <w:sz w:val="23"/>
+          <w:szCs w:val="23"/>
+          <w:lang w:eastAsia="en-IN"/>
+        </w:rPr>
+        <w:t>//Iterator is an interface for iterating (reading) the values from Set&lt;&gt;</w:t>
+      </w:r>
+      <w:r>
+        <w:rPr>
+          <w:rFonts w:ascii="Courier New" w:eastAsia="Times New Roman" w:hAnsi="Courier New" w:cs="Courier New"/>
+          <w:color w:val="7A7E85"/>
+          <w:sz w:val="23"/>
+          <w:szCs w:val="23"/>
+          <w:lang w:eastAsia="en-IN"/>
+        </w:rPr>
+        <w:br/>
+      </w:r>
+      <w:r>
+        <w:rPr>
+          <w:rFonts w:ascii="Courier New" w:eastAsia="Times New Roman" w:hAnsi="Courier New" w:cs="Courier New"/>
+          <w:color w:val="BCBEC4"/>
+          <w:sz w:val="23"/>
+          <w:szCs w:val="23"/>
+          <w:lang w:eastAsia="en-IN"/>
+        </w:rPr>
+        <w:t>String win1 = itr.next();</w:t>
+      </w:r>
+      <w:r>
+        <w:rPr>
+          <w:rFonts w:ascii="Courier New" w:eastAsia="Times New Roman" w:hAnsi="Courier New" w:cs="Courier New"/>
+          <w:color w:val="BCBEC4"/>
+          <w:sz w:val="23"/>
+          <w:szCs w:val="23"/>
+          <w:lang w:eastAsia="en-IN"/>
+        </w:rPr>
+        <w:br/>
+        <w:t>String win2 = itr.next();</w:t>
+      </w:r>
+    </w:p>
+    <w:p>
+      <w:pPr>
+        <w:rPr>
+          <w:b/>
+          <w:bCs/>
+          <w:sz w:val="24"/>
+          <w:szCs w:val="22"/>
+        </w:rPr>
+      </w:pPr>
+    </w:p>
+    <w:p>
+      <w:pPr>
+        <w:rPr>
+          <w:sz w:val="24"/>
+          <w:szCs w:val="22"/>
+        </w:rPr>
+      </w:pPr>
+    </w:p>
+    <w:p>
+      <w:pPr>
+        <w:rPr>
+          <w:b/>
+          <w:bCs/>
+          <w:sz w:val="24"/>
+          <w:szCs w:val="22"/>
+        </w:rPr>
+      </w:pPr>
+      <w:r>
+        <w:rPr>
+          <w:b/>
+          <w:bCs/>
+          <w:sz w:val="24"/>
+          <w:szCs w:val="22"/>
+        </w:rPr>
+        <w:t>Handling Alert</w:t>
+      </w:r>
+    </w:p>
+    <w:p>
+      <w:pPr>
+        <w:pStyle w:val="ListParagraph"/>
+        <w:numPr>
+          <w:ilvl w:val="0"/>
+          <w:numId w:val="25"/>
+        </w:numPr>
+        <w:rPr>
+          <w:b/>
+          <w:bCs/>
+          <w:sz w:val="24"/>
+          <w:szCs w:val="22"/>
+        </w:rPr>
+      </w:pPr>
+      <w:r>
+        <w:rPr>
+          <w:sz w:val="24"/>
+          <w:szCs w:val="22"/>
+        </w:rPr>
+        <w:t>Alert is an notification that is displayed on the normally top of the browser</w:t>
+      </w:r>
+    </w:p>
+    <w:p>
+      <w:pPr>
+        <w:pStyle w:val="ListParagraph"/>
+        <w:numPr>
+          <w:ilvl w:val="0"/>
+          <w:numId w:val="25"/>
+        </w:numPr>
+        <w:rPr>
+          <w:b/>
+          <w:bCs/>
+          <w:sz w:val="24"/>
+          <w:szCs w:val="22"/>
+        </w:rPr>
+      </w:pPr>
+      <w:r>
+        <w:rPr>
+          <w:sz w:val="24"/>
+          <w:szCs w:val="22"/>
+        </w:rPr>
+        <w:t>It doesn’t have close (x) button.</w:t>
+      </w:r>
+    </w:p>
+    <w:p>
+      <w:pPr>
+        <w:pStyle w:val="ListParagraph"/>
+        <w:numPr>
+          <w:ilvl w:val="0"/>
+          <w:numId w:val="25"/>
+        </w:numPr>
+        <w:rPr>
+          <w:b/>
+          <w:bCs/>
+          <w:sz w:val="24"/>
+          <w:szCs w:val="22"/>
+        </w:rPr>
+      </w:pPr>
+      <w:r>
+        <w:rPr>
+          <w:sz w:val="24"/>
+          <w:szCs w:val="22"/>
+        </w:rPr>
+        <w:t>If alert is open you are not allowed to perform any action on the page.</w:t>
+      </w:r>
+    </w:p>
+    <w:p>
+      <w:pPr>
+        <w:pStyle w:val="ListParagraph"/>
+        <w:numPr>
+          <w:ilvl w:val="0"/>
+          <w:numId w:val="25"/>
+        </w:numPr>
+        <w:rPr>
+          <w:b/>
+          <w:bCs/>
+          <w:sz w:val="24"/>
+          <w:szCs w:val="22"/>
+        </w:rPr>
+      </w:pPr>
+      <w:r>
+        <w:rPr>
+          <w:sz w:val="24"/>
+          <w:szCs w:val="22"/>
+        </w:rPr>
+        <w:t>You cannot inspect an alert</w:t>
+      </w:r>
+    </w:p>
+    <w:p>
+      <w:pPr>
+        <w:pStyle w:val="ListParagraph"/>
+        <w:numPr>
+          <w:ilvl w:val="0"/>
+          <w:numId w:val="25"/>
+        </w:numPr>
+        <w:rPr>
+          <w:b/>
+          <w:bCs/>
+          <w:sz w:val="24"/>
+          <w:szCs w:val="22"/>
+        </w:rPr>
+      </w:pPr>
+      <w:r>
+        <w:rPr>
+          <w:sz w:val="24"/>
+          <w:szCs w:val="22"/>
+        </w:rPr>
+        <w:t>Types of alert</w:t>
+      </w:r>
+    </w:p>
+    <w:p>
+      <w:pPr>
+        <w:pStyle w:val="ListParagraph"/>
+        <w:numPr>
+          <w:ilvl w:val="1"/>
+          <w:numId w:val="25"/>
+        </w:numPr>
+        <w:rPr>
+          <w:b/>
+          <w:bCs/>
+          <w:sz w:val="24"/>
+          <w:szCs w:val="22"/>
+        </w:rPr>
+      </w:pPr>
+      <w:r>
+        <w:rPr>
+          <w:sz w:val="24"/>
+          <w:szCs w:val="22"/>
+        </w:rPr>
+        <w:t>Normal alert (Only Ok button)</w:t>
+      </w:r>
+    </w:p>
+    <w:p>
+      <w:pPr>
+        <w:pStyle w:val="ListParagraph"/>
+        <w:numPr>
+          <w:ilvl w:val="1"/>
+          <w:numId w:val="25"/>
+        </w:numPr>
+        <w:rPr>
+          <w:b/>
+          <w:bCs/>
+          <w:sz w:val="24"/>
+          <w:szCs w:val="22"/>
+        </w:rPr>
+      </w:pPr>
+      <w:r>
+        <w:rPr>
+          <w:sz w:val="24"/>
+          <w:szCs w:val="22"/>
+        </w:rPr>
+        <w:t>Confirmation alert (Ok &amp; Cancel button)</w:t>
+      </w:r>
+    </w:p>
+    <w:p>
+      <w:pPr>
+        <w:pStyle w:val="ListParagraph"/>
+        <w:numPr>
+          <w:ilvl w:val="1"/>
+          <w:numId w:val="25"/>
+        </w:numPr>
+        <w:rPr>
+          <w:b/>
+          <w:bCs/>
+          <w:sz w:val="24"/>
+          <w:szCs w:val="22"/>
+        </w:rPr>
+      </w:pPr>
+      <w:r>
+        <w:rPr>
+          <w:sz w:val="24"/>
+          <w:szCs w:val="22"/>
+        </w:rPr>
+        <w:t>Prompt alert / input box (It can accept some value)</w:t>
+      </w:r>
+    </w:p>
+    <w:p>
+      <w:pPr>
+        <w:pStyle w:val="ListParagraph"/>
+        <w:numPr>
+          <w:ilvl w:val="0"/>
+          <w:numId w:val="25"/>
+        </w:numPr>
+        <w:rPr>
+          <w:b/>
+          <w:bCs/>
+          <w:sz w:val="24"/>
+          <w:szCs w:val="22"/>
+        </w:rPr>
+      </w:pPr>
+      <w:r>
+        <w:rPr>
+          <w:sz w:val="24"/>
+          <w:szCs w:val="22"/>
+        </w:rPr>
+        <w:t xml:space="preserve">For handling alert Selenium has provided </w:t>
+      </w:r>
+      <w:r>
+        <w:rPr>
+          <w:b/>
+          <w:bCs/>
+          <w:sz w:val="24"/>
+          <w:szCs w:val="22"/>
+        </w:rPr>
+        <w:t>Alert Interface.</w:t>
+      </w:r>
+    </w:p>
+    <w:p>
+      <w:pPr>
+        <w:pStyle w:val="ListParagraph"/>
+        <w:numPr>
+          <w:ilvl w:val="0"/>
+          <w:numId w:val="25"/>
+        </w:numPr>
+        <w:rPr>
+          <w:b/>
+          <w:bCs/>
+          <w:sz w:val="24"/>
+          <w:szCs w:val="22"/>
+        </w:rPr>
+      </w:pPr>
+      <w:r>
+        <w:rPr>
+          <w:b/>
+          <w:bCs/>
+          <w:sz w:val="24"/>
+          <w:szCs w:val="22"/>
+        </w:rPr>
+        <w:t>Methods</w:t>
+      </w:r>
+    </w:p>
+    <w:p>
+      <w:pPr>
+        <w:pStyle w:val="ListParagraph"/>
+        <w:numPr>
+          <w:ilvl w:val="1"/>
+          <w:numId w:val="25"/>
+        </w:numPr>
+        <w:rPr>
+          <w:b/>
+          <w:bCs/>
+          <w:sz w:val="24"/>
+          <w:szCs w:val="22"/>
+        </w:rPr>
+      </w:pPr>
+      <w:r>
+        <w:rPr>
+          <w:sz w:val="24"/>
+          <w:szCs w:val="22"/>
+        </w:rPr>
+        <w:t xml:space="preserve">driver.switchTo().alert() </w:t>
+      </w:r>
+      <w:r>
+        <w:rPr>
+          <w:sz w:val="24"/>
+          <w:szCs w:val="22"/>
+        </w:rPr>
+        <w:sym w:font="Wingdings" w:char="F0E0"/>
+      </w:r>
+      <w:r>
+        <w:rPr>
+          <w:sz w:val="24"/>
+          <w:szCs w:val="22"/>
+        </w:rPr>
+        <w:t xml:space="preserve"> Will switch to an alert.</w:t>
+      </w:r>
+    </w:p>
+    <w:p>
+      <w:pPr>
+        <w:pStyle w:val="ListParagraph"/>
+        <w:numPr>
+          <w:ilvl w:val="1"/>
+          <w:numId w:val="25"/>
+        </w:numPr>
+        <w:rPr>
+          <w:b/>
+          <w:bCs/>
+          <w:sz w:val="24"/>
+          <w:szCs w:val="22"/>
+        </w:rPr>
+      </w:pPr>
+      <w:r>
+        <w:rPr>
+          <w:sz w:val="24"/>
+          <w:szCs w:val="22"/>
+        </w:rPr>
+        <w:t xml:space="preserve">getText() </w:t>
+      </w:r>
+      <w:r>
+        <w:rPr>
+          <w:sz w:val="24"/>
+          <w:szCs w:val="22"/>
+        </w:rPr>
+        <w:sym w:font="Wingdings" w:char="F0E0"/>
+      </w:r>
+      <w:r>
+        <w:rPr>
+          <w:sz w:val="24"/>
+          <w:szCs w:val="22"/>
+        </w:rPr>
+        <w:t xml:space="preserve"> Will return the text on alert. (String)</w:t>
+      </w:r>
+    </w:p>
+    <w:p>
+      <w:pPr>
+        <w:pStyle w:val="ListParagraph"/>
+        <w:numPr>
+          <w:ilvl w:val="1"/>
+          <w:numId w:val="25"/>
+        </w:numPr>
+        <w:rPr>
+          <w:b/>
+          <w:bCs/>
+          <w:sz w:val="24"/>
+          <w:szCs w:val="22"/>
+        </w:rPr>
+      </w:pPr>
+      <w:r>
+        <w:rPr>
+          <w:sz w:val="24"/>
+          <w:szCs w:val="22"/>
+        </w:rPr>
+        <w:t xml:space="preserve">accept() </w:t>
+      </w:r>
+      <w:r>
+        <w:rPr>
+          <w:sz w:val="24"/>
+          <w:szCs w:val="22"/>
+        </w:rPr>
+        <w:sym w:font="Wingdings" w:char="F0E0"/>
+      </w:r>
+      <w:r>
+        <w:rPr>
+          <w:sz w:val="24"/>
+          <w:szCs w:val="22"/>
+        </w:rPr>
+        <w:t xml:space="preserve"> Will click on Ok button</w:t>
+      </w:r>
     </w:p>
     <w:sectPr>
       <w:pgSz w:w="11906" w:h="16838"/>
@@ -8656,6 +9182,119 @@
     </w:lvl>
   </w:abstractNum>
   <w:abstractNum w:abstractNumId="4">
+    <w:nsid w:val="20231B0F"/>
+    <w:multiLevelType w:val="hybridMultilevel"/>
+    <w:tmpl w:val="8B444104"/>
+    <w:lvl w:ilvl="0" w:tplc="40090001">
+      <w:start w:val="1"/>
+      <w:numFmt w:val="bullet"/>
+      <w:lvlText w:val=""/>
+      <w:lvlJc w:val="left"/>
+      <w:pPr>
+        <w:ind w:left="720" w:hanging="360"/>
+      </w:pPr>
+      <w:rPr>
+        <w:rFonts w:ascii="Symbol" w:hAnsi="Symbol" w:hint="default"/>
+      </w:rPr>
+    </w:lvl>
+    <w:lvl w:ilvl="1" w:tplc="40090003">
+      <w:start w:val="1"/>
+      <w:numFmt w:val="bullet"/>
+      <w:lvlText w:val="o"/>
+      <w:lvlJc w:val="left"/>
+      <w:pPr>
+        <w:ind w:left="1440" w:hanging="360"/>
+      </w:pPr>
+      <w:rPr>
+        <w:rFonts w:ascii="Courier New" w:hAnsi="Courier New" w:cs="Courier New" w:hint="default"/>
+      </w:rPr>
+    </w:lvl>
+    <w:lvl w:ilvl="2" w:tplc="40090005" w:tentative="1">
+      <w:start w:val="1"/>
+      <w:numFmt w:val="bullet"/>
+      <w:lvlText w:val=""/>
+      <w:lvlJc w:val="left"/>
+      <w:pPr>
+        <w:ind w:left="2160" w:hanging="360"/>
+      </w:pPr>
+      <w:rPr>
+        <w:rFonts w:ascii="Wingdings" w:hAnsi="Wingdings" w:hint="default"/>
+      </w:rPr>
+    </w:lvl>
+    <w:lvl w:ilvl="3" w:tplc="40090001" w:tentative="1">
+      <w:start w:val="1"/>
+      <w:numFmt w:val="bullet"/>
+      <w:lvlText w:val=""/>
+      <w:lvlJc w:val="left"/>
+      <w:pPr>
+        <w:ind w:left="2880" w:hanging="360"/>
+      </w:pPr>
+      <w:rPr>
+        <w:rFonts w:ascii="Symbol" w:hAnsi="Symbol" w:hint="default"/>
+      </w:rPr>
+    </w:lvl>
+    <w:lvl w:ilvl="4" w:tplc="40090003" w:tentative="1">
+      <w:start w:val="1"/>
+      <w:numFmt w:val="bullet"/>
+      <w:lvlText w:val="o"/>
+      <w:lvlJc w:val="left"/>
+      <w:pPr>
+        <w:ind w:left="3600" w:hanging="360"/>
+      </w:pPr>
+      <w:rPr>
+        <w:rFonts w:ascii="Courier New" w:hAnsi="Courier New" w:cs="Courier New" w:hint="default"/>
+      </w:rPr>
+    </w:lvl>
+    <w:lvl w:ilvl="5" w:tplc="40090005" w:tentative="1">
+      <w:start w:val="1"/>
+      <w:numFmt w:val="bullet"/>
+      <w:lvlText w:val=""/>
+      <w:lvlJc w:val="left"/>
+      <w:pPr>
+        <w:ind w:left="4320" w:hanging="360"/>
+      </w:pPr>
+      <w:rPr>
+        <w:rFonts w:ascii="Wingdings" w:hAnsi="Wingdings" w:hint="default"/>
+      </w:rPr>
+    </w:lvl>
+    <w:lvl w:ilvl="6" w:tplc="40090001" w:tentative="1">
+      <w:start w:val="1"/>
+      <w:numFmt w:val="bullet"/>
+      <w:lvlText w:val=""/>
+      <w:lvlJc w:val="left"/>
+      <w:pPr>
+        <w:ind w:left="5040" w:hanging="360"/>
+      </w:pPr>
+      <w:rPr>
+        <w:rFonts w:ascii="Symbol" w:hAnsi="Symbol" w:hint="default"/>
+      </w:rPr>
+    </w:lvl>
+    <w:lvl w:ilvl="7" w:tplc="40090003" w:tentative="1">
+      <w:start w:val="1"/>
+      <w:numFmt w:val="bullet"/>
+      <w:lvlText w:val="o"/>
+      <w:lvlJc w:val="left"/>
+      <w:pPr>
+        <w:ind w:left="5760" w:hanging="360"/>
+      </w:pPr>
+      <w:rPr>
+        <w:rFonts w:ascii="Courier New" w:hAnsi="Courier New" w:cs="Courier New" w:hint="default"/>
+      </w:rPr>
+    </w:lvl>
+    <w:lvl w:ilvl="8" w:tplc="40090005" w:tentative="1">
+      <w:start w:val="1"/>
+      <w:numFmt w:val="bullet"/>
+      <w:lvlText w:val=""/>
+      <w:lvlJc w:val="left"/>
+      <w:pPr>
+        <w:ind w:left="6480" w:hanging="360"/>
+      </w:pPr>
+      <w:rPr>
+        <w:rFonts w:ascii="Wingdings" w:hAnsi="Wingdings" w:hint="default"/>
+      </w:rPr>
+    </w:lvl>
+  </w:abstractNum>
+  <w:abstractNum w:abstractNumId="5">
     <w:nsid w:val="2AD0394C"/>
     <w:multiLevelType w:val="hybridMultilevel"/>
     <w:tmpl w:val="A36CD096"/>
@@ -8768,7 +9407,7 @@
       </w:rPr>
     </w:lvl>
   </w:abstractNum>
-  <w:abstractNum w:abstractNumId="5">
+  <w:abstractNum w:abstractNumId="6">
     <w:nsid w:val="2AF0639C"/>
     <w:multiLevelType w:val="hybridMultilevel"/>
     <w:tmpl w:val="54A22318"/>
@@ -8854,7 +9493,7 @@
       </w:pPr>
     </w:lvl>
   </w:abstractNum>
-  <w:abstractNum w:abstractNumId="6">
+  <w:abstractNum w:abstractNumId="7">
     <w:nsid w:val="333F2421"/>
     <w:multiLevelType w:val="hybridMultilevel"/>
     <w:tmpl w:val="85128FF8"/>
@@ -8967,7 +9606,7 @@
       </w:rPr>
     </w:lvl>
   </w:abstractNum>
-  <w:abstractNum w:abstractNumId="7">
+  <w:abstractNum w:abstractNumId="8">
     <w:nsid w:val="335B6CD0"/>
     <w:multiLevelType w:val="hybridMultilevel"/>
     <w:tmpl w:val="B8EA9D4C"/>
@@ -9056,7 +9695,7 @@
       </w:pPr>
     </w:lvl>
   </w:abstractNum>
-  <w:abstractNum w:abstractNumId="8">
+  <w:abstractNum w:abstractNumId="9">
     <w:nsid w:val="34DF0944"/>
     <w:multiLevelType w:val="hybridMultilevel"/>
     <w:tmpl w:val="5C885224"/>
@@ -9145,7 +9784,7 @@
       </w:pPr>
     </w:lvl>
   </w:abstractNum>
-  <w:abstractNum w:abstractNumId="9">
+  <w:abstractNum w:abstractNumId="10">
     <w:nsid w:val="4316625C"/>
     <w:multiLevelType w:val="hybridMultilevel"/>
     <w:tmpl w:val="B75E34FE"/>
@@ -9234,7 +9873,7 @@
       </w:pPr>
     </w:lvl>
   </w:abstractNum>
-  <w:abstractNum w:abstractNumId="10">
+  <w:abstractNum w:abstractNumId="11">
     <w:nsid w:val="45E943CF"/>
     <w:multiLevelType w:val="hybridMultilevel"/>
     <w:tmpl w:val="8DB25A28"/>
@@ -9323,7 +9962,7 @@
       </w:pPr>
     </w:lvl>
   </w:abstractNum>
-  <w:abstractNum w:abstractNumId="11">
+  <w:abstractNum w:abstractNumId="12">
     <w:nsid w:val="49F86A57"/>
     <w:multiLevelType w:val="hybridMultilevel"/>
     <w:tmpl w:val="0BF29674"/>
@@ -9412,7 +10051,7 @@
       </w:pPr>
     </w:lvl>
   </w:abstractNum>
-  <w:abstractNum w:abstractNumId="12">
+  <w:abstractNum w:abstractNumId="13">
     <w:nsid w:val="5CBE3725"/>
     <w:multiLevelType w:val="hybridMultilevel"/>
     <w:tmpl w:val="4D3C6A2A"/>
@@ -9501,7 +10140,7 @@
       </w:pPr>
     </w:lvl>
   </w:abstractNum>
-  <w:abstractNum w:abstractNumId="13">
+  <w:abstractNum w:abstractNumId="14">
     <w:nsid w:val="60B95D02"/>
     <w:multiLevelType w:val="hybridMultilevel"/>
     <w:tmpl w:val="D9DEA214"/>
@@ -9614,7 +10253,7 @@
       </w:rPr>
     </w:lvl>
   </w:abstractNum>
-  <w:abstractNum w:abstractNumId="14">
+  <w:abstractNum w:abstractNumId="15">
     <w:nsid w:val="6277321E"/>
     <w:multiLevelType w:val="hybridMultilevel"/>
     <w:tmpl w:val="09F2E114"/>
@@ -9703,7 +10342,7 @@
       </w:pPr>
     </w:lvl>
   </w:abstractNum>
-  <w:abstractNum w:abstractNumId="15">
+  <w:abstractNum w:abstractNumId="16">
     <w:nsid w:val="635E69DF"/>
     <w:multiLevelType w:val="hybridMultilevel"/>
     <w:tmpl w:val="7CCC2E94"/>
@@ -9792,7 +10431,7 @@
       </w:pPr>
     </w:lvl>
   </w:abstractNum>
-  <w:abstractNum w:abstractNumId="16">
+  <w:abstractNum w:abstractNumId="17">
     <w:nsid w:val="63A8624B"/>
     <w:multiLevelType w:val="hybridMultilevel"/>
     <w:tmpl w:val="ABE4FA34"/>
@@ -9881,7 +10520,7 @@
       </w:pPr>
     </w:lvl>
   </w:abstractNum>
-  <w:abstractNum w:abstractNumId="17">
+  <w:abstractNum w:abstractNumId="18">
     <w:nsid w:val="64456C49"/>
     <w:multiLevelType w:val="hybridMultilevel"/>
     <w:tmpl w:val="5F629F92"/>
@@ -9970,7 +10609,7 @@
       </w:pPr>
     </w:lvl>
   </w:abstractNum>
-  <w:abstractNum w:abstractNumId="18">
+  <w:abstractNum w:abstractNumId="19">
     <w:nsid w:val="67516CAF"/>
     <w:multiLevelType w:val="hybridMultilevel"/>
     <w:tmpl w:val="67A466EC"/>
@@ -10083,7 +10722,7 @@
       </w:rPr>
     </w:lvl>
   </w:abstractNum>
-  <w:abstractNum w:abstractNumId="19">
+  <w:abstractNum w:abstractNumId="20">
     <w:nsid w:val="698F6573"/>
     <w:multiLevelType w:val="hybridMultilevel"/>
     <w:tmpl w:val="538221D2"/>
@@ -10196,7 +10835,7 @@
       </w:rPr>
     </w:lvl>
   </w:abstractNum>
-  <w:abstractNum w:abstractNumId="20">
+  <w:abstractNum w:abstractNumId="21">
     <w:nsid w:val="6C8D1D8E"/>
     <w:multiLevelType w:val="hybridMultilevel"/>
     <w:tmpl w:val="3300155A"/>
@@ -10309,7 +10948,7 @@
       </w:rPr>
     </w:lvl>
   </w:abstractNum>
-  <w:abstractNum w:abstractNumId="21">
+  <w:abstractNum w:abstractNumId="22">
     <w:nsid w:val="6D03627E"/>
     <w:multiLevelType w:val="hybridMultilevel"/>
     <w:tmpl w:val="AF6072B4"/>
@@ -10422,7 +11061,7 @@
       </w:rPr>
     </w:lvl>
   </w:abstractNum>
-  <w:abstractNum w:abstractNumId="22">
+  <w:abstractNum w:abstractNumId="23">
     <w:nsid w:val="6F4D3C22"/>
     <w:multiLevelType w:val="hybridMultilevel"/>
     <w:tmpl w:val="2D660700"/>
@@ -10535,7 +11174,7 @@
       </w:rPr>
     </w:lvl>
   </w:abstractNum>
-  <w:abstractNum w:abstractNumId="23">
+  <w:abstractNum w:abstractNumId="24">
     <w:nsid w:val="77CF24AB"/>
     <w:multiLevelType w:val="hybridMultilevel"/>
     <w:tmpl w:val="5FD02720"/>
@@ -10625,67 +11264,67 @@
     </w:lvl>
   </w:abstractNum>
   <w:num w:numId="1">
-    <w:abstractNumId w:val="19"/>
+    <w:abstractNumId w:val="20"/>
   </w:num>
   <w:num w:numId="2">
-    <w:abstractNumId w:val="15"/>
+    <w:abstractNumId w:val="16"/>
   </w:num>
   <w:num w:numId="3">
-    <w:abstractNumId w:val="5"/>
+    <w:abstractNumId w:val="6"/>
   </w:num>
   <w:num w:numId="4">
-    <w:abstractNumId w:val="6"/>
+    <w:abstractNumId w:val="7"/>
   </w:num>
   <w:num w:numId="5">
-    <w:abstractNumId w:val="21"/>
+    <w:abstractNumId w:val="22"/>
   </w:num>
   <w:num w:numId="6">
-    <w:abstractNumId w:val="11"/>
+    <w:abstractNumId w:val="12"/>
   </w:num>
   <w:num w:numId="7">
-    <w:abstractNumId w:val="9"/>
+    <w:abstractNumId w:val="10"/>
   </w:num>
   <w:num w:numId="8">
     <w:abstractNumId w:val="0"/>
   </w:num>
   <w:num w:numId="9">
-    <w:abstractNumId w:val="7"/>
+    <w:abstractNumId w:val="8"/>
   </w:num>
   <w:num w:numId="10">
+    <w:abstractNumId w:val="14"/>
+  </w:num>
+  <w:num w:numId="11">
+    <w:abstractNumId w:val="15"/>
+  </w:num>
+  <w:num w:numId="12">
     <w:abstractNumId w:val="13"/>
   </w:num>
-  <w:num w:numId="11">
-    <w:abstractNumId w:val="14"/>
-  </w:num>
-  <w:num w:numId="12">
-    <w:abstractNumId w:val="12"/>
-  </w:num>
   <w:num w:numId="13">
-    <w:abstractNumId w:val="8"/>
+    <w:abstractNumId w:val="9"/>
   </w:num>
   <w:num w:numId="14">
-    <w:abstractNumId w:val="10"/>
+    <w:abstractNumId w:val="11"/>
   </w:num>
   <w:num w:numId="15">
-    <w:abstractNumId w:val="22"/>
+    <w:abstractNumId w:val="23"/>
   </w:num>
   <w:num w:numId="16">
-    <w:abstractNumId w:val="20"/>
+    <w:abstractNumId w:val="21"/>
   </w:num>
   <w:num w:numId="17">
-    <w:abstractNumId w:val="16"/>
+    <w:abstractNumId w:val="17"/>
   </w:num>
   <w:num w:numId="18">
-    <w:abstractNumId w:val="4"/>
+    <w:abstractNumId w:val="5"/>
   </w:num>
   <w:num w:numId="19">
     <w:abstractNumId w:val="1"/>
   </w:num>
   <w:num w:numId="20">
-    <w:abstractNumId w:val="17"/>
+    <w:abstractNumId w:val="18"/>
   </w:num>
   <w:num w:numId="21">
-    <w:abstractNumId w:val="18"/>
+    <w:abstractNumId w:val="19"/>
   </w:num>
   <w:num w:numId="22">
     <w:abstractNumId w:val="3"/>
@@ -10694,7 +11333,10 @@
     <w:abstractNumId w:val="2"/>
   </w:num>
   <w:num w:numId="24">
-    <w:abstractNumId w:val="23"/>
+    <w:abstractNumId w:val="24"/>
+  </w:num>
+  <w:num w:numId="25">
+    <w:abstractNumId w:val="4"/>
   </w:num>
 </w:numbering>
 </file>

</xml_diff>

<commit_message>
Date: 23 Jan 2026
</commit_message>
<xml_diff>
--- a/Notes.docx
+++ b/Notes.docx
@@ -707,13 +707,23 @@
           <w:szCs w:val="22"/>
         </w:rPr>
       </w:pPr>
+      <w:proofErr w:type="spellStart"/>
       <w:r>
         <w:rPr>
           <w:sz w:val="24"/>
           <w:szCs w:val="22"/>
           <w:lang w:val="en-US"/>
         </w:rPr>
-        <w:t>Thread.sleep()</w:t>
+        <w:t>Thread.sleep</w:t>
+      </w:r>
+      <w:proofErr w:type="spellEnd"/>
+      <w:r>
+        <w:rPr>
+          <w:sz w:val="24"/>
+          <w:szCs w:val="22"/>
+          <w:lang w:val="en-US"/>
+        </w:rPr>
+        <w:t>()</w:t>
       </w:r>
     </w:p>
     <w:p>
@@ -2485,7 +2495,27 @@
           <w:sz w:val="24"/>
           <w:szCs w:val="22"/>
         </w:rPr>
-        <w:t>What is automation Testing?</w:t>
+        <w:t xml:space="preserve">What is automation </w:t>
+      </w:r>
+      <w:proofErr w:type="gramStart"/>
+      <w:r>
+        <w:rPr>
+          <w:b/>
+          <w:bCs/>
+          <w:sz w:val="24"/>
+          <w:szCs w:val="22"/>
+        </w:rPr>
+        <w:t>Testing</w:t>
+      </w:r>
+      <w:proofErr w:type="gramEnd"/>
+      <w:r>
+        <w:rPr>
+          <w:b/>
+          <w:bCs/>
+          <w:sz w:val="24"/>
+          <w:szCs w:val="22"/>
+        </w:rPr>
+        <w:t>?</w:t>
       </w:r>
     </w:p>
     <w:p>
@@ -2976,6 +3006,7 @@
           <w:szCs w:val="22"/>
         </w:rPr>
       </w:pPr>
+      <w:proofErr w:type="spellStart"/>
       <w:r>
         <w:rPr>
           <w:sz w:val="24"/>
@@ -2983,6 +3014,7 @@
         </w:rPr>
         <w:t>JMeeter</w:t>
       </w:r>
+      <w:proofErr w:type="spellEnd"/>
     </w:p>
     <w:p>
       <w:pPr>
@@ -3991,6 +4023,7 @@
           <w:szCs w:val="22"/>
         </w:rPr>
       </w:pPr>
+      <w:proofErr w:type="spellStart"/>
       <w:r>
         <w:rPr>
           <w:sz w:val="24"/>
@@ -3998,6 +4031,7 @@
         </w:rPr>
         <w:t>YourName_SeleniumDemos</w:t>
       </w:r>
+      <w:proofErr w:type="spellEnd"/>
     </w:p>
     <w:p>
       <w:pPr>
@@ -4037,8 +4071,17 @@
           <w:szCs w:val="22"/>
         </w:rPr>
         <w:lastRenderedPageBreak/>
-        <w:t>Launch selenium.dev</w:t>
-      </w:r>
+        <w:t xml:space="preserve">Launch </w:t>
+      </w:r>
+      <w:proofErr w:type="spellStart"/>
+      <w:r>
+        <w:rPr>
+          <w:sz w:val="24"/>
+          <w:szCs w:val="22"/>
+        </w:rPr>
+        <w:t>selenium.dev</w:t>
+      </w:r>
+      <w:proofErr w:type="spellEnd"/>
     </w:p>
     <w:p>
       <w:pPr>
@@ -4638,12 +4681,21 @@
           <w:szCs w:val="22"/>
         </w:rPr>
       </w:pPr>
-      <w:r>
-        <w:rPr>
-          <w:sz w:val="24"/>
-          <w:szCs w:val="22"/>
-        </w:rPr>
-        <w:t xml:space="preserve">close() </w:t>
+      <w:proofErr w:type="gramStart"/>
+      <w:r>
+        <w:rPr>
+          <w:sz w:val="24"/>
+          <w:szCs w:val="22"/>
+        </w:rPr>
+        <w:t>close(</w:t>
+      </w:r>
+      <w:proofErr w:type="gramEnd"/>
+      <w:r>
+        <w:rPr>
+          <w:sz w:val="24"/>
+          <w:szCs w:val="22"/>
+        </w:rPr>
+        <w:t xml:space="preserve">) </w:t>
       </w:r>
       <w:r>
         <w:rPr>
@@ -4688,12 +4740,30 @@
           <w:szCs w:val="22"/>
         </w:rPr>
       </w:pPr>
-      <w:r>
-        <w:rPr>
-          <w:sz w:val="24"/>
-          <w:szCs w:val="22"/>
-        </w:rPr>
-        <w:t xml:space="preserve">driver.manage().window().maximize() </w:t>
+      <w:proofErr w:type="spellStart"/>
+      <w:proofErr w:type="gramStart"/>
+      <w:r>
+        <w:rPr>
+          <w:sz w:val="24"/>
+          <w:szCs w:val="22"/>
+        </w:rPr>
+        <w:t>driver.manage</w:t>
+      </w:r>
+      <w:proofErr w:type="spellEnd"/>
+      <w:r>
+        <w:rPr>
+          <w:sz w:val="24"/>
+          <w:szCs w:val="22"/>
+        </w:rPr>
+        <w:t>(</w:t>
+      </w:r>
+      <w:proofErr w:type="gramEnd"/>
+      <w:r>
+        <w:rPr>
+          <w:sz w:val="24"/>
+          <w:szCs w:val="22"/>
+        </w:rPr>
+        <w:t xml:space="preserve">).window().maximize() </w:t>
       </w:r>
       <w:r>
         <w:rPr>
@@ -4722,12 +4792,21 @@
           <w:szCs w:val="22"/>
         </w:rPr>
       </w:pPr>
-      <w:r>
-        <w:rPr>
-          <w:sz w:val="24"/>
-          <w:szCs w:val="22"/>
-        </w:rPr>
-        <w:t xml:space="preserve">getTitle() </w:t>
+      <w:proofErr w:type="gramStart"/>
+      <w:r>
+        <w:rPr>
+          <w:sz w:val="24"/>
+          <w:szCs w:val="22"/>
+        </w:rPr>
+        <w:t>getTitle(</w:t>
+      </w:r>
+      <w:proofErr w:type="gramEnd"/>
+      <w:r>
+        <w:rPr>
+          <w:sz w:val="24"/>
+          <w:szCs w:val="22"/>
+        </w:rPr>
+        <w:t xml:space="preserve">) </w:t>
       </w:r>
       <w:r>
         <w:rPr>
@@ -4756,12 +4835,21 @@
           <w:szCs w:val="22"/>
         </w:rPr>
       </w:pPr>
-      <w:r>
-        <w:rPr>
-          <w:sz w:val="24"/>
-          <w:szCs w:val="22"/>
-        </w:rPr>
-        <w:t xml:space="preserve">getCurrentUrl() </w:t>
+      <w:proofErr w:type="gramStart"/>
+      <w:r>
+        <w:rPr>
+          <w:sz w:val="24"/>
+          <w:szCs w:val="22"/>
+        </w:rPr>
+        <w:t>getCurrentUrl(</w:t>
+      </w:r>
+      <w:proofErr w:type="gramEnd"/>
+      <w:r>
+        <w:rPr>
+          <w:sz w:val="24"/>
+          <w:szCs w:val="22"/>
+        </w:rPr>
+        <w:t xml:space="preserve">) </w:t>
       </w:r>
       <w:r>
         <w:rPr>
@@ -4790,12 +4878,21 @@
           <w:szCs w:val="22"/>
         </w:rPr>
       </w:pPr>
-      <w:r>
-        <w:rPr>
-          <w:sz w:val="24"/>
-          <w:szCs w:val="22"/>
-        </w:rPr>
-        <w:t xml:space="preserve">getPageSource() </w:t>
+      <w:proofErr w:type="gramStart"/>
+      <w:r>
+        <w:rPr>
+          <w:sz w:val="24"/>
+          <w:szCs w:val="22"/>
+        </w:rPr>
+        <w:t>getPageSource(</w:t>
+      </w:r>
+      <w:proofErr w:type="gramEnd"/>
+      <w:r>
+        <w:rPr>
+          <w:sz w:val="24"/>
+          <w:szCs w:val="22"/>
+        </w:rPr>
+        <w:t xml:space="preserve">) </w:t>
       </w:r>
       <w:r>
         <w:rPr>
@@ -4824,12 +4921,21 @@
           <w:szCs w:val="22"/>
         </w:rPr>
       </w:pPr>
-      <w:r>
-        <w:rPr>
-          <w:sz w:val="24"/>
-          <w:szCs w:val="22"/>
-        </w:rPr>
-        <w:t xml:space="preserve">findElement() </w:t>
+      <w:proofErr w:type="gramStart"/>
+      <w:r>
+        <w:rPr>
+          <w:sz w:val="24"/>
+          <w:szCs w:val="22"/>
+        </w:rPr>
+        <w:t>findElement(</w:t>
+      </w:r>
+      <w:proofErr w:type="gramEnd"/>
+      <w:r>
+        <w:rPr>
+          <w:sz w:val="24"/>
+          <w:szCs w:val="22"/>
+        </w:rPr>
+        <w:t xml:space="preserve">) </w:t>
       </w:r>
       <w:r>
         <w:rPr>
@@ -4888,12 +4994,21 @@
           <w:szCs w:val="22"/>
         </w:rPr>
       </w:pPr>
-      <w:r>
-        <w:rPr>
-          <w:sz w:val="24"/>
-          <w:szCs w:val="22"/>
-        </w:rPr>
-        <w:t xml:space="preserve">findElements() </w:t>
+      <w:proofErr w:type="gramStart"/>
+      <w:r>
+        <w:rPr>
+          <w:sz w:val="24"/>
+          <w:szCs w:val="22"/>
+        </w:rPr>
+        <w:t>findElements(</w:t>
+      </w:r>
+      <w:proofErr w:type="gramEnd"/>
+      <w:r>
+        <w:rPr>
+          <w:sz w:val="24"/>
+          <w:szCs w:val="22"/>
+        </w:rPr>
+        <w:t xml:space="preserve">) </w:t>
       </w:r>
       <w:r>
         <w:rPr>
@@ -4922,12 +5037,21 @@
           <w:szCs w:val="22"/>
         </w:rPr>
       </w:pPr>
-      <w:r>
-        <w:rPr>
-          <w:sz w:val="24"/>
-          <w:szCs w:val="22"/>
-        </w:rPr>
-        <w:t xml:space="preserve">getWindowHandles() </w:t>
+      <w:proofErr w:type="gramStart"/>
+      <w:r>
+        <w:rPr>
+          <w:sz w:val="24"/>
+          <w:szCs w:val="22"/>
+        </w:rPr>
+        <w:t>getWindowHandles(</w:t>
+      </w:r>
+      <w:proofErr w:type="gramEnd"/>
+      <w:r>
+        <w:rPr>
+          <w:sz w:val="24"/>
+          <w:szCs w:val="22"/>
+        </w:rPr>
+        <w:t xml:space="preserve">) </w:t>
       </w:r>
       <w:r>
         <w:rPr>
@@ -5002,7 +5126,23 @@
           <w:sz w:val="24"/>
           <w:szCs w:val="22"/>
         </w:rPr>
-        <w:t xml:space="preserve"> You have passed relative URL. get() method expects absolute URL. Which starts with http</w:t>
+        <w:t xml:space="preserve"> You have passed relative URL. </w:t>
+      </w:r>
+      <w:proofErr w:type="gramStart"/>
+      <w:r>
+        <w:rPr>
+          <w:sz w:val="24"/>
+          <w:szCs w:val="22"/>
+        </w:rPr>
+        <w:t>get(</w:t>
+      </w:r>
+      <w:proofErr w:type="gramEnd"/>
+      <w:r>
+        <w:rPr>
+          <w:sz w:val="24"/>
+          <w:szCs w:val="22"/>
+        </w:rPr>
+        <w:t>) method expects absolute URL. Which starts with http</w:t>
       </w:r>
     </w:p>
     <w:p>
@@ -5173,7 +5313,38 @@
           <w:sz w:val="24"/>
           <w:szCs w:val="22"/>
         </w:rPr>
-        <w:t>Selenium waits for maximum 30 seconds to load the page via driver.get()</w:t>
+        <w:t xml:space="preserve">Selenium waits for maximum 30 seconds to load the page via </w:t>
+      </w:r>
+      <w:proofErr w:type="spellStart"/>
+      <w:proofErr w:type="gramStart"/>
+      <w:r>
+        <w:rPr>
+          <w:b/>
+          <w:bCs/>
+          <w:sz w:val="24"/>
+          <w:szCs w:val="22"/>
+        </w:rPr>
+        <w:t>driver.get</w:t>
+      </w:r>
+      <w:proofErr w:type="spellEnd"/>
+      <w:r>
+        <w:rPr>
+          <w:b/>
+          <w:bCs/>
+          <w:sz w:val="24"/>
+          <w:szCs w:val="22"/>
+        </w:rPr>
+        <w:t>(</w:t>
+      </w:r>
+      <w:proofErr w:type="gramEnd"/>
+      <w:r>
+        <w:rPr>
+          <w:b/>
+          <w:bCs/>
+          <w:sz w:val="24"/>
+          <w:szCs w:val="22"/>
+        </w:rPr>
+        <w:t>)</w:t>
       </w:r>
       <w:r>
         <w:rPr>
@@ -5248,16 +5419,7 @@
           <w:sz w:val="24"/>
           <w:szCs w:val="22"/>
         </w:rPr>
-        <w:t xml:space="preserve"> You are trying to handle an alert but currently</w:t>
-      </w:r>
-      <w:bookmarkStart w:id="0" w:name="_GoBack"/>
-      <w:bookmarkEnd w:id="0"/>
-      <w:r>
-        <w:rPr>
-          <w:sz w:val="24"/>
-          <w:szCs w:val="22"/>
-        </w:rPr>
-        <w:t xml:space="preserve"> there is no any alert on the page.</w:t>
+        <w:t xml:space="preserve"> You are trying to handle an alert but currently there is no any alert on the page.</w:t>
       </w:r>
     </w:p>
     <w:p>
@@ -5457,12 +5619,21 @@
           <w:szCs w:val="22"/>
         </w:rPr>
       </w:pPr>
-      <w:r>
-        <w:rPr>
-          <w:sz w:val="24"/>
-          <w:szCs w:val="22"/>
-        </w:rPr>
-        <w:t xml:space="preserve">sendKeys() </w:t>
+      <w:proofErr w:type="gramStart"/>
+      <w:r>
+        <w:rPr>
+          <w:sz w:val="24"/>
+          <w:szCs w:val="22"/>
+        </w:rPr>
+        <w:t>sendKeys(</w:t>
+      </w:r>
+      <w:proofErr w:type="gramEnd"/>
+      <w:r>
+        <w:rPr>
+          <w:sz w:val="24"/>
+          <w:szCs w:val="22"/>
+        </w:rPr>
+        <w:t xml:space="preserve">) </w:t>
       </w:r>
       <w:r>
         <w:rPr>
@@ -5498,12 +5669,21 @@
           <w:szCs w:val="22"/>
         </w:rPr>
       </w:pPr>
-      <w:r>
-        <w:rPr>
-          <w:sz w:val="24"/>
-          <w:szCs w:val="22"/>
-        </w:rPr>
-        <w:t xml:space="preserve">click() </w:t>
+      <w:proofErr w:type="gramStart"/>
+      <w:r>
+        <w:rPr>
+          <w:sz w:val="24"/>
+          <w:szCs w:val="22"/>
+        </w:rPr>
+        <w:t>click(</w:t>
+      </w:r>
+      <w:proofErr w:type="gramEnd"/>
+      <w:r>
+        <w:rPr>
+          <w:sz w:val="24"/>
+          <w:szCs w:val="22"/>
+        </w:rPr>
+        <w:t xml:space="preserve">) </w:t>
       </w:r>
       <w:r>
         <w:rPr>
@@ -5532,12 +5712,21 @@
           <w:szCs w:val="22"/>
         </w:rPr>
       </w:pPr>
-      <w:r>
-        <w:rPr>
-          <w:sz w:val="24"/>
-          <w:szCs w:val="22"/>
-        </w:rPr>
-        <w:t xml:space="preserve">getText() </w:t>
+      <w:proofErr w:type="gramStart"/>
+      <w:r>
+        <w:rPr>
+          <w:sz w:val="24"/>
+          <w:szCs w:val="22"/>
+        </w:rPr>
+        <w:t>getText(</w:t>
+      </w:r>
+      <w:proofErr w:type="gramEnd"/>
+      <w:r>
+        <w:rPr>
+          <w:sz w:val="24"/>
+          <w:szCs w:val="22"/>
+        </w:rPr>
+        <w:t xml:space="preserve">) </w:t>
       </w:r>
       <w:r>
         <w:rPr>
@@ -5566,12 +5755,21 @@
           <w:szCs w:val="22"/>
         </w:rPr>
       </w:pPr>
-      <w:r>
-        <w:rPr>
-          <w:sz w:val="24"/>
-          <w:szCs w:val="22"/>
-        </w:rPr>
-        <w:t xml:space="preserve">getAttribute() </w:t>
+      <w:proofErr w:type="gramStart"/>
+      <w:r>
+        <w:rPr>
+          <w:sz w:val="24"/>
+          <w:szCs w:val="22"/>
+        </w:rPr>
+        <w:t>getAttribute(</w:t>
+      </w:r>
+      <w:proofErr w:type="gramEnd"/>
+      <w:r>
+        <w:rPr>
+          <w:sz w:val="24"/>
+          <w:szCs w:val="22"/>
+        </w:rPr>
+        <w:t xml:space="preserve">) </w:t>
       </w:r>
       <w:r>
         <w:rPr>
@@ -5600,13 +5798,22 @@
           <w:szCs w:val="22"/>
         </w:rPr>
       </w:pPr>
+      <w:proofErr w:type="gramStart"/>
       <w:r>
         <w:rPr>
           <w:sz w:val="24"/>
           <w:szCs w:val="22"/>
         </w:rPr>
         <w:lastRenderedPageBreak/>
-        <w:t xml:space="preserve">isSelected() </w:t>
+        <w:t>isSelected(</w:t>
+      </w:r>
+      <w:proofErr w:type="gramEnd"/>
+      <w:r>
+        <w:rPr>
+          <w:sz w:val="24"/>
+          <w:szCs w:val="22"/>
+        </w:rPr>
+        <w:t xml:space="preserve">) </w:t>
       </w:r>
       <w:r>
         <w:rPr>
@@ -5635,12 +5842,21 @@
           <w:szCs w:val="22"/>
         </w:rPr>
       </w:pPr>
-      <w:r>
-        <w:rPr>
-          <w:sz w:val="24"/>
-          <w:szCs w:val="22"/>
-        </w:rPr>
-        <w:t xml:space="preserve">isEnabled() </w:t>
+      <w:proofErr w:type="gramStart"/>
+      <w:r>
+        <w:rPr>
+          <w:sz w:val="24"/>
+          <w:szCs w:val="22"/>
+        </w:rPr>
+        <w:t>isEnabled(</w:t>
+      </w:r>
+      <w:proofErr w:type="gramEnd"/>
+      <w:r>
+        <w:rPr>
+          <w:sz w:val="24"/>
+          <w:szCs w:val="22"/>
+        </w:rPr>
+        <w:t xml:space="preserve">) </w:t>
       </w:r>
       <w:r>
         <w:rPr>
@@ -5735,7 +5951,23 @@
           <w:sz w:val="24"/>
           <w:szCs w:val="22"/>
         </w:rPr>
-        <w:t xml:space="preserve">Are the way to find out any control / WebElement on the page. </w:t>
+        <w:t xml:space="preserve">Are the way to find out any control / WebElement on the </w:t>
+      </w:r>
+      <w:proofErr w:type="gramStart"/>
+      <w:r>
+        <w:rPr>
+          <w:sz w:val="24"/>
+          <w:szCs w:val="22"/>
+        </w:rPr>
+        <w:t>page.</w:t>
+      </w:r>
+      <w:proofErr w:type="gramEnd"/>
+      <w:r>
+        <w:rPr>
+          <w:sz w:val="24"/>
+          <w:szCs w:val="22"/>
+        </w:rPr>
+        <w:t xml:space="preserve"> </w:t>
       </w:r>
     </w:p>
     <w:p>
@@ -6305,8 +6537,17 @@
           <w:sz w:val="24"/>
           <w:szCs w:val="22"/>
         </w:rPr>
-        <w:t>– Locates the control via class attrubute</w:t>
-      </w:r>
+        <w:t xml:space="preserve">– Locates the control via class </w:t>
+      </w:r>
+      <w:proofErr w:type="spellStart"/>
+      <w:r>
+        <w:rPr>
+          <w:sz w:val="24"/>
+          <w:szCs w:val="22"/>
+        </w:rPr>
+        <w:t>attrubute</w:t>
+      </w:r>
+      <w:proofErr w:type="spellEnd"/>
     </w:p>
     <w:p>
       <w:pPr>
@@ -6341,6 +6582,7 @@
         </w:rPr>
         <w:br/>
       </w:r>
+      <w:proofErr w:type="spellStart"/>
       <w:r>
         <w:rPr>
           <w:sz w:val="24"/>
@@ -6348,6 +6590,7 @@
         </w:rPr>
         <w:t>input#username</w:t>
       </w:r>
+      <w:proofErr w:type="spellEnd"/>
       <w:r>
         <w:rPr>
           <w:sz w:val="24"/>
@@ -6646,7 +6889,23 @@
           <w:sz w:val="24"/>
           <w:szCs w:val="22"/>
         </w:rPr>
-        <w:t xml:space="preserve">Selenium has a special class to handle such a drop down lists ie. </w:t>
+        <w:t xml:space="preserve">Selenium has a special class to handle such a drop down lists </w:t>
+      </w:r>
+      <w:proofErr w:type="spellStart"/>
+      <w:r>
+        <w:rPr>
+          <w:sz w:val="24"/>
+          <w:szCs w:val="22"/>
+        </w:rPr>
+        <w:t>ie</w:t>
+      </w:r>
+      <w:proofErr w:type="spellEnd"/>
+      <w:r>
+        <w:rPr>
+          <w:sz w:val="24"/>
+          <w:szCs w:val="22"/>
+        </w:rPr>
+        <w:t xml:space="preserve">. </w:t>
       </w:r>
       <w:r>
         <w:rPr>
@@ -6697,12 +6956,21 @@
           <w:szCs w:val="22"/>
         </w:rPr>
       </w:pPr>
-      <w:r>
-        <w:rPr>
-          <w:sz w:val="24"/>
-          <w:szCs w:val="22"/>
-        </w:rPr>
-        <w:t xml:space="preserve">getFirstSelectedOption() </w:t>
+      <w:proofErr w:type="gramStart"/>
+      <w:r>
+        <w:rPr>
+          <w:sz w:val="24"/>
+          <w:szCs w:val="22"/>
+        </w:rPr>
+        <w:t>getFirstSelectedOption(</w:t>
+      </w:r>
+      <w:proofErr w:type="gramEnd"/>
+      <w:r>
+        <w:rPr>
+          <w:sz w:val="24"/>
+          <w:szCs w:val="22"/>
+        </w:rPr>
+        <w:t xml:space="preserve">) </w:t>
       </w:r>
       <w:r>
         <w:rPr>
@@ -6738,12 +7006,21 @@
           <w:szCs w:val="22"/>
         </w:rPr>
       </w:pPr>
-      <w:r>
-        <w:rPr>
-          <w:sz w:val="24"/>
-          <w:szCs w:val="22"/>
-        </w:rPr>
-        <w:t xml:space="preserve">getOptions() </w:t>
+      <w:proofErr w:type="gramStart"/>
+      <w:r>
+        <w:rPr>
+          <w:sz w:val="24"/>
+          <w:szCs w:val="22"/>
+        </w:rPr>
+        <w:t>getOptions(</w:t>
+      </w:r>
+      <w:proofErr w:type="gramEnd"/>
+      <w:r>
+        <w:rPr>
+          <w:sz w:val="24"/>
+          <w:szCs w:val="22"/>
+        </w:rPr>
+        <w:t xml:space="preserve">) </w:t>
       </w:r>
       <w:r>
         <w:rPr>
@@ -6772,12 +7049,21 @@
           <w:szCs w:val="22"/>
         </w:rPr>
       </w:pPr>
-      <w:r>
-        <w:rPr>
-          <w:sz w:val="24"/>
-          <w:szCs w:val="22"/>
-        </w:rPr>
-        <w:t xml:space="preserve">selectByVisibleText() </w:t>
+      <w:proofErr w:type="gramStart"/>
+      <w:r>
+        <w:rPr>
+          <w:sz w:val="24"/>
+          <w:szCs w:val="22"/>
+        </w:rPr>
+        <w:t>selectByVisibleText(</w:t>
+      </w:r>
+      <w:proofErr w:type="gramEnd"/>
+      <w:r>
+        <w:rPr>
+          <w:sz w:val="24"/>
+          <w:szCs w:val="22"/>
+        </w:rPr>
+        <w:t xml:space="preserve">) </w:t>
       </w:r>
       <w:r>
         <w:rPr>
@@ -6806,12 +7092,21 @@
           <w:szCs w:val="22"/>
         </w:rPr>
       </w:pPr>
-      <w:r>
-        <w:rPr>
-          <w:sz w:val="24"/>
-          <w:szCs w:val="22"/>
-        </w:rPr>
-        <w:t xml:space="preserve">selectByContainsVisibleText() </w:t>
+      <w:proofErr w:type="gramStart"/>
+      <w:r>
+        <w:rPr>
+          <w:sz w:val="24"/>
+          <w:szCs w:val="22"/>
+        </w:rPr>
+        <w:t>selectByContainsVisibleText(</w:t>
+      </w:r>
+      <w:proofErr w:type="gramEnd"/>
+      <w:r>
+        <w:rPr>
+          <w:sz w:val="24"/>
+          <w:szCs w:val="22"/>
+        </w:rPr>
+        <w:t xml:space="preserve">) </w:t>
       </w:r>
       <w:r>
         <w:rPr>
@@ -6840,12 +7135,21 @@
           <w:szCs w:val="22"/>
         </w:rPr>
       </w:pPr>
-      <w:r>
-        <w:rPr>
-          <w:sz w:val="24"/>
-          <w:szCs w:val="22"/>
-        </w:rPr>
-        <w:t xml:space="preserve">selectByValue() </w:t>
+      <w:proofErr w:type="gramStart"/>
+      <w:r>
+        <w:rPr>
+          <w:sz w:val="24"/>
+          <w:szCs w:val="22"/>
+        </w:rPr>
+        <w:t>selectByValue(</w:t>
+      </w:r>
+      <w:proofErr w:type="gramEnd"/>
+      <w:r>
+        <w:rPr>
+          <w:sz w:val="24"/>
+          <w:szCs w:val="22"/>
+        </w:rPr>
+        <w:t xml:space="preserve">) </w:t>
       </w:r>
       <w:r>
         <w:rPr>
@@ -6881,12 +7185,21 @@
           <w:szCs w:val="22"/>
         </w:rPr>
       </w:pPr>
-      <w:r>
-        <w:rPr>
-          <w:sz w:val="24"/>
-          <w:szCs w:val="22"/>
-        </w:rPr>
-        <w:t xml:space="preserve">selectByIndex() </w:t>
+      <w:proofErr w:type="gramStart"/>
+      <w:r>
+        <w:rPr>
+          <w:sz w:val="24"/>
+          <w:szCs w:val="22"/>
+        </w:rPr>
+        <w:t>selectByIndex(</w:t>
+      </w:r>
+      <w:proofErr w:type="gramEnd"/>
+      <w:r>
+        <w:rPr>
+          <w:sz w:val="24"/>
+          <w:szCs w:val="22"/>
+        </w:rPr>
+        <w:t xml:space="preserve">) </w:t>
       </w:r>
       <w:r>
         <w:rPr>
@@ -6900,7 +7213,23 @@
           <w:sz w:val="24"/>
           <w:szCs w:val="22"/>
         </w:rPr>
-        <w:t xml:space="preserve"> Selects the element by using its zero based index. It accepts a integer value.</w:t>
+        <w:t xml:space="preserve"> Selects the element by using its zero based index. It accepts </w:t>
+      </w:r>
+      <w:proofErr w:type="gramStart"/>
+      <w:r>
+        <w:rPr>
+          <w:sz w:val="24"/>
+          <w:szCs w:val="22"/>
+        </w:rPr>
+        <w:t>a</w:t>
+      </w:r>
+      <w:proofErr w:type="gramEnd"/>
+      <w:r>
+        <w:rPr>
+          <w:sz w:val="24"/>
+          <w:szCs w:val="22"/>
+        </w:rPr>
+        <w:t xml:space="preserve"> integer value.</w:t>
       </w:r>
     </w:p>
     <w:p>
@@ -6949,12 +7278,21 @@
           <w:szCs w:val="22"/>
         </w:rPr>
       </w:pPr>
-      <w:r>
-        <w:rPr>
-          <w:sz w:val="24"/>
-          <w:szCs w:val="22"/>
-        </w:rPr>
-        <w:t xml:space="preserve">isMultiple() </w:t>
+      <w:proofErr w:type="gramStart"/>
+      <w:r>
+        <w:rPr>
+          <w:sz w:val="24"/>
+          <w:szCs w:val="22"/>
+        </w:rPr>
+        <w:t>isMultiple(</w:t>
+      </w:r>
+      <w:proofErr w:type="gramEnd"/>
+      <w:r>
+        <w:rPr>
+          <w:sz w:val="24"/>
+          <w:szCs w:val="22"/>
+        </w:rPr>
+        <w:t xml:space="preserve">) </w:t>
       </w:r>
       <w:r>
         <w:rPr>
@@ -7257,12 +7595,30 @@
           <w:szCs w:val="22"/>
         </w:rPr>
       </w:pPr>
-      <w:r>
-        <w:rPr>
-          <w:sz w:val="24"/>
-          <w:szCs w:val="22"/>
-        </w:rPr>
-        <w:t>Thread.sleep()</w:t>
+      <w:proofErr w:type="spellStart"/>
+      <w:proofErr w:type="gramStart"/>
+      <w:r>
+        <w:rPr>
+          <w:sz w:val="24"/>
+          <w:szCs w:val="22"/>
+        </w:rPr>
+        <w:t>Thread.sleep</w:t>
+      </w:r>
+      <w:proofErr w:type="spellEnd"/>
+      <w:r>
+        <w:rPr>
+          <w:sz w:val="24"/>
+          <w:szCs w:val="22"/>
+        </w:rPr>
+        <w:t>(</w:t>
+      </w:r>
+      <w:proofErr w:type="gramEnd"/>
+      <w:r>
+        <w:rPr>
+          <w:sz w:val="24"/>
+          <w:szCs w:val="22"/>
+        </w:rPr>
+        <w:t>)</w:t>
       </w:r>
       <w:r>
         <w:rPr>
@@ -7488,7 +7844,23 @@
           <w:sz w:val="24"/>
           <w:szCs w:val="22"/>
         </w:rPr>
-        <w:t xml:space="preserve">We can specify the condition for wait. (ElementToBeClickable, AlertIsPresent, VisibilityOfElementLocated) </w:t>
+        <w:t xml:space="preserve">We can specify the condition for wait. (ElementToBeClickable, AlertIsPresent, </w:t>
+      </w:r>
+      <w:proofErr w:type="spellStart"/>
+      <w:r>
+        <w:rPr>
+          <w:sz w:val="24"/>
+          <w:szCs w:val="22"/>
+        </w:rPr>
+        <w:t>VisibilityOfElementLocated</w:t>
+      </w:r>
+      <w:proofErr w:type="spellEnd"/>
+      <w:r>
+        <w:rPr>
+          <w:sz w:val="24"/>
+          <w:szCs w:val="22"/>
+        </w:rPr>
+        <w:t xml:space="preserve">) </w:t>
       </w:r>
       <w:r>
         <w:rPr>
@@ -7511,8 +7883,9 @@
           <w:sz w:val="24"/>
           <w:szCs w:val="22"/>
         </w:rPr>
-        <w:t>WebDriverWait wait = new WebDriverWait(driver, Duration.ofSeconds(15));</w:t>
-      </w:r>
+        <w:t xml:space="preserve">WebDriverWait wait = new WebDriverWait(driver, </w:t>
+      </w:r>
+      <w:proofErr w:type="spellStart"/>
       <w:r>
         <w:rPr>
           <w:b/>
@@ -7520,21 +7893,18 @@
           <w:sz w:val="24"/>
           <w:szCs w:val="22"/>
         </w:rPr>
-        <w:br/>
-        <w:t>wait.until(ExpectedConditions.elementToBeClickable(chkBox));</w:t>
-      </w:r>
-    </w:p>
-    <w:p>
-      <w:pPr>
-        <w:pStyle w:val="ListParagraph"/>
-        <w:ind w:left="1440"/>
+        <w:t>Duration.ofSeconds</w:t>
+      </w:r>
+      <w:proofErr w:type="spellEnd"/>
+      <w:r>
         <w:rPr>
           <w:b/>
           <w:bCs/>
           <w:sz w:val="24"/>
           <w:szCs w:val="22"/>
         </w:rPr>
-      </w:pPr>
+        <w:t>(15));</w:t>
+      </w:r>
       <w:r>
         <w:rPr>
           <w:b/>
@@ -7542,8 +7912,9 @@
           <w:sz w:val="24"/>
           <w:szCs w:val="22"/>
         </w:rPr>
-        <w:t>chkBox.click();</w:t>
-      </w:r>
+        <w:br/>
+      </w:r>
+      <w:proofErr w:type="spellStart"/>
       <w:r>
         <w:rPr>
           <w:b/>
@@ -7551,8 +7922,9 @@
           <w:sz w:val="24"/>
           <w:szCs w:val="22"/>
         </w:rPr>
-        <w:br/>
-      </w:r>
+        <w:t>wait.until</w:t>
+      </w:r>
+      <w:proofErr w:type="spellEnd"/>
       <w:r>
         <w:rPr>
           <w:b/>
@@ -7560,6 +7932,107 @@
           <w:sz w:val="24"/>
           <w:szCs w:val="22"/>
         </w:rPr>
+        <w:t>(</w:t>
+      </w:r>
+      <w:proofErr w:type="spellStart"/>
+      <w:r>
+        <w:rPr>
+          <w:b/>
+          <w:bCs/>
+          <w:sz w:val="24"/>
+          <w:szCs w:val="22"/>
+        </w:rPr>
+        <w:t>ExpectedConditions.elementToBeClickable</w:t>
+      </w:r>
+      <w:proofErr w:type="spellEnd"/>
+      <w:r>
+        <w:rPr>
+          <w:b/>
+          <w:bCs/>
+          <w:sz w:val="24"/>
+          <w:szCs w:val="22"/>
+        </w:rPr>
+        <w:t>(</w:t>
+      </w:r>
+      <w:proofErr w:type="spellStart"/>
+      <w:r>
+        <w:rPr>
+          <w:b/>
+          <w:bCs/>
+          <w:sz w:val="24"/>
+          <w:szCs w:val="22"/>
+        </w:rPr>
+        <w:t>chkBox</w:t>
+      </w:r>
+      <w:proofErr w:type="spellEnd"/>
+      <w:r>
+        <w:rPr>
+          <w:b/>
+          <w:bCs/>
+          <w:sz w:val="24"/>
+          <w:szCs w:val="22"/>
+        </w:rPr>
+        <w:t>));</w:t>
+      </w:r>
+    </w:p>
+    <w:p>
+      <w:pPr>
+        <w:pStyle w:val="ListParagraph"/>
+        <w:ind w:left="1440"/>
+        <w:rPr>
+          <w:b/>
+          <w:bCs/>
+          <w:sz w:val="24"/>
+          <w:szCs w:val="22"/>
+        </w:rPr>
+      </w:pPr>
+      <w:proofErr w:type="spellStart"/>
+      <w:proofErr w:type="gramStart"/>
+      <w:r>
+        <w:rPr>
+          <w:b/>
+          <w:bCs/>
+          <w:sz w:val="24"/>
+          <w:szCs w:val="22"/>
+        </w:rPr>
+        <w:t>chkBox.click</w:t>
+      </w:r>
+      <w:proofErr w:type="spellEnd"/>
+      <w:r>
+        <w:rPr>
+          <w:b/>
+          <w:bCs/>
+          <w:sz w:val="24"/>
+          <w:szCs w:val="22"/>
+        </w:rPr>
+        <w:t>(</w:t>
+      </w:r>
+      <w:proofErr w:type="gramEnd"/>
+      <w:r>
+        <w:rPr>
+          <w:b/>
+          <w:bCs/>
+          <w:sz w:val="24"/>
+          <w:szCs w:val="22"/>
+        </w:rPr>
+        <w:t>);</w:t>
+      </w:r>
+      <w:r>
+        <w:rPr>
+          <w:b/>
+          <w:bCs/>
+          <w:sz w:val="24"/>
+          <w:szCs w:val="22"/>
+        </w:rPr>
+        <w:br/>
+      </w:r>
+      <w:r>
+        <w:rPr>
+          <w:b/>
+          <w:bCs/>
+          <w:sz w:val="24"/>
+          <w:szCs w:val="22"/>
+        </w:rPr>
         <w:br/>
         <w:t>OR</w:t>
       </w:r>
@@ -7676,7 +8149,23 @@
           <w:szCs w:val="22"/>
         </w:rPr>
         <w:lastRenderedPageBreak/>
-        <w:t>We can specify the condition for wait. (ElementToBeClickable, AlertIsPresent, VisibilityOfElementLocated)</w:t>
+        <w:t xml:space="preserve">We can specify the condition for wait. (ElementToBeClickable, AlertIsPresent, </w:t>
+      </w:r>
+      <w:proofErr w:type="spellStart"/>
+      <w:r>
+        <w:rPr>
+          <w:sz w:val="24"/>
+          <w:szCs w:val="22"/>
+        </w:rPr>
+        <w:t>VisibilityOfElementLocated</w:t>
+      </w:r>
+      <w:proofErr w:type="spellEnd"/>
+      <w:r>
+        <w:rPr>
+          <w:sz w:val="24"/>
+          <w:szCs w:val="22"/>
+        </w:rPr>
+        <w:t>)</w:t>
       </w:r>
     </w:p>
     <w:p>
@@ -7712,7 +8201,22 @@
           <w:szCs w:val="22"/>
         </w:rPr>
         <w:br/>
-        <w:t xml:space="preserve">i – ignoring </w:t>
+      </w:r>
+      <w:proofErr w:type="spellStart"/>
+      <w:r>
+        <w:rPr>
+          <w:sz w:val="24"/>
+          <w:szCs w:val="22"/>
+        </w:rPr>
+        <w:t>i</w:t>
+      </w:r>
+      <w:proofErr w:type="spellEnd"/>
+      <w:r>
+        <w:rPr>
+          <w:sz w:val="24"/>
+          <w:szCs w:val="22"/>
+        </w:rPr>
+        <w:t xml:space="preserve"> – ignoring </w:t>
       </w:r>
       <w:r>
         <w:rPr>
@@ -7772,7 +8276,23 @@
           <w:sz w:val="24"/>
           <w:szCs w:val="22"/>
         </w:rPr>
-        <w:t>FluentWait&lt;WebDriver&gt;wait = new FluentWait&lt;&gt;(driver);</w:t>
+        <w:t>FluentWait&lt;WebDriver&gt;wait = new FluentWait&lt;</w:t>
+      </w:r>
+      <w:proofErr w:type="gramStart"/>
+      <w:r>
+        <w:rPr>
+          <w:sz w:val="24"/>
+          <w:szCs w:val="22"/>
+        </w:rPr>
+        <w:t>&gt;(</w:t>
+      </w:r>
+      <w:proofErr w:type="gramEnd"/>
+      <w:r>
+        <w:rPr>
+          <w:sz w:val="24"/>
+          <w:szCs w:val="22"/>
+        </w:rPr>
+        <w:t>driver);</w:t>
       </w:r>
     </w:p>
     <w:p>
@@ -7788,7 +8308,41 @@
           <w:sz w:val="24"/>
           <w:szCs w:val="22"/>
         </w:rPr>
-        <w:t xml:space="preserve">        wait.withTimeout(Duration.ofSeconds(10))</w:t>
+        <w:t xml:space="preserve">        </w:t>
+      </w:r>
+      <w:proofErr w:type="spellStart"/>
+      <w:proofErr w:type="gramStart"/>
+      <w:r>
+        <w:rPr>
+          <w:sz w:val="24"/>
+          <w:szCs w:val="22"/>
+        </w:rPr>
+        <w:t>wait.withTimeout</w:t>
+      </w:r>
+      <w:proofErr w:type="spellEnd"/>
+      <w:r>
+        <w:rPr>
+          <w:sz w:val="24"/>
+          <w:szCs w:val="22"/>
+        </w:rPr>
+        <w:t>(</w:t>
+      </w:r>
+      <w:proofErr w:type="spellStart"/>
+      <w:proofErr w:type="gramEnd"/>
+      <w:r>
+        <w:rPr>
+          <w:sz w:val="24"/>
+          <w:szCs w:val="22"/>
+        </w:rPr>
+        <w:t>Duration.ofSeconds</w:t>
+      </w:r>
+      <w:proofErr w:type="spellEnd"/>
+      <w:r>
+        <w:rPr>
+          <w:sz w:val="24"/>
+          <w:szCs w:val="22"/>
+        </w:rPr>
+        <w:t>(10))</w:t>
       </w:r>
     </w:p>
     <w:p>
@@ -7811,7 +8365,32 @@
           <w:sz w:val="24"/>
           <w:szCs w:val="22"/>
         </w:rPr>
-        <w:t>.ignoring(NoSuchElementException.class)</w:t>
+        <w:t>.</w:t>
+      </w:r>
+      <w:proofErr w:type="gramStart"/>
+      <w:r>
+        <w:rPr>
+          <w:sz w:val="24"/>
+          <w:szCs w:val="22"/>
+        </w:rPr>
+        <w:t>ignoring(</w:t>
+      </w:r>
+      <w:proofErr w:type="spellStart"/>
+      <w:proofErr w:type="gramEnd"/>
+      <w:r>
+        <w:rPr>
+          <w:sz w:val="24"/>
+          <w:szCs w:val="22"/>
+        </w:rPr>
+        <w:t>NoSuchElementException.class</w:t>
+      </w:r>
+      <w:proofErr w:type="spellEnd"/>
+      <w:r>
+        <w:rPr>
+          <w:sz w:val="24"/>
+          <w:szCs w:val="22"/>
+        </w:rPr>
+        <w:t>)</w:t>
       </w:r>
     </w:p>
     <w:p>
@@ -7827,7 +8406,32 @@
           <w:sz w:val="24"/>
           <w:szCs w:val="22"/>
         </w:rPr>
-        <w:t>.pollingEvery(Duration.ofMillis(1))                .until(ExpectedConditions.visibilityOfElementLocated(By.name("username"))).sendKeys("admin");</w:t>
+        <w:t>.</w:t>
+      </w:r>
+      <w:proofErr w:type="gramStart"/>
+      <w:r>
+        <w:rPr>
+          <w:sz w:val="24"/>
+          <w:szCs w:val="22"/>
+        </w:rPr>
+        <w:t>pollingEvery(</w:t>
+      </w:r>
+      <w:proofErr w:type="spellStart"/>
+      <w:proofErr w:type="gramEnd"/>
+      <w:r>
+        <w:rPr>
+          <w:sz w:val="24"/>
+          <w:szCs w:val="22"/>
+        </w:rPr>
+        <w:t>Duration.ofMillis</w:t>
+      </w:r>
+      <w:proofErr w:type="spellEnd"/>
+      <w:r>
+        <w:rPr>
+          <w:sz w:val="24"/>
+          <w:szCs w:val="22"/>
+        </w:rPr>
+        <w:t>(1))                .until(ExpectedConditions.visibilityOfElementLocated(By.name("username"))).sendKeys("admin");</w:t>
       </w:r>
     </w:p>
     <w:p>
@@ -7897,6 +8501,8 @@
           <w:szCs w:val="22"/>
         </w:rPr>
       </w:pPr>
+      <w:proofErr w:type="spellStart"/>
+      <w:proofErr w:type="gramStart"/>
       <w:r>
         <w:rPr>
           <w:b/>
@@ -7904,16 +8510,9 @@
           <w:sz w:val="24"/>
           <w:szCs w:val="22"/>
         </w:rPr>
-        <w:t>driver.get("https://omayo.blogspot.com/");</w:t>
-      </w:r>
-    </w:p>
-    <w:p>
-      <w:pPr>
-        <w:rPr>
-          <w:sz w:val="24"/>
-          <w:szCs w:val="22"/>
-        </w:rPr>
-      </w:pPr>
+        <w:t>driver.get</w:t>
+      </w:r>
+      <w:proofErr w:type="spellEnd"/>
       <w:r>
         <w:rPr>
           <w:b/>
@@ -7921,7 +8520,54 @@
           <w:sz w:val="24"/>
           <w:szCs w:val="22"/>
         </w:rPr>
-        <w:t xml:space="preserve">        driver.manage().timeouts().pageLoadTimeout(Duration.ofSeconds(20));</w:t>
+        <w:t>(</w:t>
+      </w:r>
+      <w:proofErr w:type="gramEnd"/>
+      <w:r>
+        <w:rPr>
+          <w:b/>
+          <w:bCs/>
+          <w:sz w:val="24"/>
+          <w:szCs w:val="22"/>
+        </w:rPr>
+        <w:t>"https://omayo.blogspot.com/");</w:t>
+      </w:r>
+    </w:p>
+    <w:p>
+      <w:pPr>
+        <w:rPr>
+          <w:sz w:val="24"/>
+          <w:szCs w:val="22"/>
+        </w:rPr>
+      </w:pPr>
+      <w:r>
+        <w:rPr>
+          <w:b/>
+          <w:bCs/>
+          <w:sz w:val="24"/>
+          <w:szCs w:val="22"/>
+        </w:rPr>
+        <w:t xml:space="preserve">        </w:t>
+      </w:r>
+      <w:proofErr w:type="gramStart"/>
+      <w:r>
+        <w:rPr>
+          <w:b/>
+          <w:bCs/>
+          <w:sz w:val="24"/>
+          <w:szCs w:val="22"/>
+        </w:rPr>
+        <w:t>driver.manage(</w:t>
+      </w:r>
+      <w:proofErr w:type="gramEnd"/>
+      <w:r>
+        <w:rPr>
+          <w:b/>
+          <w:bCs/>
+          <w:sz w:val="24"/>
+          <w:szCs w:val="22"/>
+        </w:rPr>
+        <w:t>).timeouts().pageLoadTimeout(Duration.ofSeconds(20));</w:t>
       </w:r>
       <w:r>
         <w:rPr>
@@ -8113,8 +8759,9 @@
           <w:szCs w:val="23"/>
           <w:lang w:eastAsia="en-IN"/>
         </w:rPr>
-        <w:t>Set&lt;String&gt;windows = driver.getWindowHandles();</w:t>
-      </w:r>
+        <w:t xml:space="preserve">Set&lt;String&gt;windows = </w:t>
+      </w:r>
+      <w:proofErr w:type="spellStart"/>
       <w:r>
         <w:rPr>
           <w:rFonts w:ascii="Courier New" w:eastAsia="Times New Roman" w:hAnsi="Courier New" w:cs="Courier New"/>
@@ -8123,7 +8770,38 @@
           <w:szCs w:val="23"/>
           <w:lang w:eastAsia="en-IN"/>
         </w:rPr>
+        <w:t>driver.getWindowHandles</w:t>
+      </w:r>
+      <w:proofErr w:type="spellEnd"/>
+      <w:r>
+        <w:rPr>
+          <w:rFonts w:ascii="Courier New" w:eastAsia="Times New Roman" w:hAnsi="Courier New" w:cs="Courier New"/>
+          <w:color w:val="BCBEC4"/>
+          <w:sz w:val="23"/>
+          <w:szCs w:val="23"/>
+          <w:lang w:eastAsia="en-IN"/>
+        </w:rPr>
+        <w:t>();</w:t>
+      </w:r>
+      <w:r>
+        <w:rPr>
+          <w:rFonts w:ascii="Courier New" w:eastAsia="Times New Roman" w:hAnsi="Courier New" w:cs="Courier New"/>
+          <w:color w:val="BCBEC4"/>
+          <w:sz w:val="23"/>
+          <w:szCs w:val="23"/>
+          <w:lang w:eastAsia="en-IN"/>
+        </w:rPr>
         <w:br/>
+      </w:r>
+      <w:proofErr w:type="spellStart"/>
+      <w:r>
+        <w:rPr>
+          <w:rFonts w:ascii="Courier New" w:eastAsia="Times New Roman" w:hAnsi="Courier New" w:cs="Courier New"/>
+          <w:color w:val="BCBEC4"/>
+          <w:sz w:val="23"/>
+          <w:szCs w:val="23"/>
+          <w:lang w:eastAsia="en-IN"/>
+        </w:rPr>
         <w:t>System.</w:t>
       </w:r>
       <w:r>
@@ -8146,8 +8824,9 @@
           <w:szCs w:val="23"/>
           <w:lang w:eastAsia="en-IN"/>
         </w:rPr>
-        <w:t>.println(windows);</w:t>
-      </w:r>
+        <w:t>.println</w:t>
+      </w:r>
+      <w:proofErr w:type="spellEnd"/>
       <w:r>
         <w:rPr>
           <w:rFonts w:ascii="Courier New" w:eastAsia="Times New Roman" w:hAnsi="Courier New" w:cs="Courier New"/>
@@ -8156,7 +8835,7 @@
           <w:szCs w:val="23"/>
           <w:lang w:eastAsia="en-IN"/>
         </w:rPr>
-        <w:br/>
+        <w:t>(windows);</w:t>
       </w:r>
       <w:r>
         <w:rPr>
@@ -8167,7 +8846,6 @@
           <w:lang w:eastAsia="en-IN"/>
         </w:rPr>
         <w:br/>
-        <w:t>Object[] winArray = windows.toArray();</w:t>
       </w:r>
       <w:r>
         <w:rPr>
@@ -8178,7 +8856,84 @@
           <w:lang w:eastAsia="en-IN"/>
         </w:rPr>
         <w:br/>
-        <w:t>String win1 = winArray[</w:t>
+        <w:t xml:space="preserve">Object[] </w:t>
+      </w:r>
+      <w:proofErr w:type="spellStart"/>
+      <w:r>
+        <w:rPr>
+          <w:rFonts w:ascii="Courier New" w:eastAsia="Times New Roman" w:hAnsi="Courier New" w:cs="Courier New"/>
+          <w:color w:val="BCBEC4"/>
+          <w:sz w:val="23"/>
+          <w:szCs w:val="23"/>
+          <w:lang w:eastAsia="en-IN"/>
+        </w:rPr>
+        <w:t>winArray</w:t>
+      </w:r>
+      <w:proofErr w:type="spellEnd"/>
+      <w:r>
+        <w:rPr>
+          <w:rFonts w:ascii="Courier New" w:eastAsia="Times New Roman" w:hAnsi="Courier New" w:cs="Courier New"/>
+          <w:color w:val="BCBEC4"/>
+          <w:sz w:val="23"/>
+          <w:szCs w:val="23"/>
+          <w:lang w:eastAsia="en-IN"/>
+        </w:rPr>
+        <w:t xml:space="preserve"> = </w:t>
+      </w:r>
+      <w:proofErr w:type="spellStart"/>
+      <w:r>
+        <w:rPr>
+          <w:rFonts w:ascii="Courier New" w:eastAsia="Times New Roman" w:hAnsi="Courier New" w:cs="Courier New"/>
+          <w:color w:val="BCBEC4"/>
+          <w:sz w:val="23"/>
+          <w:szCs w:val="23"/>
+          <w:lang w:eastAsia="en-IN"/>
+        </w:rPr>
+        <w:t>windows.toArray</w:t>
+      </w:r>
+      <w:proofErr w:type="spellEnd"/>
+      <w:r>
+        <w:rPr>
+          <w:rFonts w:ascii="Courier New" w:eastAsia="Times New Roman" w:hAnsi="Courier New" w:cs="Courier New"/>
+          <w:color w:val="BCBEC4"/>
+          <w:sz w:val="23"/>
+          <w:szCs w:val="23"/>
+          <w:lang w:eastAsia="en-IN"/>
+        </w:rPr>
+        <w:t>();</w:t>
+      </w:r>
+      <w:r>
+        <w:rPr>
+          <w:rFonts w:ascii="Courier New" w:eastAsia="Times New Roman" w:hAnsi="Courier New" w:cs="Courier New"/>
+          <w:color w:val="BCBEC4"/>
+          <w:sz w:val="23"/>
+          <w:szCs w:val="23"/>
+          <w:lang w:eastAsia="en-IN"/>
+        </w:rPr>
+        <w:br/>
+        <w:t xml:space="preserve">String win1 = </w:t>
+      </w:r>
+      <w:proofErr w:type="spellStart"/>
+      <w:r>
+        <w:rPr>
+          <w:rFonts w:ascii="Courier New" w:eastAsia="Times New Roman" w:hAnsi="Courier New" w:cs="Courier New"/>
+          <w:color w:val="BCBEC4"/>
+          <w:sz w:val="23"/>
+          <w:szCs w:val="23"/>
+          <w:lang w:eastAsia="en-IN"/>
+        </w:rPr>
+        <w:t>winArray</w:t>
+      </w:r>
+      <w:proofErr w:type="spellEnd"/>
+      <w:r>
+        <w:rPr>
+          <w:rFonts w:ascii="Courier New" w:eastAsia="Times New Roman" w:hAnsi="Courier New" w:cs="Courier New"/>
+          <w:color w:val="BCBEC4"/>
+          <w:sz w:val="23"/>
+          <w:szCs w:val="23"/>
+          <w:lang w:eastAsia="en-IN"/>
+        </w:rPr>
+        <w:t>[</w:t>
       </w:r>
       <w:r>
         <w:rPr>
@@ -8198,7 +8953,29 @@
           <w:szCs w:val="23"/>
           <w:lang w:eastAsia="en-IN"/>
         </w:rPr>
-        <w:t xml:space="preserve">].toString();       </w:t>
+        <w:t>].</w:t>
+      </w:r>
+      <w:proofErr w:type="spellStart"/>
+      <w:r>
+        <w:rPr>
+          <w:rFonts w:ascii="Courier New" w:eastAsia="Times New Roman" w:hAnsi="Courier New" w:cs="Courier New"/>
+          <w:color w:val="BCBEC4"/>
+          <w:sz w:val="23"/>
+          <w:szCs w:val="23"/>
+          <w:lang w:eastAsia="en-IN"/>
+        </w:rPr>
+        <w:t>toString</w:t>
+      </w:r>
+      <w:proofErr w:type="spellEnd"/>
+      <w:r>
+        <w:rPr>
+          <w:rFonts w:ascii="Courier New" w:eastAsia="Times New Roman" w:hAnsi="Courier New" w:cs="Courier New"/>
+          <w:color w:val="BCBEC4"/>
+          <w:sz w:val="23"/>
+          <w:szCs w:val="23"/>
+          <w:lang w:eastAsia="en-IN"/>
+        </w:rPr>
+        <w:t xml:space="preserve">();       </w:t>
       </w:r>
       <w:r>
         <w:rPr>
@@ -8228,7 +9005,29 @@
           <w:szCs w:val="23"/>
           <w:lang w:eastAsia="en-IN"/>
         </w:rPr>
-        <w:t>String win2 = winArray[</w:t>
+        <w:t xml:space="preserve">String win2 = </w:t>
+      </w:r>
+      <w:proofErr w:type="spellStart"/>
+      <w:r>
+        <w:rPr>
+          <w:rFonts w:ascii="Courier New" w:eastAsia="Times New Roman" w:hAnsi="Courier New" w:cs="Courier New"/>
+          <w:color w:val="BCBEC4"/>
+          <w:sz w:val="23"/>
+          <w:szCs w:val="23"/>
+          <w:lang w:eastAsia="en-IN"/>
+        </w:rPr>
+        <w:t>winArray</w:t>
+      </w:r>
+      <w:proofErr w:type="spellEnd"/>
+      <w:r>
+        <w:rPr>
+          <w:rFonts w:ascii="Courier New" w:eastAsia="Times New Roman" w:hAnsi="Courier New" w:cs="Courier New"/>
+          <w:color w:val="BCBEC4"/>
+          <w:sz w:val="23"/>
+          <w:szCs w:val="23"/>
+          <w:lang w:eastAsia="en-IN"/>
+        </w:rPr>
+        <w:t>[</w:t>
       </w:r>
       <w:r>
         <w:rPr>
@@ -8248,7 +9047,29 @@
           <w:szCs w:val="23"/>
           <w:lang w:eastAsia="en-IN"/>
         </w:rPr>
-        <w:t xml:space="preserve">].toString();       </w:t>
+        <w:t>].</w:t>
+      </w:r>
+      <w:proofErr w:type="spellStart"/>
+      <w:r>
+        <w:rPr>
+          <w:rFonts w:ascii="Courier New" w:eastAsia="Times New Roman" w:hAnsi="Courier New" w:cs="Courier New"/>
+          <w:color w:val="BCBEC4"/>
+          <w:sz w:val="23"/>
+          <w:szCs w:val="23"/>
+          <w:lang w:eastAsia="en-IN"/>
+        </w:rPr>
+        <w:t>toString</w:t>
+      </w:r>
+      <w:proofErr w:type="spellEnd"/>
+      <w:r>
+        <w:rPr>
+          <w:rFonts w:ascii="Courier New" w:eastAsia="Times New Roman" w:hAnsi="Courier New" w:cs="Courier New"/>
+          <w:color w:val="BCBEC4"/>
+          <w:sz w:val="23"/>
+          <w:szCs w:val="23"/>
+          <w:lang w:eastAsia="en-IN"/>
+        </w:rPr>
+        <w:t xml:space="preserve">();       </w:t>
       </w:r>
       <w:r>
         <w:rPr>
@@ -8281,6 +9102,7 @@
         <w:lastRenderedPageBreak/>
         <w:br/>
       </w:r>
+      <w:proofErr w:type="spellStart"/>
       <w:r>
         <w:rPr>
           <w:rFonts w:ascii="Courier New" w:eastAsia="Times New Roman" w:hAnsi="Courier New" w:cs="Courier New"/>
@@ -8289,7 +9111,18 @@
           <w:szCs w:val="23"/>
           <w:lang w:eastAsia="en-IN"/>
         </w:rPr>
-        <w:t>driver.switchTo().window(win2);</w:t>
+        <w:t>driver.switchTo</w:t>
+      </w:r>
+      <w:proofErr w:type="spellEnd"/>
+      <w:r>
+        <w:rPr>
+          <w:rFonts w:ascii="Courier New" w:eastAsia="Times New Roman" w:hAnsi="Courier New" w:cs="Courier New"/>
+          <w:color w:val="BCBEC4"/>
+          <w:sz w:val="23"/>
+          <w:szCs w:val="23"/>
+          <w:lang w:eastAsia="en-IN"/>
+        </w:rPr>
+        <w:t>().window(win2);</w:t>
       </w:r>
     </w:p>
     <w:p>
@@ -8359,8 +9192,9 @@
           <w:szCs w:val="23"/>
           <w:lang w:eastAsia="en-IN"/>
         </w:rPr>
-        <w:t>Iterator&lt;String&gt;itr = windows.iterator();</w:t>
-      </w:r>
+        <w:t>Iterator&lt;String&gt;</w:t>
+      </w:r>
+      <w:proofErr w:type="spellStart"/>
       <w:r>
         <w:rPr>
           <w:rFonts w:ascii="Courier New" w:eastAsia="Times New Roman" w:hAnsi="Courier New" w:cs="Courier New"/>
@@ -8369,6 +9203,61 @@
           <w:szCs w:val="23"/>
           <w:lang w:eastAsia="en-IN"/>
         </w:rPr>
+        <w:t>itr</w:t>
+      </w:r>
+      <w:proofErr w:type="spellEnd"/>
+      <w:r>
+        <w:rPr>
+          <w:rFonts w:ascii="Courier New" w:eastAsia="Times New Roman" w:hAnsi="Courier New" w:cs="Courier New"/>
+          <w:color w:val="BCBEC4"/>
+          <w:sz w:val="23"/>
+          <w:szCs w:val="23"/>
+          <w:lang w:eastAsia="en-IN"/>
+        </w:rPr>
+        <w:t xml:space="preserve"> = </w:t>
+      </w:r>
+      <w:proofErr w:type="spellStart"/>
+      <w:proofErr w:type="gramStart"/>
+      <w:r>
+        <w:rPr>
+          <w:rFonts w:ascii="Courier New" w:eastAsia="Times New Roman" w:hAnsi="Courier New" w:cs="Courier New"/>
+          <w:color w:val="BCBEC4"/>
+          <w:sz w:val="23"/>
+          <w:szCs w:val="23"/>
+          <w:lang w:eastAsia="en-IN"/>
+        </w:rPr>
+        <w:t>windows.iterator</w:t>
+      </w:r>
+      <w:proofErr w:type="spellEnd"/>
+      <w:r>
+        <w:rPr>
+          <w:rFonts w:ascii="Courier New" w:eastAsia="Times New Roman" w:hAnsi="Courier New" w:cs="Courier New"/>
+          <w:color w:val="BCBEC4"/>
+          <w:sz w:val="23"/>
+          <w:szCs w:val="23"/>
+          <w:lang w:eastAsia="en-IN"/>
+        </w:rPr>
+        <w:t>(</w:t>
+      </w:r>
+      <w:proofErr w:type="gramEnd"/>
+      <w:r>
+        <w:rPr>
+          <w:rFonts w:ascii="Courier New" w:eastAsia="Times New Roman" w:hAnsi="Courier New" w:cs="Courier New"/>
+          <w:color w:val="BCBEC4"/>
+          <w:sz w:val="23"/>
+          <w:szCs w:val="23"/>
+          <w:lang w:eastAsia="en-IN"/>
+        </w:rPr>
+        <w:t>);</w:t>
+      </w:r>
+      <w:r>
+        <w:rPr>
+          <w:rFonts w:ascii="Courier New" w:eastAsia="Times New Roman" w:hAnsi="Courier New" w:cs="Courier New"/>
+          <w:color w:val="BCBEC4"/>
+          <w:sz w:val="23"/>
+          <w:szCs w:val="23"/>
+          <w:lang w:eastAsia="en-IN"/>
+        </w:rPr>
         <w:br/>
       </w:r>
       <w:r>
@@ -8399,8 +9288,9 @@
           <w:szCs w:val="23"/>
           <w:lang w:eastAsia="en-IN"/>
         </w:rPr>
-        <w:t>String win1 = itr.next();</w:t>
-      </w:r>
+        <w:t xml:space="preserve">String win1 = </w:t>
+      </w:r>
+      <w:proofErr w:type="spellStart"/>
       <w:r>
         <w:rPr>
           <w:rFonts w:ascii="Courier New" w:eastAsia="Times New Roman" w:hAnsi="Courier New" w:cs="Courier New"/>
@@ -8409,8 +9299,51 @@
           <w:szCs w:val="23"/>
           <w:lang w:eastAsia="en-IN"/>
         </w:rPr>
+        <w:t>itr.next</w:t>
+      </w:r>
+      <w:proofErr w:type="spellEnd"/>
+      <w:r>
+        <w:rPr>
+          <w:rFonts w:ascii="Courier New" w:eastAsia="Times New Roman" w:hAnsi="Courier New" w:cs="Courier New"/>
+          <w:color w:val="BCBEC4"/>
+          <w:sz w:val="23"/>
+          <w:szCs w:val="23"/>
+          <w:lang w:eastAsia="en-IN"/>
+        </w:rPr>
+        <w:t>();</w:t>
+      </w:r>
+      <w:r>
+        <w:rPr>
+          <w:rFonts w:ascii="Courier New" w:eastAsia="Times New Roman" w:hAnsi="Courier New" w:cs="Courier New"/>
+          <w:color w:val="BCBEC4"/>
+          <w:sz w:val="23"/>
+          <w:szCs w:val="23"/>
+          <w:lang w:eastAsia="en-IN"/>
+        </w:rPr>
         <w:br/>
-        <w:t>String win2 = itr.next();</w:t>
+        <w:t xml:space="preserve">String win2 = </w:t>
+      </w:r>
+      <w:proofErr w:type="spellStart"/>
+      <w:r>
+        <w:rPr>
+          <w:rFonts w:ascii="Courier New" w:eastAsia="Times New Roman" w:hAnsi="Courier New" w:cs="Courier New"/>
+          <w:color w:val="BCBEC4"/>
+          <w:sz w:val="23"/>
+          <w:szCs w:val="23"/>
+          <w:lang w:eastAsia="en-IN"/>
+        </w:rPr>
+        <w:t>itr.next</w:t>
+      </w:r>
+      <w:proofErr w:type="spellEnd"/>
+      <w:r>
+        <w:rPr>
+          <w:rFonts w:ascii="Courier New" w:eastAsia="Times New Roman" w:hAnsi="Courier New" w:cs="Courier New"/>
+          <w:color w:val="BCBEC4"/>
+          <w:sz w:val="23"/>
+          <w:szCs w:val="23"/>
+          <w:lang w:eastAsia="en-IN"/>
+        </w:rPr>
+        <w:t>();</w:t>
       </w:r>
     </w:p>
     <w:p>
@@ -8695,12 +9628,30 @@
           <w:szCs w:val="22"/>
         </w:rPr>
       </w:pPr>
-      <w:r>
-        <w:rPr>
-          <w:sz w:val="24"/>
-          <w:szCs w:val="22"/>
-        </w:rPr>
-        <w:t xml:space="preserve">driver.switchTo().alert() </w:t>
+      <w:proofErr w:type="spellStart"/>
+      <w:proofErr w:type="gramStart"/>
+      <w:r>
+        <w:rPr>
+          <w:sz w:val="24"/>
+          <w:szCs w:val="22"/>
+        </w:rPr>
+        <w:t>driver.switchTo</w:t>
+      </w:r>
+      <w:proofErr w:type="spellEnd"/>
+      <w:r>
+        <w:rPr>
+          <w:sz w:val="24"/>
+          <w:szCs w:val="22"/>
+        </w:rPr>
+        <w:t>(</w:t>
+      </w:r>
+      <w:proofErr w:type="gramEnd"/>
+      <w:r>
+        <w:rPr>
+          <w:sz w:val="24"/>
+          <w:szCs w:val="22"/>
+        </w:rPr>
+        <w:t xml:space="preserve">).alert() </w:t>
       </w:r>
       <w:r>
         <w:rPr>
@@ -8731,12 +9682,21 @@
           <w:szCs w:val="22"/>
         </w:rPr>
       </w:pPr>
-      <w:r>
-        <w:rPr>
-          <w:sz w:val="24"/>
-          <w:szCs w:val="22"/>
-        </w:rPr>
-        <w:t xml:space="preserve">getText() </w:t>
+      <w:proofErr w:type="gramStart"/>
+      <w:r>
+        <w:rPr>
+          <w:sz w:val="24"/>
+          <w:szCs w:val="22"/>
+        </w:rPr>
+        <w:t>getText(</w:t>
+      </w:r>
+      <w:proofErr w:type="gramEnd"/>
+      <w:r>
+        <w:rPr>
+          <w:sz w:val="24"/>
+          <w:szCs w:val="22"/>
+        </w:rPr>
+        <w:t xml:space="preserve">) </w:t>
       </w:r>
       <w:r>
         <w:rPr>
@@ -8788,6 +9748,95 @@
         </w:rPr>
         <w:t xml:space="preserve"> Will click on Ok button</w:t>
       </w:r>
+    </w:p>
+    <w:p>
+      <w:pPr>
+        <w:pStyle w:val="ListParagraph"/>
+        <w:numPr>
+          <w:ilvl w:val="1"/>
+          <w:numId w:val="25"/>
+        </w:numPr>
+        <w:rPr>
+          <w:b/>
+          <w:bCs/>
+          <w:sz w:val="24"/>
+          <w:szCs w:val="22"/>
+        </w:rPr>
+      </w:pPr>
+      <w:r>
+        <w:rPr>
+          <w:sz w:val="24"/>
+          <w:szCs w:val="22"/>
+        </w:rPr>
+        <w:t xml:space="preserve">dismiss() </w:t>
+      </w:r>
+      <w:r>
+        <w:rPr>
+          <w:sz w:val="24"/>
+          <w:szCs w:val="22"/>
+        </w:rPr>
+        <w:sym w:font="Wingdings" w:char="F0E0"/>
+      </w:r>
+      <w:r>
+        <w:rPr>
+          <w:sz w:val="24"/>
+          <w:szCs w:val="22"/>
+        </w:rPr>
+        <w:t xml:space="preserve"> Will click on Cancel button</w:t>
+      </w:r>
+    </w:p>
+    <w:p>
+      <w:pPr>
+        <w:pStyle w:val="ListParagraph"/>
+        <w:numPr>
+          <w:ilvl w:val="1"/>
+          <w:numId w:val="25"/>
+        </w:numPr>
+        <w:rPr>
+          <w:b/>
+          <w:bCs/>
+          <w:sz w:val="24"/>
+          <w:szCs w:val="22"/>
+        </w:rPr>
+      </w:pPr>
+      <w:r>
+        <w:rPr>
+          <w:sz w:val="24"/>
+          <w:szCs w:val="22"/>
+        </w:rPr>
+        <w:t xml:space="preserve">sendKeys() </w:t>
+      </w:r>
+      <w:r>
+        <w:rPr>
+          <w:sz w:val="24"/>
+          <w:szCs w:val="22"/>
+        </w:rPr>
+        <w:sym w:font="Wingdings" w:char="F0E0"/>
+      </w:r>
+      <w:r>
+        <w:rPr>
+          <w:sz w:val="24"/>
+          <w:szCs w:val="22"/>
+        </w:rPr>
+        <w:t xml:space="preserve"> Will enter the text on Alert (Prompt alert)</w:t>
+      </w:r>
+    </w:p>
+    <w:p>
+      <w:pPr>
+        <w:pStyle w:val="ListParagraph"/>
+        <w:numPr>
+          <w:ilvl w:val="0"/>
+          <w:numId w:val="25"/>
+        </w:numPr>
+        <w:rPr>
+          <w:b/>
+          <w:bCs/>
+          <w:sz w:val="24"/>
+          <w:szCs w:val="22"/>
+        </w:rPr>
+      </w:pPr>
+      <w:bookmarkStart w:id="0" w:name="_GoBack"/>
+      <w:bookmarkEnd w:id="0"/>
     </w:p>
     <w:sectPr>
       <w:pgSz w:w="11906" w:h="16838"/>

</xml_diff>

<commit_message>
Date: 11 Feb 2026
</commit_message>
<xml_diff>
--- a/Notes.docx
+++ b/Notes.docx
@@ -5684,6 +5684,40 @@
     </w:p>
     <w:p>
       <w:pPr>
+        <w:pStyle w:val="ListParagraph"/>
+        <w:numPr>
+          <w:ilvl w:val="1"/>
+          <w:numId w:val="15"/>
+        </w:numPr>
+        <w:rPr>
+          <w:sz w:val="24"/>
+          <w:szCs w:val="22"/>
+        </w:rPr>
+      </w:pPr>
+      <w:r>
+        <w:rPr>
+          <w:sz w:val="24"/>
+          <w:szCs w:val="22"/>
+        </w:rPr>
+        <w:t xml:space="preserve">getLocation() </w:t>
+      </w:r>
+      <w:r>
+        <w:rPr>
+          <w:sz w:val="24"/>
+          <w:szCs w:val="22"/>
+        </w:rPr>
+        <w:sym w:font="Wingdings" w:char="F0E0"/>
+      </w:r>
+      <w:r>
+        <w:rPr>
+          <w:sz w:val="24"/>
+          <w:szCs w:val="22"/>
+        </w:rPr>
+        <w:t xml:space="preserve"> Returns the x &amp; y Co-ordinates of any WebElement (Point) </w:t>
+      </w:r>
+    </w:p>
+    <w:p>
+      <w:pPr>
         <w:rPr>
           <w:sz w:val="24"/>
           <w:szCs w:val="22"/>
@@ -6208,6 +6242,7 @@
           <w:sz w:val="24"/>
           <w:szCs w:val="22"/>
         </w:rPr>
+        <w:lastRenderedPageBreak/>
         <w:t>Using Special Characters</w:t>
       </w:r>
     </w:p>
@@ -6228,7 +6263,6 @@
           <w:sz w:val="24"/>
           <w:szCs w:val="22"/>
         </w:rPr>
-        <w:lastRenderedPageBreak/>
         <w:t>^ - Starts with</w:t>
       </w:r>
     </w:p>
@@ -6945,6 +6979,7 @@
           <w:sz w:val="24"/>
           <w:szCs w:val="22"/>
         </w:rPr>
+        <w:lastRenderedPageBreak/>
         <w:t xml:space="preserve">isMultiple() </w:t>
       </w:r>
       <w:r>
@@ -6979,7 +7014,6 @@
           <w:sz w:val="24"/>
           <w:szCs w:val="22"/>
         </w:rPr>
-        <w:lastRenderedPageBreak/>
         <w:t>deselectByIndex()</w:t>
       </w:r>
     </w:p>
@@ -7626,6 +7660,7 @@
           <w:sz w:val="24"/>
           <w:szCs w:val="22"/>
         </w:rPr>
+        <w:lastRenderedPageBreak/>
         <w:t>It is applicable to single statement only</w:t>
       </w:r>
     </w:p>
@@ -7666,7 +7701,6 @@
           <w:sz w:val="24"/>
           <w:szCs w:val="22"/>
         </w:rPr>
-        <w:lastRenderedPageBreak/>
         <w:t>We can specify the condition for wait. (ElementToBeClickable, AlertIsPresent, VisibilityOfElementLocated)</w:t>
       </w:r>
     </w:p>
@@ -8219,6 +8253,7 @@
           <w:szCs w:val="23"/>
           <w:lang w:eastAsia="en-IN"/>
         </w:rPr>
+        <w:lastRenderedPageBreak/>
         <w:t>String win2 = winArray[</w:t>
       </w:r>
       <w:r>
@@ -8269,7 +8304,6 @@
           <w:szCs w:val="23"/>
           <w:lang w:eastAsia="en-IN"/>
         </w:rPr>
-        <w:lastRenderedPageBreak/>
         <w:br/>
       </w:r>
       <w:r>
@@ -8975,6 +9009,7 @@
           <w:sz w:val="24"/>
           <w:szCs w:val="22"/>
         </w:rPr>
+        <w:lastRenderedPageBreak/>
         <w:t>Right click</w:t>
       </w:r>
     </w:p>
@@ -8995,7 +9030,6 @@
           <w:sz w:val="24"/>
           <w:szCs w:val="22"/>
         </w:rPr>
-        <w:lastRenderedPageBreak/>
         <w:t>Left Click</w:t>
       </w:r>
     </w:p>
@@ -9149,8 +9183,1732 @@
         </w:rPr>
         <w:t xml:space="preserve"> To perform the said action.</w:t>
       </w:r>
+    </w:p>
+    <w:p>
+      <w:pPr>
+        <w:pStyle w:val="ListParagraph"/>
+        <w:numPr>
+          <w:ilvl w:val="0"/>
+          <w:numId w:val="27"/>
+        </w:numPr>
+        <w:rPr>
+          <w:sz w:val="24"/>
+          <w:szCs w:val="22"/>
+        </w:rPr>
+      </w:pPr>
+      <w:r>
+        <w:rPr>
+          <w:sz w:val="24"/>
+          <w:szCs w:val="22"/>
+        </w:rPr>
+        <w:t xml:space="preserve">contextClick() </w:t>
+      </w:r>
+      <w:r>
+        <w:rPr>
+          <w:sz w:val="24"/>
+          <w:szCs w:val="22"/>
+        </w:rPr>
+        <w:sym w:font="Wingdings" w:char="F0E0"/>
+      </w:r>
+      <w:r>
+        <w:rPr>
+          <w:sz w:val="24"/>
+          <w:szCs w:val="22"/>
+        </w:rPr>
+        <w:t xml:space="preserve"> To perform right click</w:t>
+      </w:r>
+    </w:p>
+    <w:p>
+      <w:pPr>
+        <w:pStyle w:val="ListParagraph"/>
+        <w:numPr>
+          <w:ilvl w:val="0"/>
+          <w:numId w:val="27"/>
+        </w:numPr>
+        <w:rPr>
+          <w:sz w:val="24"/>
+          <w:szCs w:val="22"/>
+        </w:rPr>
+      </w:pPr>
+      <w:r>
+        <w:rPr>
+          <w:sz w:val="24"/>
+          <w:szCs w:val="22"/>
+        </w:rPr>
+        <w:t xml:space="preserve">doubleClick() </w:t>
+      </w:r>
+      <w:r>
+        <w:rPr>
+          <w:sz w:val="24"/>
+          <w:szCs w:val="22"/>
+        </w:rPr>
+        <w:sym w:font="Wingdings" w:char="F0E0"/>
+      </w:r>
+      <w:r>
+        <w:rPr>
+          <w:sz w:val="24"/>
+          <w:szCs w:val="22"/>
+        </w:rPr>
+        <w:t xml:space="preserve"> To perform double click</w:t>
+      </w:r>
+    </w:p>
+    <w:p>
+      <w:pPr>
+        <w:pStyle w:val="ListParagraph"/>
+        <w:numPr>
+          <w:ilvl w:val="0"/>
+          <w:numId w:val="27"/>
+        </w:numPr>
+        <w:rPr>
+          <w:sz w:val="24"/>
+          <w:szCs w:val="22"/>
+        </w:rPr>
+      </w:pPr>
+      <w:r>
+        <w:rPr>
+          <w:sz w:val="24"/>
+          <w:szCs w:val="22"/>
+        </w:rPr>
+        <w:t xml:space="preserve">dragAndDrop() </w:t>
+      </w:r>
+      <w:r>
+        <w:rPr>
+          <w:sz w:val="24"/>
+          <w:szCs w:val="22"/>
+        </w:rPr>
+        <w:sym w:font="Wingdings" w:char="F0E0"/>
+      </w:r>
+      <w:r>
+        <w:rPr>
+          <w:sz w:val="24"/>
+          <w:szCs w:val="22"/>
+        </w:rPr>
+        <w:t xml:space="preserve"> To perform drag and drop</w:t>
+      </w:r>
+    </w:p>
+    <w:p>
+      <w:pPr>
+        <w:pStyle w:val="ListParagraph"/>
+        <w:numPr>
+          <w:ilvl w:val="0"/>
+          <w:numId w:val="27"/>
+        </w:numPr>
+        <w:rPr>
+          <w:sz w:val="24"/>
+          <w:szCs w:val="22"/>
+        </w:rPr>
+      </w:pPr>
+      <w:r>
+        <w:rPr>
+          <w:sz w:val="24"/>
+          <w:szCs w:val="22"/>
+        </w:rPr>
+        <w:t xml:space="preserve">dragAndDropBy() </w:t>
+      </w:r>
+      <w:r>
+        <w:rPr>
+          <w:sz w:val="24"/>
+          <w:szCs w:val="22"/>
+        </w:rPr>
+        <w:sym w:font="Wingdings" w:char="F0E0"/>
+      </w:r>
+      <w:r>
+        <w:rPr>
+          <w:sz w:val="24"/>
+          <w:szCs w:val="22"/>
+        </w:rPr>
+        <w:t xml:space="preserve"> To perform drag and drop on some specific location. Using </w:t>
+      </w:r>
+      <w:r>
+        <w:rPr>
+          <w:sz w:val="24"/>
+          <w:szCs w:val="22"/>
+        </w:rPr>
+        <w:t>X &amp; Y c</w:t>
+      </w:r>
+      <w:r>
+        <w:rPr>
+          <w:sz w:val="24"/>
+          <w:szCs w:val="22"/>
+        </w:rPr>
+        <w:t xml:space="preserve">o-ordinates. </w:t>
+      </w:r>
+    </w:p>
+    <w:p>
+      <w:pPr>
+        <w:rPr>
+          <w:b/>
+          <w:bCs/>
+          <w:sz w:val="24"/>
+          <w:szCs w:val="22"/>
+        </w:rPr>
+      </w:pPr>
+      <w:r>
+        <w:rPr>
+          <w:b/>
+          <w:bCs/>
+          <w:sz w:val="24"/>
+          <w:szCs w:val="22"/>
+        </w:rPr>
+        <w:t>Handling Shadow root</w:t>
+      </w:r>
+    </w:p>
+    <w:p>
+      <w:pPr>
+        <w:rPr>
+          <w:sz w:val="24"/>
+          <w:szCs w:val="22"/>
+        </w:rPr>
+      </w:pPr>
+      <w:r>
+        <w:rPr>
+          <w:sz w:val="24"/>
+          <w:szCs w:val="22"/>
+        </w:rPr>
+        <w:t>For handling #shadow-root(open) first read the parent tag of #shadow-root control and then using getShadowRoot() method read the control</w:t>
+      </w:r>
+    </w:p>
+    <w:p>
+      <w:pPr>
+        <w:shd w:val="clear" w:color="auto" w:fill="1E1F22"/>
+        <w:tabs>
+          <w:tab w:val="left" w:pos="916"/>
+          <w:tab w:val="left" w:pos="1832"/>
+          <w:tab w:val="left" w:pos="2748"/>
+          <w:tab w:val="left" w:pos="3664"/>
+          <w:tab w:val="left" w:pos="4580"/>
+          <w:tab w:val="left" w:pos="5496"/>
+          <w:tab w:val="left" w:pos="6412"/>
+          <w:tab w:val="left" w:pos="7328"/>
+          <w:tab w:val="left" w:pos="8244"/>
+          <w:tab w:val="left" w:pos="9160"/>
+          <w:tab w:val="left" w:pos="10076"/>
+          <w:tab w:val="left" w:pos="10992"/>
+          <w:tab w:val="left" w:pos="11908"/>
+          <w:tab w:val="left" w:pos="12824"/>
+          <w:tab w:val="left" w:pos="13740"/>
+          <w:tab w:val="left" w:pos="14656"/>
+        </w:tabs>
+        <w:spacing w:after="0" w:line="240" w:lineRule="auto"/>
+        <w:rPr>
+          <w:rFonts w:ascii="Courier New" w:eastAsia="Times New Roman" w:hAnsi="Courier New" w:cs="Courier New"/>
+          <w:color w:val="BCBEC4"/>
+          <w:sz w:val="23"/>
+          <w:szCs w:val="23"/>
+          <w:lang w:eastAsia="en-IN"/>
+        </w:rPr>
+      </w:pPr>
+      <w:r>
+        <w:rPr>
+          <w:rFonts w:ascii="Courier New" w:eastAsia="Times New Roman" w:hAnsi="Courier New" w:cs="Courier New"/>
+          <w:color w:val="BCBEC4"/>
+          <w:sz w:val="23"/>
+          <w:szCs w:val="23"/>
+          <w:lang w:eastAsia="en-IN"/>
+        </w:rPr>
+        <w:t>SearchContext ss = driver.findElement(By.</w:t>
+      </w:r>
+      <w:r>
+        <w:rPr>
+          <w:rFonts w:ascii="Courier New" w:eastAsia="Times New Roman" w:hAnsi="Courier New" w:cs="Courier New"/>
+          <w:i/>
+          <w:iCs/>
+          <w:color w:val="BCBEC4"/>
+          <w:sz w:val="23"/>
+          <w:szCs w:val="23"/>
+          <w:lang w:eastAsia="en-IN"/>
+        </w:rPr>
+        <w:t>id</w:t>
+      </w:r>
+      <w:r>
+        <w:rPr>
+          <w:rFonts w:ascii="Courier New" w:eastAsia="Times New Roman" w:hAnsi="Courier New" w:cs="Courier New"/>
+          <w:color w:val="BCBEC4"/>
+          <w:sz w:val="23"/>
+          <w:szCs w:val="23"/>
+          <w:lang w:eastAsia="en-IN"/>
+        </w:rPr>
+        <w:t>(</w:t>
+      </w:r>
+      <w:r>
+        <w:rPr>
+          <w:rFonts w:ascii="Courier New" w:eastAsia="Times New Roman" w:hAnsi="Courier New" w:cs="Courier New"/>
+          <w:color w:val="6AAB73"/>
+          <w:sz w:val="23"/>
+          <w:szCs w:val="23"/>
+          <w:lang w:eastAsia="en-IN"/>
+        </w:rPr>
+        <w:t>"shadow_host"</w:t>
+      </w:r>
+      <w:r>
+        <w:rPr>
+          <w:rFonts w:ascii="Courier New" w:eastAsia="Times New Roman" w:hAnsi="Courier New" w:cs="Courier New"/>
+          <w:color w:val="BCBEC4"/>
+          <w:sz w:val="23"/>
+          <w:szCs w:val="23"/>
+          <w:lang w:eastAsia="en-IN"/>
+        </w:rPr>
+        <w:t>)).getShadowRoot();</w:t>
+      </w:r>
+      <w:r>
+        <w:rPr>
+          <w:rFonts w:ascii="Courier New" w:eastAsia="Times New Roman" w:hAnsi="Courier New" w:cs="Courier New"/>
+          <w:color w:val="BCBEC4"/>
+          <w:sz w:val="23"/>
+          <w:szCs w:val="23"/>
+          <w:lang w:eastAsia="en-IN"/>
+        </w:rPr>
+        <w:br/>
+        <w:t>ss.findElement(By.</w:t>
+      </w:r>
+      <w:r>
+        <w:rPr>
+          <w:rFonts w:ascii="Courier New" w:eastAsia="Times New Roman" w:hAnsi="Courier New" w:cs="Courier New"/>
+          <w:i/>
+          <w:iCs/>
+          <w:color w:val="BCBEC4"/>
+          <w:sz w:val="23"/>
+          <w:szCs w:val="23"/>
+          <w:lang w:eastAsia="en-IN"/>
+        </w:rPr>
+        <w:t>cssSelector</w:t>
+      </w:r>
+      <w:r>
+        <w:rPr>
+          <w:rFonts w:ascii="Courier New" w:eastAsia="Times New Roman" w:hAnsi="Courier New" w:cs="Courier New"/>
+          <w:color w:val="BCBEC4"/>
+          <w:sz w:val="23"/>
+          <w:szCs w:val="23"/>
+          <w:lang w:eastAsia="en-IN"/>
+        </w:rPr>
+        <w:t>(</w:t>
+      </w:r>
+      <w:r>
+        <w:rPr>
+          <w:rFonts w:ascii="Courier New" w:eastAsia="Times New Roman" w:hAnsi="Courier New" w:cs="Courier New"/>
+          <w:color w:val="6AAB73"/>
+          <w:sz w:val="23"/>
+          <w:szCs w:val="23"/>
+          <w:lang w:eastAsia="en-IN"/>
+        </w:rPr>
+        <w:t>"input[type=</w:t>
+      </w:r>
+      <w:r>
+        <w:rPr>
+          <w:rFonts w:ascii="Courier New" w:eastAsia="Times New Roman" w:hAnsi="Courier New" w:cs="Courier New"/>
+          <w:color w:val="CF8E6D"/>
+          <w:sz w:val="23"/>
+          <w:szCs w:val="23"/>
+          <w:lang w:eastAsia="en-IN"/>
+        </w:rPr>
+        <w:t>\"</w:t>
+      </w:r>
+      <w:r>
+        <w:rPr>
+          <w:rFonts w:ascii="Courier New" w:eastAsia="Times New Roman" w:hAnsi="Courier New" w:cs="Courier New"/>
+          <w:color w:val="6AAB73"/>
+          <w:sz w:val="23"/>
+          <w:szCs w:val="23"/>
+          <w:lang w:eastAsia="en-IN"/>
+        </w:rPr>
+        <w:t>text</w:t>
+      </w:r>
+      <w:r>
+        <w:rPr>
+          <w:rFonts w:ascii="Courier New" w:eastAsia="Times New Roman" w:hAnsi="Courier New" w:cs="Courier New"/>
+          <w:color w:val="CF8E6D"/>
+          <w:sz w:val="23"/>
+          <w:szCs w:val="23"/>
+          <w:lang w:eastAsia="en-IN"/>
+        </w:rPr>
+        <w:t>\"</w:t>
+      </w:r>
+      <w:r>
+        <w:rPr>
+          <w:rFonts w:ascii="Courier New" w:eastAsia="Times New Roman" w:hAnsi="Courier New" w:cs="Courier New"/>
+          <w:color w:val="6AAB73"/>
+          <w:sz w:val="23"/>
+          <w:szCs w:val="23"/>
+          <w:lang w:eastAsia="en-IN"/>
+        </w:rPr>
+        <w:t>]"</w:t>
+      </w:r>
+      <w:r>
+        <w:rPr>
+          <w:rFonts w:ascii="Courier New" w:eastAsia="Times New Roman" w:hAnsi="Courier New" w:cs="Courier New"/>
+          <w:color w:val="BCBEC4"/>
+          <w:sz w:val="23"/>
+          <w:szCs w:val="23"/>
+          <w:lang w:eastAsia="en-IN"/>
+        </w:rPr>
+        <w:t>)).sendKeys(</w:t>
+      </w:r>
+      <w:r>
+        <w:rPr>
+          <w:rFonts w:ascii="Courier New" w:eastAsia="Times New Roman" w:hAnsi="Courier New" w:cs="Courier New"/>
+          <w:color w:val="6AAB73"/>
+          <w:sz w:val="23"/>
+          <w:szCs w:val="23"/>
+          <w:lang w:eastAsia="en-IN"/>
+        </w:rPr>
+        <w:t>"Ila Vashishth"</w:t>
+      </w:r>
+      <w:r>
+        <w:rPr>
+          <w:rFonts w:ascii="Courier New" w:eastAsia="Times New Roman" w:hAnsi="Courier New" w:cs="Courier New"/>
+          <w:color w:val="BCBEC4"/>
+          <w:sz w:val="23"/>
+          <w:szCs w:val="23"/>
+          <w:lang w:eastAsia="en-IN"/>
+        </w:rPr>
+        <w:t>);</w:t>
+      </w:r>
+    </w:p>
+    <w:p>
+      <w:pPr>
+        <w:rPr>
+          <w:sz w:val="24"/>
+          <w:szCs w:val="22"/>
+        </w:rPr>
+      </w:pPr>
+    </w:p>
+    <w:p>
+      <w:pPr>
+        <w:rPr>
+          <w:b/>
+          <w:bCs/>
+          <w:sz w:val="24"/>
+          <w:szCs w:val="22"/>
+        </w:rPr>
+      </w:pPr>
+      <w:r>
+        <w:rPr>
+          <w:b/>
+          <w:bCs/>
+          <w:sz w:val="24"/>
+          <w:szCs w:val="22"/>
+        </w:rPr>
+        <w:t>Capturing Screenshot</w:t>
+      </w:r>
+    </w:p>
+    <w:p>
+      <w:pPr>
+        <w:shd w:val="clear" w:color="auto" w:fill="1E1F22"/>
+        <w:tabs>
+          <w:tab w:val="left" w:pos="916"/>
+          <w:tab w:val="left" w:pos="1832"/>
+          <w:tab w:val="left" w:pos="2748"/>
+          <w:tab w:val="left" w:pos="3664"/>
+          <w:tab w:val="left" w:pos="4580"/>
+          <w:tab w:val="left" w:pos="5496"/>
+          <w:tab w:val="left" w:pos="6412"/>
+          <w:tab w:val="left" w:pos="7328"/>
+          <w:tab w:val="left" w:pos="8244"/>
+          <w:tab w:val="left" w:pos="9160"/>
+          <w:tab w:val="left" w:pos="10076"/>
+          <w:tab w:val="left" w:pos="10992"/>
+          <w:tab w:val="left" w:pos="11908"/>
+          <w:tab w:val="left" w:pos="12824"/>
+          <w:tab w:val="left" w:pos="13740"/>
+          <w:tab w:val="left" w:pos="14656"/>
+        </w:tabs>
+        <w:spacing w:after="0" w:line="240" w:lineRule="auto"/>
+        <w:rPr>
+          <w:rFonts w:ascii="Courier New" w:eastAsia="Times New Roman" w:hAnsi="Courier New" w:cs="Courier New"/>
+          <w:color w:val="BCBEC4"/>
+          <w:sz w:val="23"/>
+          <w:szCs w:val="23"/>
+          <w:lang w:eastAsia="en-IN"/>
+        </w:rPr>
+      </w:pPr>
+      <w:r>
+        <w:rPr>
+          <w:rFonts w:ascii="Courier New" w:eastAsia="Times New Roman" w:hAnsi="Courier New" w:cs="Courier New"/>
+          <w:color w:val="BCBEC4"/>
+          <w:sz w:val="23"/>
+          <w:szCs w:val="23"/>
+          <w:lang w:eastAsia="en-IN"/>
+        </w:rPr>
+        <w:t>File screenShot = ((TakesScreenshot)driver).getScreenshotAs(OutputType.</w:t>
+      </w:r>
+      <w:r>
+        <w:rPr>
+          <w:rFonts w:ascii="Courier New" w:eastAsia="Times New Roman" w:hAnsi="Courier New" w:cs="Courier New"/>
+          <w:i/>
+          <w:iCs/>
+          <w:color w:val="C77DBB"/>
+          <w:sz w:val="23"/>
+          <w:szCs w:val="23"/>
+          <w:lang w:eastAsia="en-IN"/>
+        </w:rPr>
+        <w:t>FILE</w:t>
+      </w:r>
+      <w:r>
+        <w:rPr>
+          <w:rFonts w:ascii="Courier New" w:eastAsia="Times New Roman" w:hAnsi="Courier New" w:cs="Courier New"/>
+          <w:color w:val="BCBEC4"/>
+          <w:sz w:val="23"/>
+          <w:szCs w:val="23"/>
+          <w:lang w:eastAsia="en-IN"/>
+        </w:rPr>
+        <w:t>);</w:t>
+      </w:r>
+      <w:r>
+        <w:rPr>
+          <w:rFonts w:ascii="Courier New" w:eastAsia="Times New Roman" w:hAnsi="Courier New" w:cs="Courier New"/>
+          <w:color w:val="BCBEC4"/>
+          <w:sz w:val="23"/>
+          <w:szCs w:val="23"/>
+          <w:lang w:eastAsia="en-IN"/>
+        </w:rPr>
+        <w:br/>
+        <w:t>FileHandler.</w:t>
+      </w:r>
+      <w:r>
+        <w:rPr>
+          <w:rFonts w:ascii="Courier New" w:eastAsia="Times New Roman" w:hAnsi="Courier New" w:cs="Courier New"/>
+          <w:i/>
+          <w:iCs/>
+          <w:color w:val="BCBEC4"/>
+          <w:sz w:val="23"/>
+          <w:szCs w:val="23"/>
+          <w:lang w:eastAsia="en-IN"/>
+        </w:rPr>
+        <w:t>copy</w:t>
+      </w:r>
+      <w:r>
+        <w:rPr>
+          <w:rFonts w:ascii="Courier New" w:eastAsia="Times New Roman" w:hAnsi="Courier New" w:cs="Courier New"/>
+          <w:color w:val="BCBEC4"/>
+          <w:sz w:val="23"/>
+          <w:szCs w:val="23"/>
+          <w:lang w:eastAsia="en-IN"/>
+        </w:rPr>
+        <w:t xml:space="preserve">(screenShot, </w:t>
+      </w:r>
+      <w:r>
+        <w:rPr>
+          <w:rFonts w:ascii="Courier New" w:eastAsia="Times New Roman" w:hAnsi="Courier New" w:cs="Courier New"/>
+          <w:color w:val="CF8E6D"/>
+          <w:sz w:val="23"/>
+          <w:szCs w:val="23"/>
+          <w:lang w:eastAsia="en-IN"/>
+        </w:rPr>
+        <w:t xml:space="preserve">new </w:t>
+      </w:r>
+      <w:r>
+        <w:rPr>
+          <w:rFonts w:ascii="Courier New" w:eastAsia="Times New Roman" w:hAnsi="Courier New" w:cs="Courier New"/>
+          <w:color w:val="BCBEC4"/>
+          <w:sz w:val="23"/>
+          <w:szCs w:val="23"/>
+          <w:lang w:eastAsia="en-IN"/>
+        </w:rPr>
+        <w:t>File(</w:t>
+      </w:r>
+      <w:r>
+        <w:rPr>
+          <w:rFonts w:ascii="Courier New" w:eastAsia="Times New Roman" w:hAnsi="Courier New" w:cs="Courier New"/>
+          <w:color w:val="6AAB73"/>
+          <w:sz w:val="23"/>
+          <w:szCs w:val="23"/>
+          <w:lang w:eastAsia="en-IN"/>
+        </w:rPr>
+        <w:t>"Screenshots</w:t>
+      </w:r>
+      <w:r>
+        <w:rPr>
+          <w:rFonts w:ascii="Courier New" w:eastAsia="Times New Roman" w:hAnsi="Courier New" w:cs="Courier New"/>
+          <w:color w:val="CF8E6D"/>
+          <w:sz w:val="23"/>
+          <w:szCs w:val="23"/>
+          <w:lang w:eastAsia="en-IN"/>
+        </w:rPr>
+        <w:t>\\</w:t>
+      </w:r>
+      <w:r>
+        <w:rPr>
+          <w:rFonts w:ascii="Courier New" w:eastAsia="Times New Roman" w:hAnsi="Courier New" w:cs="Courier New"/>
+          <w:color w:val="6AAB73"/>
+          <w:sz w:val="23"/>
+          <w:szCs w:val="23"/>
+          <w:lang w:eastAsia="en-IN"/>
+        </w:rPr>
+        <w:t>Screenshot.jpeg"</w:t>
+      </w:r>
+      <w:r>
+        <w:rPr>
+          <w:rFonts w:ascii="Courier New" w:eastAsia="Times New Roman" w:hAnsi="Courier New" w:cs="Courier New"/>
+          <w:color w:val="BCBEC4"/>
+          <w:sz w:val="23"/>
+          <w:szCs w:val="23"/>
+          <w:lang w:eastAsia="en-IN"/>
+        </w:rPr>
+        <w:t>));</w:t>
+      </w:r>
+    </w:p>
+    <w:p>
+      <w:pPr>
+        <w:rPr>
+          <w:b/>
+          <w:bCs/>
+          <w:sz w:val="24"/>
+          <w:szCs w:val="22"/>
+        </w:rPr>
+      </w:pPr>
+      <w:r>
+        <w:rPr>
+          <w:b/>
+          <w:bCs/>
+          <w:sz w:val="24"/>
+          <w:szCs w:val="22"/>
+        </w:rPr>
+        <w:br w:type="page"/>
+      </w:r>
+    </w:p>
+    <w:p>
+      <w:pPr>
+        <w:rPr>
+          <w:b/>
+          <w:bCs/>
+          <w:sz w:val="24"/>
+          <w:szCs w:val="22"/>
+        </w:rPr>
+      </w:pPr>
+      <w:r>
+        <w:rPr>
+          <w:b/>
+          <w:bCs/>
+          <w:sz w:val="24"/>
+          <w:szCs w:val="22"/>
+        </w:rPr>
+        <w:lastRenderedPageBreak/>
+        <w:t>TestNG</w:t>
+      </w:r>
+      <w:r>
+        <w:rPr>
+          <w:b/>
+          <w:bCs/>
+          <w:sz w:val="24"/>
+          <w:szCs w:val="22"/>
+        </w:rPr>
+        <w:t xml:space="preserve"> (Test Next Generation)</w:t>
+      </w:r>
+    </w:p>
+    <w:p>
+      <w:pPr>
+        <w:rPr>
+          <w:sz w:val="24"/>
+          <w:szCs w:val="22"/>
+        </w:rPr>
+      </w:pPr>
+      <w:r>
+        <w:rPr>
+          <w:sz w:val="24"/>
+          <w:szCs w:val="22"/>
+        </w:rPr>
+        <w:t>Is a testing framework which will help to make automation testing easy.</w:t>
+      </w:r>
+    </w:p>
+    <w:p>
+      <w:pPr>
+        <w:rPr>
+          <w:sz w:val="24"/>
+          <w:szCs w:val="22"/>
+        </w:rPr>
+      </w:pPr>
+    </w:p>
+    <w:p>
+      <w:pPr>
+        <w:rPr>
+          <w:b/>
+          <w:bCs/>
+          <w:sz w:val="24"/>
+          <w:szCs w:val="22"/>
+        </w:rPr>
+      </w:pPr>
+      <w:r>
+        <w:rPr>
+          <w:b/>
+          <w:bCs/>
+          <w:sz w:val="24"/>
+          <w:szCs w:val="22"/>
+        </w:rPr>
+        <w:t>Framework:</w:t>
+      </w:r>
+    </w:p>
+    <w:p>
+      <w:pPr>
+        <w:rPr>
+          <w:sz w:val="24"/>
+          <w:szCs w:val="22"/>
+        </w:rPr>
+      </w:pPr>
+      <w:r>
+        <w:rPr>
+          <w:sz w:val="24"/>
+          <w:szCs w:val="22"/>
+        </w:rPr>
+        <w:t>It is the set of rules, guidelines, best practices for automation testing.</w:t>
+      </w:r>
+    </w:p>
+    <w:p>
+      <w:pPr>
+        <w:rPr>
+          <w:sz w:val="24"/>
+          <w:szCs w:val="22"/>
+        </w:rPr>
+      </w:pPr>
+    </w:p>
+    <w:p>
+      <w:pPr>
+        <w:rPr>
+          <w:b/>
+          <w:bCs/>
+          <w:sz w:val="24"/>
+          <w:szCs w:val="22"/>
+        </w:rPr>
+      </w:pPr>
+      <w:r>
+        <w:rPr>
+          <w:b/>
+          <w:bCs/>
+          <w:sz w:val="24"/>
+          <w:szCs w:val="22"/>
+        </w:rPr>
+        <w:t>Advantages</w:t>
+      </w:r>
+    </w:p>
+    <w:p>
+      <w:pPr>
+        <w:pStyle w:val="ListParagraph"/>
+        <w:numPr>
+          <w:ilvl w:val="0"/>
+          <w:numId w:val="28"/>
+        </w:numPr>
+        <w:rPr>
+          <w:sz w:val="24"/>
+          <w:szCs w:val="22"/>
+        </w:rPr>
+      </w:pPr>
+      <w:r>
+        <w:rPr>
+          <w:sz w:val="24"/>
+          <w:szCs w:val="22"/>
+        </w:rPr>
+        <w:t>Can have multiple test cases in single class.</w:t>
+      </w:r>
+    </w:p>
+    <w:p>
+      <w:pPr>
+        <w:pStyle w:val="ListParagraph"/>
+        <w:numPr>
+          <w:ilvl w:val="0"/>
+          <w:numId w:val="28"/>
+        </w:numPr>
+        <w:rPr>
+          <w:sz w:val="24"/>
+          <w:szCs w:val="22"/>
+        </w:rPr>
+      </w:pPr>
+      <w:r>
+        <w:rPr>
+          <w:sz w:val="24"/>
+          <w:szCs w:val="22"/>
+        </w:rPr>
+        <w:t>Allows to execute single test / multiple tests.</w:t>
+      </w:r>
+    </w:p>
+    <w:p>
+      <w:pPr>
+        <w:pStyle w:val="ListParagraph"/>
+        <w:numPr>
+          <w:ilvl w:val="0"/>
+          <w:numId w:val="28"/>
+        </w:numPr>
+        <w:rPr>
+          <w:sz w:val="24"/>
+          <w:szCs w:val="22"/>
+        </w:rPr>
+      </w:pPr>
+      <w:r>
+        <w:rPr>
+          <w:sz w:val="24"/>
+          <w:szCs w:val="22"/>
+        </w:rPr>
+        <w:t>Allows to set the priority to the tests</w:t>
+      </w:r>
+    </w:p>
+    <w:p>
+      <w:pPr>
+        <w:pStyle w:val="ListParagraph"/>
+        <w:numPr>
+          <w:ilvl w:val="0"/>
+          <w:numId w:val="28"/>
+        </w:numPr>
+        <w:rPr>
+          <w:sz w:val="24"/>
+          <w:szCs w:val="22"/>
+        </w:rPr>
+      </w:pPr>
+      <w:r>
+        <w:rPr>
+          <w:sz w:val="24"/>
+          <w:szCs w:val="22"/>
+        </w:rPr>
+        <w:t>Allows to create test report</w:t>
+      </w:r>
+    </w:p>
+    <w:p>
+      <w:pPr>
+        <w:pStyle w:val="ListParagraph"/>
+        <w:numPr>
+          <w:ilvl w:val="1"/>
+          <w:numId w:val="28"/>
+        </w:numPr>
+        <w:rPr>
+          <w:sz w:val="24"/>
+          <w:szCs w:val="22"/>
+        </w:rPr>
+      </w:pPr>
+      <w:r>
+        <w:rPr>
+          <w:sz w:val="24"/>
+          <w:szCs w:val="22"/>
+        </w:rPr>
+        <w:t>Normal Report</w:t>
+      </w:r>
+    </w:p>
+    <w:p>
+      <w:pPr>
+        <w:pStyle w:val="ListParagraph"/>
+        <w:numPr>
+          <w:ilvl w:val="1"/>
+          <w:numId w:val="28"/>
+        </w:numPr>
+        <w:rPr>
+          <w:sz w:val="24"/>
+          <w:szCs w:val="22"/>
+        </w:rPr>
+      </w:pPr>
+      <w:r>
+        <w:rPr>
+          <w:sz w:val="24"/>
+          <w:szCs w:val="22"/>
+        </w:rPr>
+        <w:t>HTML Report</w:t>
+      </w:r>
+    </w:p>
+    <w:p>
+      <w:pPr>
+        <w:pStyle w:val="ListParagraph"/>
+        <w:numPr>
+          <w:ilvl w:val="0"/>
+          <w:numId w:val="28"/>
+        </w:numPr>
+        <w:rPr>
+          <w:sz w:val="24"/>
+          <w:szCs w:val="22"/>
+        </w:rPr>
+      </w:pPr>
+      <w:r>
+        <w:rPr>
+          <w:sz w:val="24"/>
+          <w:szCs w:val="22"/>
+        </w:rPr>
+        <w:t>Uses annotations</w:t>
+      </w:r>
+    </w:p>
+    <w:p>
+      <w:pPr>
+        <w:pStyle w:val="ListParagraph"/>
+        <w:numPr>
+          <w:ilvl w:val="1"/>
+          <w:numId w:val="28"/>
+        </w:numPr>
+        <w:rPr>
+          <w:sz w:val="24"/>
+          <w:szCs w:val="22"/>
+        </w:rPr>
+      </w:pPr>
+      <w:r>
+        <w:rPr>
+          <w:sz w:val="24"/>
+          <w:szCs w:val="22"/>
+        </w:rPr>
+        <w:t>@Test</w:t>
+      </w:r>
+    </w:p>
+    <w:p>
+      <w:pPr>
+        <w:pStyle w:val="ListParagraph"/>
+        <w:numPr>
+          <w:ilvl w:val="1"/>
+          <w:numId w:val="28"/>
+        </w:numPr>
+        <w:rPr>
+          <w:sz w:val="24"/>
+          <w:szCs w:val="22"/>
+        </w:rPr>
+      </w:pPr>
+      <w:r>
+        <w:rPr>
+          <w:sz w:val="24"/>
+          <w:szCs w:val="22"/>
+        </w:rPr>
+        <w:t>@BeforeTest</w:t>
+      </w:r>
+    </w:p>
+    <w:p>
+      <w:pPr>
+        <w:pStyle w:val="ListParagraph"/>
+        <w:numPr>
+          <w:ilvl w:val="1"/>
+          <w:numId w:val="28"/>
+        </w:numPr>
+        <w:rPr>
+          <w:sz w:val="24"/>
+          <w:szCs w:val="22"/>
+        </w:rPr>
+      </w:pPr>
+      <w:r>
+        <w:rPr>
+          <w:sz w:val="24"/>
+          <w:szCs w:val="22"/>
+        </w:rPr>
+        <w:t>@AfterTest</w:t>
+      </w:r>
+    </w:p>
+    <w:p>
+      <w:pPr>
+        <w:pStyle w:val="ListParagraph"/>
+        <w:numPr>
+          <w:ilvl w:val="1"/>
+          <w:numId w:val="28"/>
+        </w:numPr>
+        <w:rPr>
+          <w:sz w:val="24"/>
+          <w:szCs w:val="22"/>
+        </w:rPr>
+      </w:pPr>
+      <w:r>
+        <w:rPr>
+          <w:sz w:val="24"/>
+          <w:szCs w:val="22"/>
+        </w:rPr>
+        <w:t>@BeforeMethod</w:t>
+      </w:r>
+    </w:p>
+    <w:p>
+      <w:pPr>
+        <w:pStyle w:val="ListParagraph"/>
+        <w:numPr>
+          <w:ilvl w:val="1"/>
+          <w:numId w:val="28"/>
+        </w:numPr>
+        <w:rPr>
+          <w:sz w:val="24"/>
+          <w:szCs w:val="22"/>
+        </w:rPr>
+      </w:pPr>
+      <w:r>
+        <w:rPr>
+          <w:sz w:val="24"/>
+          <w:szCs w:val="22"/>
+        </w:rPr>
+        <w:t>@AfterMethod</w:t>
+      </w:r>
+    </w:p>
+    <w:p>
+      <w:pPr>
+        <w:pStyle w:val="ListParagraph"/>
+        <w:numPr>
+          <w:ilvl w:val="1"/>
+          <w:numId w:val="28"/>
+        </w:numPr>
+        <w:rPr>
+          <w:sz w:val="24"/>
+          <w:szCs w:val="22"/>
+        </w:rPr>
+      </w:pPr>
+      <w:r>
+        <w:rPr>
+          <w:sz w:val="24"/>
+          <w:szCs w:val="22"/>
+        </w:rPr>
+        <w:t>@DataProvider</w:t>
+      </w:r>
+    </w:p>
+    <w:p>
+      <w:pPr>
+        <w:pStyle w:val="ListParagraph"/>
+        <w:numPr>
+          <w:ilvl w:val="1"/>
+          <w:numId w:val="28"/>
+        </w:numPr>
+        <w:rPr>
+          <w:sz w:val="24"/>
+          <w:szCs w:val="22"/>
+        </w:rPr>
+      </w:pPr>
+      <w:r>
+        <w:rPr>
+          <w:sz w:val="24"/>
+          <w:szCs w:val="22"/>
+        </w:rPr>
+        <w:t>@Parameters</w:t>
+      </w:r>
+    </w:p>
+    <w:p>
+      <w:pPr>
+        <w:pStyle w:val="ListParagraph"/>
+        <w:numPr>
+          <w:ilvl w:val="0"/>
+          <w:numId w:val="28"/>
+        </w:numPr>
+        <w:rPr>
+          <w:sz w:val="24"/>
+          <w:szCs w:val="22"/>
+        </w:rPr>
+      </w:pPr>
+      <w:r>
+        <w:rPr>
+          <w:sz w:val="24"/>
+          <w:szCs w:val="22"/>
+        </w:rPr>
+        <w:t>Data Driven Testing using @DataProvider</w:t>
+      </w:r>
+    </w:p>
+    <w:p>
+      <w:pPr>
+        <w:pStyle w:val="ListParagraph"/>
+        <w:numPr>
+          <w:ilvl w:val="0"/>
+          <w:numId w:val="28"/>
+        </w:numPr>
+        <w:rPr>
+          <w:sz w:val="24"/>
+          <w:szCs w:val="22"/>
+        </w:rPr>
+      </w:pPr>
+      <w:r>
+        <w:rPr>
+          <w:sz w:val="24"/>
+          <w:szCs w:val="22"/>
+        </w:rPr>
+        <w:t>Allows Parameterization</w:t>
+      </w:r>
+    </w:p>
+    <w:p>
+      <w:pPr>
+        <w:pStyle w:val="ListParagraph"/>
+        <w:numPr>
+          <w:ilvl w:val="0"/>
+          <w:numId w:val="28"/>
+        </w:numPr>
+        <w:rPr>
+          <w:sz w:val="24"/>
+          <w:szCs w:val="22"/>
+        </w:rPr>
+      </w:pPr>
+      <w:r>
+        <w:rPr>
+          <w:sz w:val="24"/>
+          <w:szCs w:val="22"/>
+        </w:rPr>
+        <w:t>Allows to implement multiple frameworks</w:t>
+      </w:r>
+    </w:p>
+    <w:p>
+      <w:pPr>
+        <w:pStyle w:val="ListParagraph"/>
+        <w:numPr>
+          <w:ilvl w:val="1"/>
+          <w:numId w:val="28"/>
+        </w:numPr>
+        <w:rPr>
+          <w:sz w:val="24"/>
+          <w:szCs w:val="22"/>
+        </w:rPr>
+      </w:pPr>
+      <w:r>
+        <w:rPr>
+          <w:sz w:val="24"/>
+          <w:szCs w:val="22"/>
+        </w:rPr>
+        <w:t>Linear Framework</w:t>
+      </w:r>
+    </w:p>
+    <w:p>
+      <w:pPr>
+        <w:pStyle w:val="ListParagraph"/>
+        <w:numPr>
+          <w:ilvl w:val="1"/>
+          <w:numId w:val="28"/>
+        </w:numPr>
+        <w:rPr>
+          <w:sz w:val="24"/>
+          <w:szCs w:val="22"/>
+        </w:rPr>
+      </w:pPr>
+      <w:r>
+        <w:rPr>
+          <w:sz w:val="24"/>
+          <w:szCs w:val="22"/>
+        </w:rPr>
+        <w:t>Keyword Driven Framework</w:t>
+      </w:r>
+    </w:p>
+    <w:p>
+      <w:pPr>
+        <w:pStyle w:val="ListParagraph"/>
+        <w:numPr>
+          <w:ilvl w:val="1"/>
+          <w:numId w:val="28"/>
+        </w:numPr>
+        <w:rPr>
+          <w:sz w:val="24"/>
+          <w:szCs w:val="22"/>
+        </w:rPr>
+      </w:pPr>
+      <w:r>
+        <w:rPr>
+          <w:sz w:val="24"/>
+          <w:szCs w:val="22"/>
+        </w:rPr>
+        <w:t>Page Object Model (POM)</w:t>
+      </w:r>
+    </w:p>
+    <w:p>
+      <w:pPr>
+        <w:pStyle w:val="ListParagraph"/>
+        <w:numPr>
+          <w:ilvl w:val="1"/>
+          <w:numId w:val="28"/>
+        </w:numPr>
+        <w:rPr>
+          <w:sz w:val="24"/>
+          <w:szCs w:val="22"/>
+        </w:rPr>
+      </w:pPr>
+      <w:r>
+        <w:rPr>
+          <w:sz w:val="24"/>
+          <w:szCs w:val="22"/>
+        </w:rPr>
+        <w:t>Data Driven Framework</w:t>
+      </w:r>
+    </w:p>
+    <w:p>
+      <w:pPr>
+        <w:pStyle w:val="ListParagraph"/>
+        <w:numPr>
+          <w:ilvl w:val="1"/>
+          <w:numId w:val="28"/>
+        </w:numPr>
+        <w:rPr>
+          <w:sz w:val="24"/>
+          <w:szCs w:val="22"/>
+        </w:rPr>
+      </w:pPr>
+      <w:r>
+        <w:rPr>
+          <w:sz w:val="24"/>
+          <w:szCs w:val="22"/>
+        </w:rPr>
+        <w:t>Hybrid Framework</w:t>
+      </w:r>
+    </w:p>
+    <w:p>
+      <w:pPr>
+        <w:rPr>
+          <w:sz w:val="24"/>
+          <w:szCs w:val="22"/>
+        </w:rPr>
+      </w:pPr>
+    </w:p>
+    <w:p>
+      <w:pPr>
+        <w:rPr>
+          <w:b/>
+          <w:bCs/>
+          <w:sz w:val="24"/>
+          <w:szCs w:val="22"/>
+        </w:rPr>
+      </w:pPr>
+      <w:r>
+        <w:rPr>
+          <w:b/>
+          <w:bCs/>
+          <w:sz w:val="24"/>
+          <w:szCs w:val="22"/>
+        </w:rPr>
+        <w:t>Annotations</w:t>
+      </w:r>
+    </w:p>
+    <w:p>
+      <w:pPr>
+        <w:pStyle w:val="ListParagraph"/>
+        <w:numPr>
+          <w:ilvl w:val="0"/>
+          <w:numId w:val="30"/>
+        </w:numPr>
+        <w:rPr>
+          <w:sz w:val="24"/>
+          <w:szCs w:val="22"/>
+        </w:rPr>
+      </w:pPr>
+      <w:r>
+        <w:rPr>
+          <w:sz w:val="24"/>
+          <w:szCs w:val="22"/>
+        </w:rPr>
+        <w:t xml:space="preserve">@Test </w:t>
+      </w:r>
+      <w:r>
+        <w:rPr>
+          <w:sz w:val="24"/>
+          <w:szCs w:val="22"/>
+        </w:rPr>
+        <w:sym w:font="Wingdings" w:char="F0E0"/>
+      </w:r>
+      <w:r>
+        <w:rPr>
+          <w:sz w:val="24"/>
+          <w:szCs w:val="22"/>
+        </w:rPr>
+        <w:t xml:space="preserve"> This method is treated as Test Case</w:t>
+      </w:r>
+    </w:p>
+    <w:p>
+      <w:pPr>
+        <w:pStyle w:val="ListParagraph"/>
+        <w:numPr>
+          <w:ilvl w:val="0"/>
+          <w:numId w:val="30"/>
+        </w:numPr>
+        <w:rPr>
+          <w:sz w:val="24"/>
+          <w:szCs w:val="22"/>
+        </w:rPr>
+      </w:pPr>
+      <w:r>
+        <w:rPr>
+          <w:sz w:val="24"/>
+          <w:szCs w:val="22"/>
+        </w:rPr>
+        <w:t xml:space="preserve">@BeforeTest </w:t>
+      </w:r>
+      <w:r>
+        <w:rPr>
+          <w:sz w:val="24"/>
+          <w:szCs w:val="22"/>
+        </w:rPr>
+        <w:sym w:font="Wingdings" w:char="F0E0"/>
+      </w:r>
+      <w:r>
+        <w:rPr>
+          <w:sz w:val="24"/>
+          <w:szCs w:val="22"/>
+        </w:rPr>
+        <w:t xml:space="preserve"> This is the method that will get executed </w:t>
+      </w:r>
+      <w:r>
+        <w:rPr>
+          <w:b/>
+          <w:bCs/>
+          <w:sz w:val="24"/>
+          <w:szCs w:val="22"/>
+        </w:rPr>
+        <w:t>only once before executing 1</w:t>
+      </w:r>
+      <w:r>
+        <w:rPr>
+          <w:b/>
+          <w:bCs/>
+          <w:sz w:val="24"/>
+          <w:szCs w:val="22"/>
+          <w:vertAlign w:val="superscript"/>
+        </w:rPr>
+        <w:t>st</w:t>
+      </w:r>
+      <w:r>
+        <w:rPr>
+          <w:b/>
+          <w:bCs/>
+          <w:sz w:val="24"/>
+          <w:szCs w:val="22"/>
+        </w:rPr>
+        <w:t xml:space="preserve"> test case</w:t>
+      </w:r>
+    </w:p>
+    <w:p>
+      <w:pPr>
+        <w:pStyle w:val="ListParagraph"/>
+        <w:numPr>
+          <w:ilvl w:val="0"/>
+          <w:numId w:val="30"/>
+        </w:numPr>
+        <w:rPr>
+          <w:sz w:val="24"/>
+          <w:szCs w:val="22"/>
+        </w:rPr>
+      </w:pPr>
+      <w:r>
+        <w:rPr>
+          <w:sz w:val="24"/>
+          <w:szCs w:val="22"/>
+        </w:rPr>
+        <w:t xml:space="preserve">@AfterTest </w:t>
+      </w:r>
+      <w:r>
+        <w:rPr>
+          <w:sz w:val="24"/>
+          <w:szCs w:val="22"/>
+        </w:rPr>
+        <w:sym w:font="Wingdings" w:char="F0E0"/>
+      </w:r>
+      <w:r>
+        <w:rPr>
+          <w:sz w:val="24"/>
+          <w:szCs w:val="22"/>
+        </w:rPr>
+        <w:t xml:space="preserve"> This is the method that will get executed </w:t>
+      </w:r>
+      <w:r>
+        <w:rPr>
+          <w:b/>
+          <w:bCs/>
+          <w:sz w:val="24"/>
+          <w:szCs w:val="22"/>
+        </w:rPr>
+        <w:t>only once after executing last test case.</w:t>
+      </w:r>
+    </w:p>
+    <w:p>
+      <w:pPr>
+        <w:pStyle w:val="ListParagraph"/>
+        <w:numPr>
+          <w:ilvl w:val="0"/>
+          <w:numId w:val="30"/>
+        </w:numPr>
+        <w:rPr>
+          <w:sz w:val="24"/>
+          <w:szCs w:val="22"/>
+        </w:rPr>
+      </w:pPr>
+      <w:r>
+        <w:rPr>
+          <w:sz w:val="24"/>
+          <w:szCs w:val="22"/>
+        </w:rPr>
+        <w:t xml:space="preserve">@BeforeMethod </w:t>
+      </w:r>
+      <w:r>
+        <w:rPr>
+          <w:sz w:val="24"/>
+          <w:szCs w:val="22"/>
+        </w:rPr>
+        <w:sym w:font="Wingdings" w:char="F0E0"/>
+      </w:r>
+      <w:r>
+        <w:rPr>
+          <w:sz w:val="24"/>
+          <w:szCs w:val="22"/>
+        </w:rPr>
+        <w:t xml:space="preserve"> This is the method that will get executed </w:t>
+      </w:r>
+      <w:r>
+        <w:rPr>
+          <w:b/>
+          <w:bCs/>
+          <w:sz w:val="24"/>
+          <w:szCs w:val="22"/>
+        </w:rPr>
+        <w:t>before every test case</w:t>
+      </w:r>
+    </w:p>
+    <w:p>
+      <w:pPr>
+        <w:pStyle w:val="ListParagraph"/>
+        <w:numPr>
+          <w:ilvl w:val="0"/>
+          <w:numId w:val="30"/>
+        </w:numPr>
+        <w:rPr>
+          <w:sz w:val="24"/>
+          <w:szCs w:val="22"/>
+        </w:rPr>
+      </w:pPr>
+      <w:r>
+        <w:rPr>
+          <w:sz w:val="24"/>
+          <w:szCs w:val="22"/>
+        </w:rPr>
+        <w:t xml:space="preserve">@AfterMethod </w:t>
+      </w:r>
+      <w:r>
+        <w:rPr>
+          <w:sz w:val="24"/>
+          <w:szCs w:val="22"/>
+        </w:rPr>
+        <w:sym w:font="Wingdings" w:char="F0E0"/>
+      </w:r>
+      <w:r>
+        <w:rPr>
+          <w:sz w:val="24"/>
+          <w:szCs w:val="22"/>
+        </w:rPr>
+        <w:t xml:space="preserve"> This is the method that will get executed </w:t>
+      </w:r>
+      <w:r>
+        <w:rPr>
+          <w:b/>
+          <w:bCs/>
+          <w:sz w:val="24"/>
+          <w:szCs w:val="22"/>
+        </w:rPr>
+        <w:t>after every test case</w:t>
+      </w:r>
+    </w:p>
+    <w:p>
+      <w:pPr>
+        <w:rPr>
+          <w:sz w:val="24"/>
+          <w:szCs w:val="22"/>
+        </w:rPr>
+      </w:pPr>
+    </w:p>
+    <w:p>
+      <w:pPr>
+        <w:rPr>
+          <w:sz w:val="24"/>
+          <w:szCs w:val="22"/>
+        </w:rPr>
+      </w:pPr>
+      <w:r>
+        <w:rPr>
+          <w:sz w:val="24"/>
+          <w:szCs w:val="22"/>
+        </w:rPr>
+        <w:t>BeforeTest</w:t>
+      </w:r>
+    </w:p>
+    <w:p>
+      <w:pPr>
+        <w:rPr>
+          <w:sz w:val="24"/>
+          <w:szCs w:val="22"/>
+        </w:rPr>
+      </w:pPr>
+      <w:r>
+        <w:rPr>
+          <w:sz w:val="24"/>
+          <w:szCs w:val="22"/>
+        </w:rPr>
+        <w:tab/>
+      </w:r>
+      <w:r>
+        <w:rPr>
+          <w:sz w:val="24"/>
+          <w:szCs w:val="22"/>
+        </w:rPr>
+        <w:t>BeforeMethod</w:t>
+      </w:r>
+    </w:p>
+    <w:p>
+      <w:pPr>
+        <w:rPr>
+          <w:sz w:val="24"/>
+          <w:szCs w:val="22"/>
+        </w:rPr>
+      </w:pPr>
+      <w:r>
+        <w:rPr>
+          <w:sz w:val="24"/>
+          <w:szCs w:val="22"/>
+        </w:rPr>
+        <w:tab/>
+      </w:r>
+      <w:r>
+        <w:rPr>
+          <w:sz w:val="24"/>
+          <w:szCs w:val="22"/>
+        </w:rPr>
+        <w:tab/>
+        <w:t>Test 1</w:t>
+      </w:r>
+    </w:p>
+    <w:p>
+      <w:pPr>
+        <w:rPr>
+          <w:sz w:val="24"/>
+          <w:szCs w:val="22"/>
+        </w:rPr>
+      </w:pPr>
+      <w:r>
+        <w:rPr>
+          <w:sz w:val="24"/>
+          <w:szCs w:val="22"/>
+        </w:rPr>
+        <w:tab/>
+        <w:t>AfterMethod</w:t>
+      </w:r>
+    </w:p>
+    <w:p>
+      <w:pPr>
+        <w:rPr>
+          <w:sz w:val="24"/>
+          <w:szCs w:val="22"/>
+        </w:rPr>
+      </w:pPr>
+      <w:r>
+        <w:rPr>
+          <w:sz w:val="24"/>
+          <w:szCs w:val="22"/>
+        </w:rPr>
+        <w:tab/>
+        <w:t>BeforeMethod</w:t>
+      </w:r>
+    </w:p>
+    <w:p>
+      <w:pPr>
+        <w:rPr>
+          <w:sz w:val="24"/>
+          <w:szCs w:val="22"/>
+        </w:rPr>
+      </w:pPr>
+      <w:r>
+        <w:rPr>
+          <w:sz w:val="24"/>
+          <w:szCs w:val="22"/>
+        </w:rPr>
+        <w:tab/>
+      </w:r>
+      <w:r>
+        <w:rPr>
+          <w:sz w:val="24"/>
+          <w:szCs w:val="22"/>
+        </w:rPr>
+        <w:tab/>
+      </w:r>
+      <w:r>
+        <w:rPr>
+          <w:sz w:val="24"/>
+          <w:szCs w:val="22"/>
+        </w:rPr>
+        <w:t>Test 2</w:t>
+      </w:r>
+    </w:p>
+    <w:p>
+      <w:pPr>
+        <w:rPr>
+          <w:sz w:val="24"/>
+          <w:szCs w:val="22"/>
+        </w:rPr>
+      </w:pPr>
+      <w:r>
+        <w:rPr>
+          <w:sz w:val="24"/>
+          <w:szCs w:val="22"/>
+        </w:rPr>
+        <w:tab/>
+        <w:t>AfterMethod</w:t>
+      </w:r>
+    </w:p>
+    <w:p>
+      <w:pPr>
+        <w:rPr>
+          <w:sz w:val="24"/>
+          <w:szCs w:val="22"/>
+        </w:rPr>
+      </w:pPr>
+      <w:r>
+        <w:rPr>
+          <w:sz w:val="24"/>
+          <w:szCs w:val="22"/>
+        </w:rPr>
+        <w:tab/>
+        <w:t>BeforeMethod</w:t>
+      </w:r>
+    </w:p>
+    <w:p>
+      <w:pPr>
+        <w:rPr>
+          <w:sz w:val="24"/>
+          <w:szCs w:val="22"/>
+        </w:rPr>
+      </w:pPr>
+      <w:r>
+        <w:rPr>
+          <w:sz w:val="24"/>
+          <w:szCs w:val="22"/>
+        </w:rPr>
+        <w:tab/>
+      </w:r>
+      <w:r>
+        <w:rPr>
+          <w:sz w:val="24"/>
+          <w:szCs w:val="22"/>
+        </w:rPr>
+        <w:tab/>
+        <w:t>Test 3</w:t>
+      </w:r>
+    </w:p>
+    <w:p>
+      <w:pPr>
+        <w:rPr>
+          <w:sz w:val="24"/>
+          <w:szCs w:val="22"/>
+        </w:rPr>
+      </w:pPr>
+      <w:r>
+        <w:rPr>
+          <w:sz w:val="24"/>
+          <w:szCs w:val="22"/>
+        </w:rPr>
+        <w:tab/>
+        <w:t>AfterMethod</w:t>
+      </w:r>
+    </w:p>
+    <w:p>
+      <w:pPr>
+        <w:rPr>
+          <w:sz w:val="24"/>
+          <w:szCs w:val="22"/>
+        </w:rPr>
+      </w:pPr>
+      <w:r>
+        <w:rPr>
+          <w:sz w:val="24"/>
+          <w:szCs w:val="22"/>
+        </w:rPr>
+        <w:tab/>
+        <w:t>BeforeMethod</w:t>
+      </w:r>
+    </w:p>
+    <w:p>
+      <w:pPr>
+        <w:rPr>
+          <w:sz w:val="24"/>
+          <w:szCs w:val="22"/>
+        </w:rPr>
+      </w:pPr>
+      <w:r>
+        <w:rPr>
+          <w:sz w:val="24"/>
+          <w:szCs w:val="22"/>
+        </w:rPr>
+        <w:tab/>
+      </w:r>
+      <w:r>
+        <w:rPr>
+          <w:sz w:val="24"/>
+          <w:szCs w:val="22"/>
+        </w:rPr>
+        <w:tab/>
+        <w:t>Test 4</w:t>
+      </w:r>
+    </w:p>
+    <w:p>
+      <w:pPr>
+        <w:rPr>
+          <w:sz w:val="24"/>
+          <w:szCs w:val="22"/>
+        </w:rPr>
+      </w:pPr>
+      <w:r>
+        <w:rPr>
+          <w:sz w:val="24"/>
+          <w:szCs w:val="22"/>
+        </w:rPr>
+        <w:tab/>
+        <w:t>AfterMethod</w:t>
+      </w:r>
       <w:bookmarkStart w:id="0" w:name="_GoBack"/>
       <w:bookmarkEnd w:id="0"/>
+    </w:p>
+    <w:p>
+      <w:pPr>
+        <w:rPr>
+          <w:sz w:val="24"/>
+          <w:szCs w:val="22"/>
+        </w:rPr>
+      </w:pPr>
+      <w:r>
+        <w:rPr>
+          <w:sz w:val="24"/>
+          <w:szCs w:val="22"/>
+        </w:rPr>
+        <w:t>AfterTest</w:t>
+      </w:r>
+    </w:p>
+    <w:p>
+      <w:pPr>
+        <w:rPr>
+          <w:sz w:val="24"/>
+          <w:szCs w:val="22"/>
+        </w:rPr>
+      </w:pPr>
+    </w:p>
+    <w:p>
+      <w:pPr>
+        <w:rPr>
+          <w:b/>
+          <w:bCs/>
+          <w:sz w:val="24"/>
+          <w:szCs w:val="22"/>
+        </w:rPr>
+      </w:pPr>
+      <w:r>
+        <w:rPr>
+          <w:b/>
+          <w:bCs/>
+          <w:sz w:val="24"/>
+          <w:szCs w:val="22"/>
+        </w:rPr>
+        <w:t>Points to be noted about configuration methods.</w:t>
+      </w:r>
+    </w:p>
+    <w:p>
+      <w:pPr>
+        <w:pStyle w:val="ListParagraph"/>
+        <w:numPr>
+          <w:ilvl w:val="0"/>
+          <w:numId w:val="31"/>
+        </w:numPr>
+        <w:rPr>
+          <w:sz w:val="24"/>
+          <w:szCs w:val="22"/>
+        </w:rPr>
+      </w:pPr>
+      <w:r>
+        <w:rPr>
+          <w:sz w:val="24"/>
+          <w:szCs w:val="22"/>
+        </w:rPr>
+        <w:t>They can appear anywhere in the class</w:t>
+      </w:r>
+    </w:p>
+    <w:p>
+      <w:pPr>
+        <w:pStyle w:val="ListParagraph"/>
+        <w:numPr>
+          <w:ilvl w:val="0"/>
+          <w:numId w:val="31"/>
+        </w:numPr>
+        <w:rPr>
+          <w:sz w:val="24"/>
+          <w:szCs w:val="22"/>
+        </w:rPr>
+      </w:pPr>
+      <w:r>
+        <w:rPr>
+          <w:sz w:val="24"/>
+          <w:szCs w:val="22"/>
+        </w:rPr>
+        <w:t>They need not to be in pair.</w:t>
+      </w:r>
     </w:p>
     <w:sectPr>
       <w:pgSz w:w="11906" w:h="16838"/>
@@ -9367,6 +11125,95 @@
     </w:lvl>
   </w:abstractNum>
   <w:abstractNum w:abstractNumId="2">
+    <w:nsid w:val="09EE30C6"/>
+    <w:multiLevelType w:val="hybridMultilevel"/>
+    <w:tmpl w:val="36C8F218"/>
+    <w:lvl w:ilvl="0" w:tplc="4009000F">
+      <w:start w:val="1"/>
+      <w:numFmt w:val="decimal"/>
+      <w:lvlText w:val="%1."/>
+      <w:lvlJc w:val="left"/>
+      <w:pPr>
+        <w:ind w:left="720" w:hanging="360"/>
+      </w:pPr>
+      <w:rPr>
+        <w:rFonts w:hint="default"/>
+      </w:rPr>
+    </w:lvl>
+    <w:lvl w:ilvl="1" w:tplc="40090019" w:tentative="1">
+      <w:start w:val="1"/>
+      <w:numFmt w:val="lowerLetter"/>
+      <w:lvlText w:val="%2."/>
+      <w:lvlJc w:val="left"/>
+      <w:pPr>
+        <w:ind w:left="1440" w:hanging="360"/>
+      </w:pPr>
+    </w:lvl>
+    <w:lvl w:ilvl="2" w:tplc="4009001B" w:tentative="1">
+      <w:start w:val="1"/>
+      <w:numFmt w:val="lowerRoman"/>
+      <w:lvlText w:val="%3."/>
+      <w:lvlJc w:val="right"/>
+      <w:pPr>
+        <w:ind w:left="2160" w:hanging="180"/>
+      </w:pPr>
+    </w:lvl>
+    <w:lvl w:ilvl="3" w:tplc="4009000F" w:tentative="1">
+      <w:start w:val="1"/>
+      <w:numFmt w:val="decimal"/>
+      <w:lvlText w:val="%4."/>
+      <w:lvlJc w:val="left"/>
+      <w:pPr>
+        <w:ind w:left="2880" w:hanging="360"/>
+      </w:pPr>
+    </w:lvl>
+    <w:lvl w:ilvl="4" w:tplc="40090019" w:tentative="1">
+      <w:start w:val="1"/>
+      <w:numFmt w:val="lowerLetter"/>
+      <w:lvlText w:val="%5."/>
+      <w:lvlJc w:val="left"/>
+      <w:pPr>
+        <w:ind w:left="3600" w:hanging="360"/>
+      </w:pPr>
+    </w:lvl>
+    <w:lvl w:ilvl="5" w:tplc="4009001B" w:tentative="1">
+      <w:start w:val="1"/>
+      <w:numFmt w:val="lowerRoman"/>
+      <w:lvlText w:val="%6."/>
+      <w:lvlJc w:val="right"/>
+      <w:pPr>
+        <w:ind w:left="4320" w:hanging="180"/>
+      </w:pPr>
+    </w:lvl>
+    <w:lvl w:ilvl="6" w:tplc="4009000F" w:tentative="1">
+      <w:start w:val="1"/>
+      <w:numFmt w:val="decimal"/>
+      <w:lvlText w:val="%7."/>
+      <w:lvlJc w:val="left"/>
+      <w:pPr>
+        <w:ind w:left="5040" w:hanging="360"/>
+      </w:pPr>
+    </w:lvl>
+    <w:lvl w:ilvl="7" w:tplc="40090019" w:tentative="1">
+      <w:start w:val="1"/>
+      <w:numFmt w:val="lowerLetter"/>
+      <w:lvlText w:val="%8."/>
+      <w:lvlJc w:val="left"/>
+      <w:pPr>
+        <w:ind w:left="5760" w:hanging="360"/>
+      </w:pPr>
+    </w:lvl>
+    <w:lvl w:ilvl="8" w:tplc="4009001B" w:tentative="1">
+      <w:start w:val="1"/>
+      <w:numFmt w:val="lowerRoman"/>
+      <w:lvlText w:val="%9."/>
+      <w:lvlJc w:val="right"/>
+      <w:pPr>
+        <w:ind w:left="6480" w:hanging="180"/>
+      </w:pPr>
+    </w:lvl>
+  </w:abstractNum>
+  <w:abstractNum w:abstractNumId="3">
     <w:nsid w:val="0F571F41"/>
     <w:multiLevelType w:val="hybridMultilevel"/>
     <w:tmpl w:val="5036BC26"/>
@@ -9455,7 +11302,7 @@
       </w:pPr>
     </w:lvl>
   </w:abstractNum>
-  <w:abstractNum w:abstractNumId="3">
+  <w:abstractNum w:abstractNumId="4">
     <w:nsid w:val="101C421F"/>
     <w:multiLevelType w:val="hybridMultilevel"/>
     <w:tmpl w:val="E8023388"/>
@@ -9544,7 +11391,7 @@
       </w:pPr>
     </w:lvl>
   </w:abstractNum>
-  <w:abstractNum w:abstractNumId="4">
+  <w:abstractNum w:abstractNumId="5">
     <w:nsid w:val="20231B0F"/>
     <w:multiLevelType w:val="hybridMultilevel"/>
     <w:tmpl w:val="8B444104"/>
@@ -9657,7 +11504,7 @@
       </w:rPr>
     </w:lvl>
   </w:abstractNum>
-  <w:abstractNum w:abstractNumId="5">
+  <w:abstractNum w:abstractNumId="6">
     <w:nsid w:val="2AD0394C"/>
     <w:multiLevelType w:val="hybridMultilevel"/>
     <w:tmpl w:val="A36CD096"/>
@@ -9770,7 +11617,7 @@
       </w:rPr>
     </w:lvl>
   </w:abstractNum>
-  <w:abstractNum w:abstractNumId="6">
+  <w:abstractNum w:abstractNumId="7">
     <w:nsid w:val="2AD16229"/>
     <w:multiLevelType w:val="hybridMultilevel"/>
     <w:tmpl w:val="C5364E86"/>
@@ -9859,7 +11706,7 @@
       </w:pPr>
     </w:lvl>
   </w:abstractNum>
-  <w:abstractNum w:abstractNumId="7">
+  <w:abstractNum w:abstractNumId="8">
     <w:nsid w:val="2AF0639C"/>
     <w:multiLevelType w:val="hybridMultilevel"/>
     <w:tmpl w:val="54A22318"/>
@@ -9945,7 +11792,96 @@
       </w:pPr>
     </w:lvl>
   </w:abstractNum>
-  <w:abstractNum w:abstractNumId="8">
+  <w:abstractNum w:abstractNumId="9">
+    <w:nsid w:val="2EEE2462"/>
+    <w:multiLevelType w:val="hybridMultilevel"/>
+    <w:tmpl w:val="1FFC74BE"/>
+    <w:lvl w:ilvl="0" w:tplc="4009000F">
+      <w:start w:val="1"/>
+      <w:numFmt w:val="decimal"/>
+      <w:lvlText w:val="%1."/>
+      <w:lvlJc w:val="left"/>
+      <w:pPr>
+        <w:ind w:left="720" w:hanging="360"/>
+      </w:pPr>
+      <w:rPr>
+        <w:rFonts w:hint="default"/>
+      </w:rPr>
+    </w:lvl>
+    <w:lvl w:ilvl="1" w:tplc="40090019" w:tentative="1">
+      <w:start w:val="1"/>
+      <w:numFmt w:val="lowerLetter"/>
+      <w:lvlText w:val="%2."/>
+      <w:lvlJc w:val="left"/>
+      <w:pPr>
+        <w:ind w:left="1440" w:hanging="360"/>
+      </w:pPr>
+    </w:lvl>
+    <w:lvl w:ilvl="2" w:tplc="4009001B" w:tentative="1">
+      <w:start w:val="1"/>
+      <w:numFmt w:val="lowerRoman"/>
+      <w:lvlText w:val="%3."/>
+      <w:lvlJc w:val="right"/>
+      <w:pPr>
+        <w:ind w:left="2160" w:hanging="180"/>
+      </w:pPr>
+    </w:lvl>
+    <w:lvl w:ilvl="3" w:tplc="4009000F" w:tentative="1">
+      <w:start w:val="1"/>
+      <w:numFmt w:val="decimal"/>
+      <w:lvlText w:val="%4."/>
+      <w:lvlJc w:val="left"/>
+      <w:pPr>
+        <w:ind w:left="2880" w:hanging="360"/>
+      </w:pPr>
+    </w:lvl>
+    <w:lvl w:ilvl="4" w:tplc="40090019" w:tentative="1">
+      <w:start w:val="1"/>
+      <w:numFmt w:val="lowerLetter"/>
+      <w:lvlText w:val="%5."/>
+      <w:lvlJc w:val="left"/>
+      <w:pPr>
+        <w:ind w:left="3600" w:hanging="360"/>
+      </w:pPr>
+    </w:lvl>
+    <w:lvl w:ilvl="5" w:tplc="4009001B" w:tentative="1">
+      <w:start w:val="1"/>
+      <w:numFmt w:val="lowerRoman"/>
+      <w:lvlText w:val="%6."/>
+      <w:lvlJc w:val="right"/>
+      <w:pPr>
+        <w:ind w:left="4320" w:hanging="180"/>
+      </w:pPr>
+    </w:lvl>
+    <w:lvl w:ilvl="6" w:tplc="4009000F" w:tentative="1">
+      <w:start w:val="1"/>
+      <w:numFmt w:val="decimal"/>
+      <w:lvlText w:val="%7."/>
+      <w:lvlJc w:val="left"/>
+      <w:pPr>
+        <w:ind w:left="5040" w:hanging="360"/>
+      </w:pPr>
+    </w:lvl>
+    <w:lvl w:ilvl="7" w:tplc="40090019" w:tentative="1">
+      <w:start w:val="1"/>
+      <w:numFmt w:val="lowerLetter"/>
+      <w:lvlText w:val="%8."/>
+      <w:lvlJc w:val="left"/>
+      <w:pPr>
+        <w:ind w:left="5760" w:hanging="360"/>
+      </w:pPr>
+    </w:lvl>
+    <w:lvl w:ilvl="8" w:tplc="4009001B" w:tentative="1">
+      <w:start w:val="1"/>
+      <w:numFmt w:val="lowerRoman"/>
+      <w:lvlText w:val="%9."/>
+      <w:lvlJc w:val="right"/>
+      <w:pPr>
+        <w:ind w:left="6480" w:hanging="180"/>
+      </w:pPr>
+    </w:lvl>
+  </w:abstractNum>
+  <w:abstractNum w:abstractNumId="10">
     <w:nsid w:val="333F2421"/>
     <w:multiLevelType w:val="hybridMultilevel"/>
     <w:tmpl w:val="85128FF8"/>
@@ -10058,7 +11994,7 @@
       </w:rPr>
     </w:lvl>
   </w:abstractNum>
-  <w:abstractNum w:abstractNumId="9">
+  <w:abstractNum w:abstractNumId="11">
     <w:nsid w:val="335B6CD0"/>
     <w:multiLevelType w:val="hybridMultilevel"/>
     <w:tmpl w:val="B8EA9D4C"/>
@@ -10147,7 +12083,7 @@
       </w:pPr>
     </w:lvl>
   </w:abstractNum>
-  <w:abstractNum w:abstractNumId="10">
+  <w:abstractNum w:abstractNumId="12">
     <w:nsid w:val="34DF0944"/>
     <w:multiLevelType w:val="hybridMultilevel"/>
     <w:tmpl w:val="5C885224"/>
@@ -10236,7 +12172,120 @@
       </w:pPr>
     </w:lvl>
   </w:abstractNum>
-  <w:abstractNum w:abstractNumId="11">
+  <w:abstractNum w:abstractNumId="13">
+    <w:nsid w:val="35124045"/>
+    <w:multiLevelType w:val="hybridMultilevel"/>
+    <w:tmpl w:val="9B08084E"/>
+    <w:lvl w:ilvl="0" w:tplc="40090001">
+      <w:start w:val="1"/>
+      <w:numFmt w:val="bullet"/>
+      <w:lvlText w:val=""/>
+      <w:lvlJc w:val="left"/>
+      <w:pPr>
+        <w:ind w:left="720" w:hanging="360"/>
+      </w:pPr>
+      <w:rPr>
+        <w:rFonts w:ascii="Symbol" w:hAnsi="Symbol" w:hint="default"/>
+      </w:rPr>
+    </w:lvl>
+    <w:lvl w:ilvl="1" w:tplc="40090003">
+      <w:start w:val="1"/>
+      <w:numFmt w:val="bullet"/>
+      <w:lvlText w:val="o"/>
+      <w:lvlJc w:val="left"/>
+      <w:pPr>
+        <w:ind w:left="1440" w:hanging="360"/>
+      </w:pPr>
+      <w:rPr>
+        <w:rFonts w:ascii="Courier New" w:hAnsi="Courier New" w:cs="Courier New" w:hint="default"/>
+      </w:rPr>
+    </w:lvl>
+    <w:lvl w:ilvl="2" w:tplc="40090005" w:tentative="1">
+      <w:start w:val="1"/>
+      <w:numFmt w:val="bullet"/>
+      <w:lvlText w:val=""/>
+      <w:lvlJc w:val="left"/>
+      <w:pPr>
+        <w:ind w:left="2160" w:hanging="360"/>
+      </w:pPr>
+      <w:rPr>
+        <w:rFonts w:ascii="Wingdings" w:hAnsi="Wingdings" w:hint="default"/>
+      </w:rPr>
+    </w:lvl>
+    <w:lvl w:ilvl="3" w:tplc="40090001" w:tentative="1">
+      <w:start w:val="1"/>
+      <w:numFmt w:val="bullet"/>
+      <w:lvlText w:val=""/>
+      <w:lvlJc w:val="left"/>
+      <w:pPr>
+        <w:ind w:left="2880" w:hanging="360"/>
+      </w:pPr>
+      <w:rPr>
+        <w:rFonts w:ascii="Symbol" w:hAnsi="Symbol" w:hint="default"/>
+      </w:rPr>
+    </w:lvl>
+    <w:lvl w:ilvl="4" w:tplc="40090003" w:tentative="1">
+      <w:start w:val="1"/>
+      <w:numFmt w:val="bullet"/>
+      <w:lvlText w:val="o"/>
+      <w:lvlJc w:val="left"/>
+      <w:pPr>
+        <w:ind w:left="3600" w:hanging="360"/>
+      </w:pPr>
+      <w:rPr>
+        <w:rFonts w:ascii="Courier New" w:hAnsi="Courier New" w:cs="Courier New" w:hint="default"/>
+      </w:rPr>
+    </w:lvl>
+    <w:lvl w:ilvl="5" w:tplc="40090005" w:tentative="1">
+      <w:start w:val="1"/>
+      <w:numFmt w:val="bullet"/>
+      <w:lvlText w:val=""/>
+      <w:lvlJc w:val="left"/>
+      <w:pPr>
+        <w:ind w:left="4320" w:hanging="360"/>
+      </w:pPr>
+      <w:rPr>
+        <w:rFonts w:ascii="Wingdings" w:hAnsi="Wingdings" w:hint="default"/>
+      </w:rPr>
+    </w:lvl>
+    <w:lvl w:ilvl="6" w:tplc="40090001" w:tentative="1">
+      <w:start w:val="1"/>
+      <w:numFmt w:val="bullet"/>
+      <w:lvlText w:val=""/>
+      <w:lvlJc w:val="left"/>
+      <w:pPr>
+        <w:ind w:left="5040" w:hanging="360"/>
+      </w:pPr>
+      <w:rPr>
+        <w:rFonts w:ascii="Symbol" w:hAnsi="Symbol" w:hint="default"/>
+      </w:rPr>
+    </w:lvl>
+    <w:lvl w:ilvl="7" w:tplc="40090003" w:tentative="1">
+      <w:start w:val="1"/>
+      <w:numFmt w:val="bullet"/>
+      <w:lvlText w:val="o"/>
+      <w:lvlJc w:val="left"/>
+      <w:pPr>
+        <w:ind w:left="5760" w:hanging="360"/>
+      </w:pPr>
+      <w:rPr>
+        <w:rFonts w:ascii="Courier New" w:hAnsi="Courier New" w:cs="Courier New" w:hint="default"/>
+      </w:rPr>
+    </w:lvl>
+    <w:lvl w:ilvl="8" w:tplc="40090005" w:tentative="1">
+      <w:start w:val="1"/>
+      <w:numFmt w:val="bullet"/>
+      <w:lvlText w:val=""/>
+      <w:lvlJc w:val="left"/>
+      <w:pPr>
+        <w:ind w:left="6480" w:hanging="360"/>
+      </w:pPr>
+      <w:rPr>
+        <w:rFonts w:ascii="Wingdings" w:hAnsi="Wingdings" w:hint="default"/>
+      </w:rPr>
+    </w:lvl>
+  </w:abstractNum>
+  <w:abstractNum w:abstractNumId="14">
     <w:nsid w:val="4316625C"/>
     <w:multiLevelType w:val="hybridMultilevel"/>
     <w:tmpl w:val="B75E34FE"/>
@@ -10325,7 +12374,7 @@
       </w:pPr>
     </w:lvl>
   </w:abstractNum>
-  <w:abstractNum w:abstractNumId="12">
+  <w:abstractNum w:abstractNumId="15">
     <w:nsid w:val="45E943CF"/>
     <w:multiLevelType w:val="hybridMultilevel"/>
     <w:tmpl w:val="8DB25A28"/>
@@ -10414,7 +12463,7 @@
       </w:pPr>
     </w:lvl>
   </w:abstractNum>
-  <w:abstractNum w:abstractNumId="13">
+  <w:abstractNum w:abstractNumId="16">
     <w:nsid w:val="49F86A57"/>
     <w:multiLevelType w:val="hybridMultilevel"/>
     <w:tmpl w:val="0BF29674"/>
@@ -10503,7 +12552,96 @@
       </w:pPr>
     </w:lvl>
   </w:abstractNum>
-  <w:abstractNum w:abstractNumId="14">
+  <w:abstractNum w:abstractNumId="17">
+    <w:nsid w:val="4AC94DD4"/>
+    <w:multiLevelType w:val="hybridMultilevel"/>
+    <w:tmpl w:val="5324F4FE"/>
+    <w:lvl w:ilvl="0" w:tplc="4009000F">
+      <w:start w:val="1"/>
+      <w:numFmt w:val="decimal"/>
+      <w:lvlText w:val="%1."/>
+      <w:lvlJc w:val="left"/>
+      <w:pPr>
+        <w:ind w:left="720" w:hanging="360"/>
+      </w:pPr>
+      <w:rPr>
+        <w:rFonts w:hint="default"/>
+      </w:rPr>
+    </w:lvl>
+    <w:lvl w:ilvl="1" w:tplc="40090019" w:tentative="1">
+      <w:start w:val="1"/>
+      <w:numFmt w:val="lowerLetter"/>
+      <w:lvlText w:val="%2."/>
+      <w:lvlJc w:val="left"/>
+      <w:pPr>
+        <w:ind w:left="1440" w:hanging="360"/>
+      </w:pPr>
+    </w:lvl>
+    <w:lvl w:ilvl="2" w:tplc="4009001B" w:tentative="1">
+      <w:start w:val="1"/>
+      <w:numFmt w:val="lowerRoman"/>
+      <w:lvlText w:val="%3."/>
+      <w:lvlJc w:val="right"/>
+      <w:pPr>
+        <w:ind w:left="2160" w:hanging="180"/>
+      </w:pPr>
+    </w:lvl>
+    <w:lvl w:ilvl="3" w:tplc="4009000F" w:tentative="1">
+      <w:start w:val="1"/>
+      <w:numFmt w:val="decimal"/>
+      <w:lvlText w:val="%4."/>
+      <w:lvlJc w:val="left"/>
+      <w:pPr>
+        <w:ind w:left="2880" w:hanging="360"/>
+      </w:pPr>
+    </w:lvl>
+    <w:lvl w:ilvl="4" w:tplc="40090019" w:tentative="1">
+      <w:start w:val="1"/>
+      <w:numFmt w:val="lowerLetter"/>
+      <w:lvlText w:val="%5."/>
+      <w:lvlJc w:val="left"/>
+      <w:pPr>
+        <w:ind w:left="3600" w:hanging="360"/>
+      </w:pPr>
+    </w:lvl>
+    <w:lvl w:ilvl="5" w:tplc="4009001B" w:tentative="1">
+      <w:start w:val="1"/>
+      <w:numFmt w:val="lowerRoman"/>
+      <w:lvlText w:val="%6."/>
+      <w:lvlJc w:val="right"/>
+      <w:pPr>
+        <w:ind w:left="4320" w:hanging="180"/>
+      </w:pPr>
+    </w:lvl>
+    <w:lvl w:ilvl="6" w:tplc="4009000F" w:tentative="1">
+      <w:start w:val="1"/>
+      <w:numFmt w:val="decimal"/>
+      <w:lvlText w:val="%7."/>
+      <w:lvlJc w:val="left"/>
+      <w:pPr>
+        <w:ind w:left="5040" w:hanging="360"/>
+      </w:pPr>
+    </w:lvl>
+    <w:lvl w:ilvl="7" w:tplc="40090019" w:tentative="1">
+      <w:start w:val="1"/>
+      <w:numFmt w:val="lowerLetter"/>
+      <w:lvlText w:val="%8."/>
+      <w:lvlJc w:val="left"/>
+      <w:pPr>
+        <w:ind w:left="5760" w:hanging="360"/>
+      </w:pPr>
+    </w:lvl>
+    <w:lvl w:ilvl="8" w:tplc="4009001B" w:tentative="1">
+      <w:start w:val="1"/>
+      <w:numFmt w:val="lowerRoman"/>
+      <w:lvlText w:val="%9."/>
+      <w:lvlJc w:val="right"/>
+      <w:pPr>
+        <w:ind w:left="6480" w:hanging="180"/>
+      </w:pPr>
+    </w:lvl>
+  </w:abstractNum>
+  <w:abstractNum w:abstractNumId="18">
     <w:nsid w:val="5CBE3725"/>
     <w:multiLevelType w:val="hybridMultilevel"/>
     <w:tmpl w:val="4D3C6A2A"/>
@@ -10592,7 +12730,7 @@
       </w:pPr>
     </w:lvl>
   </w:abstractNum>
-  <w:abstractNum w:abstractNumId="15">
+  <w:abstractNum w:abstractNumId="19">
     <w:nsid w:val="60B95D02"/>
     <w:multiLevelType w:val="hybridMultilevel"/>
     <w:tmpl w:val="D9DEA214"/>
@@ -10705,7 +12843,7 @@
       </w:rPr>
     </w:lvl>
   </w:abstractNum>
-  <w:abstractNum w:abstractNumId="16">
+  <w:abstractNum w:abstractNumId="20">
     <w:nsid w:val="6277321E"/>
     <w:multiLevelType w:val="hybridMultilevel"/>
     <w:tmpl w:val="09F2E114"/>
@@ -10794,7 +12932,7 @@
       </w:pPr>
     </w:lvl>
   </w:abstractNum>
-  <w:abstractNum w:abstractNumId="17">
+  <w:abstractNum w:abstractNumId="21">
     <w:nsid w:val="635E69DF"/>
     <w:multiLevelType w:val="hybridMultilevel"/>
     <w:tmpl w:val="7CCC2E94"/>
@@ -10883,7 +13021,7 @@
       </w:pPr>
     </w:lvl>
   </w:abstractNum>
-  <w:abstractNum w:abstractNumId="18">
+  <w:abstractNum w:abstractNumId="22">
     <w:nsid w:val="63A8624B"/>
     <w:multiLevelType w:val="hybridMultilevel"/>
     <w:tmpl w:val="ABE4FA34"/>
@@ -10972,7 +13110,7 @@
       </w:pPr>
     </w:lvl>
   </w:abstractNum>
-  <w:abstractNum w:abstractNumId="19">
+  <w:abstractNum w:abstractNumId="23">
     <w:nsid w:val="64456C49"/>
     <w:multiLevelType w:val="hybridMultilevel"/>
     <w:tmpl w:val="5F629F92"/>
@@ -11061,7 +13199,7 @@
       </w:pPr>
     </w:lvl>
   </w:abstractNum>
-  <w:abstractNum w:abstractNumId="20">
+  <w:abstractNum w:abstractNumId="24">
     <w:nsid w:val="67516CAF"/>
     <w:multiLevelType w:val="hybridMultilevel"/>
     <w:tmpl w:val="67A466EC"/>
@@ -11174,7 +13312,7 @@
       </w:rPr>
     </w:lvl>
   </w:abstractNum>
-  <w:abstractNum w:abstractNumId="21">
+  <w:abstractNum w:abstractNumId="25">
     <w:nsid w:val="698F6573"/>
     <w:multiLevelType w:val="hybridMultilevel"/>
     <w:tmpl w:val="538221D2"/>
@@ -11287,7 +13425,7 @@
       </w:rPr>
     </w:lvl>
   </w:abstractNum>
-  <w:abstractNum w:abstractNumId="22">
+  <w:abstractNum w:abstractNumId="26">
     <w:nsid w:val="6C8D1D8E"/>
     <w:multiLevelType w:val="hybridMultilevel"/>
     <w:tmpl w:val="3300155A"/>
@@ -11400,7 +13538,7 @@
       </w:rPr>
     </w:lvl>
   </w:abstractNum>
-  <w:abstractNum w:abstractNumId="23">
+  <w:abstractNum w:abstractNumId="27">
     <w:nsid w:val="6D03627E"/>
     <w:multiLevelType w:val="hybridMultilevel"/>
     <w:tmpl w:val="AF6072B4"/>
@@ -11513,7 +13651,7 @@
       </w:rPr>
     </w:lvl>
   </w:abstractNum>
-  <w:abstractNum w:abstractNumId="24">
+  <w:abstractNum w:abstractNumId="28">
     <w:nsid w:val="6F4D3C22"/>
     <w:multiLevelType w:val="hybridMultilevel"/>
     <w:tmpl w:val="2D660700"/>
@@ -11626,7 +13764,7 @@
       </w:rPr>
     </w:lvl>
   </w:abstractNum>
-  <w:abstractNum w:abstractNumId="25">
+  <w:abstractNum w:abstractNumId="29">
     <w:nsid w:val="76363541"/>
     <w:multiLevelType w:val="hybridMultilevel"/>
     <w:tmpl w:val="9D845514"/>
@@ -11739,7 +13877,7 @@
       </w:rPr>
     </w:lvl>
   </w:abstractNum>
-  <w:abstractNum w:abstractNumId="26">
+  <w:abstractNum w:abstractNumId="30">
     <w:nsid w:val="77CF24AB"/>
     <w:multiLevelType w:val="hybridMultilevel"/>
     <w:tmpl w:val="5FD02720"/>
@@ -11829,85 +13967,97 @@
     </w:lvl>
   </w:abstractNum>
   <w:num w:numId="1">
+    <w:abstractNumId w:val="25"/>
+  </w:num>
+  <w:num w:numId="2">
     <w:abstractNumId w:val="21"/>
   </w:num>
-  <w:num w:numId="2">
-    <w:abstractNumId w:val="17"/>
-  </w:num>
   <w:num w:numId="3">
-    <w:abstractNumId w:val="7"/>
+    <w:abstractNumId w:val="8"/>
   </w:num>
   <w:num w:numId="4">
-    <w:abstractNumId w:val="8"/>
+    <w:abstractNumId w:val="10"/>
   </w:num>
   <w:num w:numId="5">
-    <w:abstractNumId w:val="23"/>
+    <w:abstractNumId w:val="27"/>
   </w:num>
   <w:num w:numId="6">
-    <w:abstractNumId w:val="13"/>
+    <w:abstractNumId w:val="16"/>
   </w:num>
   <w:num w:numId="7">
-    <w:abstractNumId w:val="11"/>
+    <w:abstractNumId w:val="14"/>
   </w:num>
   <w:num w:numId="8">
     <w:abstractNumId w:val="0"/>
   </w:num>
   <w:num w:numId="9">
-    <w:abstractNumId w:val="9"/>
+    <w:abstractNumId w:val="11"/>
   </w:num>
   <w:num w:numId="10">
+    <w:abstractNumId w:val="19"/>
+  </w:num>
+  <w:num w:numId="11">
+    <w:abstractNumId w:val="20"/>
+  </w:num>
+  <w:num w:numId="12">
+    <w:abstractNumId w:val="18"/>
+  </w:num>
+  <w:num w:numId="13">
+    <w:abstractNumId w:val="12"/>
+  </w:num>
+  <w:num w:numId="14">
     <w:abstractNumId w:val="15"/>
   </w:num>
-  <w:num w:numId="11">
-    <w:abstractNumId w:val="16"/>
-  </w:num>
-  <w:num w:numId="12">
-    <w:abstractNumId w:val="14"/>
-  </w:num>
-  <w:num w:numId="13">
-    <w:abstractNumId w:val="10"/>
-  </w:num>
-  <w:num w:numId="14">
-    <w:abstractNumId w:val="12"/>
-  </w:num>
   <w:num w:numId="15">
-    <w:abstractNumId w:val="24"/>
+    <w:abstractNumId w:val="28"/>
   </w:num>
   <w:num w:numId="16">
+    <w:abstractNumId w:val="26"/>
+  </w:num>
+  <w:num w:numId="17">
     <w:abstractNumId w:val="22"/>
   </w:num>
-  <w:num w:numId="17">
-    <w:abstractNumId w:val="18"/>
-  </w:num>
   <w:num w:numId="18">
-    <w:abstractNumId w:val="5"/>
+    <w:abstractNumId w:val="6"/>
   </w:num>
   <w:num w:numId="19">
     <w:abstractNumId w:val="1"/>
   </w:num>
   <w:num w:numId="20">
-    <w:abstractNumId w:val="19"/>
+    <w:abstractNumId w:val="23"/>
   </w:num>
   <w:num w:numId="21">
-    <w:abstractNumId w:val="20"/>
+    <w:abstractNumId w:val="24"/>
   </w:num>
   <w:num w:numId="22">
+    <w:abstractNumId w:val="4"/>
+  </w:num>
+  <w:num w:numId="23">
     <w:abstractNumId w:val="3"/>
   </w:num>
-  <w:num w:numId="23">
+  <w:num w:numId="24">
+    <w:abstractNumId w:val="30"/>
+  </w:num>
+  <w:num w:numId="25">
+    <w:abstractNumId w:val="5"/>
+  </w:num>
+  <w:num w:numId="26">
+    <w:abstractNumId w:val="29"/>
+  </w:num>
+  <w:num w:numId="27">
+    <w:abstractNumId w:val="7"/>
+  </w:num>
+  <w:num w:numId="28">
+    <w:abstractNumId w:val="13"/>
+  </w:num>
+  <w:num w:numId="29">
+    <w:abstractNumId w:val="17"/>
+  </w:num>
+  <w:num w:numId="30">
     <w:abstractNumId w:val="2"/>
   </w:num>
-  <w:num w:numId="24">
-    <w:abstractNumId w:val="26"/>
-  </w:num>
-  <w:num w:numId="25">
-    <w:abstractNumId w:val="4"/>
-  </w:num>
-  <w:num w:numId="26">
-    <w:abstractNumId w:val="25"/>
-  </w:num>
-  <w:num w:numId="27">
-    <w:abstractNumId w:val="6"/>
+  <w:num w:numId="31">
+    <w:abstractNumId w:val="9"/>
   </w:num>
 </w:numbering>
 </file>

</xml_diff>

<commit_message>
Date: 18 Feb 2026
</commit_message>
<xml_diff>
--- a/Notes.docx
+++ b/Notes.docx
@@ -707,13 +707,23 @@
           <w:szCs w:val="22"/>
         </w:rPr>
       </w:pPr>
+      <w:proofErr w:type="spellStart"/>
       <w:r>
         <w:rPr>
           <w:sz w:val="24"/>
           <w:szCs w:val="22"/>
           <w:lang w:val="en-US"/>
         </w:rPr>
-        <w:t>Thread.sleep()</w:t>
+        <w:t>Thread.sleep</w:t>
+      </w:r>
+      <w:proofErr w:type="spellEnd"/>
+      <w:r>
+        <w:rPr>
+          <w:sz w:val="24"/>
+          <w:szCs w:val="22"/>
+          <w:lang w:val="en-US"/>
+        </w:rPr>
+        <w:t>()</w:t>
       </w:r>
     </w:p>
     <w:p>
@@ -2485,7 +2495,27 @@
           <w:sz w:val="24"/>
           <w:szCs w:val="22"/>
         </w:rPr>
-        <w:t>What is automation Testing?</w:t>
+        <w:t xml:space="preserve">What is automation </w:t>
+      </w:r>
+      <w:proofErr w:type="gramStart"/>
+      <w:r>
+        <w:rPr>
+          <w:b/>
+          <w:bCs/>
+          <w:sz w:val="24"/>
+          <w:szCs w:val="22"/>
+        </w:rPr>
+        <w:t>Testing</w:t>
+      </w:r>
+      <w:proofErr w:type="gramEnd"/>
+      <w:r>
+        <w:rPr>
+          <w:b/>
+          <w:bCs/>
+          <w:sz w:val="24"/>
+          <w:szCs w:val="22"/>
+        </w:rPr>
+        <w:t>?</w:t>
       </w:r>
     </w:p>
     <w:p>
@@ -2976,6 +3006,7 @@
           <w:szCs w:val="22"/>
         </w:rPr>
       </w:pPr>
+      <w:proofErr w:type="spellStart"/>
       <w:r>
         <w:rPr>
           <w:sz w:val="24"/>
@@ -2983,6 +3014,7 @@
         </w:rPr>
         <w:t>JMeeter</w:t>
       </w:r>
+      <w:proofErr w:type="spellEnd"/>
     </w:p>
     <w:p>
       <w:pPr>
@@ -3991,6 +4023,7 @@
           <w:szCs w:val="22"/>
         </w:rPr>
       </w:pPr>
+      <w:proofErr w:type="spellStart"/>
       <w:r>
         <w:rPr>
           <w:sz w:val="24"/>
@@ -3998,6 +4031,7 @@
         </w:rPr>
         <w:t>YourName_SeleniumDemos</w:t>
       </w:r>
+      <w:proofErr w:type="spellEnd"/>
     </w:p>
     <w:p>
       <w:pPr>
@@ -4037,8 +4071,17 @@
           <w:szCs w:val="22"/>
         </w:rPr>
         <w:lastRenderedPageBreak/>
-        <w:t>Launch selenium.dev</w:t>
-      </w:r>
+        <w:t xml:space="preserve">Launch </w:t>
+      </w:r>
+      <w:proofErr w:type="spellStart"/>
+      <w:r>
+        <w:rPr>
+          <w:sz w:val="24"/>
+          <w:szCs w:val="22"/>
+        </w:rPr>
+        <w:t>selenium.dev</w:t>
+      </w:r>
+      <w:proofErr w:type="spellEnd"/>
     </w:p>
     <w:p>
       <w:pPr>
@@ -4638,12 +4681,21 @@
           <w:szCs w:val="22"/>
         </w:rPr>
       </w:pPr>
-      <w:r>
-        <w:rPr>
-          <w:sz w:val="24"/>
-          <w:szCs w:val="22"/>
-        </w:rPr>
-        <w:t xml:space="preserve">close() </w:t>
+      <w:proofErr w:type="gramStart"/>
+      <w:r>
+        <w:rPr>
+          <w:sz w:val="24"/>
+          <w:szCs w:val="22"/>
+        </w:rPr>
+        <w:t>close(</w:t>
+      </w:r>
+      <w:proofErr w:type="gramEnd"/>
+      <w:r>
+        <w:rPr>
+          <w:sz w:val="24"/>
+          <w:szCs w:val="22"/>
+        </w:rPr>
+        <w:t xml:space="preserve">) </w:t>
       </w:r>
       <w:r>
         <w:rPr>
@@ -4688,12 +4740,30 @@
           <w:szCs w:val="22"/>
         </w:rPr>
       </w:pPr>
-      <w:r>
-        <w:rPr>
-          <w:sz w:val="24"/>
-          <w:szCs w:val="22"/>
-        </w:rPr>
-        <w:t xml:space="preserve">driver.manage().window().maximize() </w:t>
+      <w:proofErr w:type="spellStart"/>
+      <w:proofErr w:type="gramStart"/>
+      <w:r>
+        <w:rPr>
+          <w:sz w:val="24"/>
+          <w:szCs w:val="22"/>
+        </w:rPr>
+        <w:t>driver.manage</w:t>
+      </w:r>
+      <w:proofErr w:type="spellEnd"/>
+      <w:r>
+        <w:rPr>
+          <w:sz w:val="24"/>
+          <w:szCs w:val="22"/>
+        </w:rPr>
+        <w:t>(</w:t>
+      </w:r>
+      <w:proofErr w:type="gramEnd"/>
+      <w:r>
+        <w:rPr>
+          <w:sz w:val="24"/>
+          <w:szCs w:val="22"/>
+        </w:rPr>
+        <w:t xml:space="preserve">).window().maximize() </w:t>
       </w:r>
       <w:r>
         <w:rPr>
@@ -4722,12 +4792,21 @@
           <w:szCs w:val="22"/>
         </w:rPr>
       </w:pPr>
-      <w:r>
-        <w:rPr>
-          <w:sz w:val="24"/>
-          <w:szCs w:val="22"/>
-        </w:rPr>
-        <w:t xml:space="preserve">getTitle() </w:t>
+      <w:proofErr w:type="gramStart"/>
+      <w:r>
+        <w:rPr>
+          <w:sz w:val="24"/>
+          <w:szCs w:val="22"/>
+        </w:rPr>
+        <w:t>getTitle(</w:t>
+      </w:r>
+      <w:proofErr w:type="gramEnd"/>
+      <w:r>
+        <w:rPr>
+          <w:sz w:val="24"/>
+          <w:szCs w:val="22"/>
+        </w:rPr>
+        <w:t xml:space="preserve">) </w:t>
       </w:r>
       <w:r>
         <w:rPr>
@@ -4756,12 +4835,21 @@
           <w:szCs w:val="22"/>
         </w:rPr>
       </w:pPr>
-      <w:r>
-        <w:rPr>
-          <w:sz w:val="24"/>
-          <w:szCs w:val="22"/>
-        </w:rPr>
-        <w:t xml:space="preserve">getCurrentUrl() </w:t>
+      <w:proofErr w:type="gramStart"/>
+      <w:r>
+        <w:rPr>
+          <w:sz w:val="24"/>
+          <w:szCs w:val="22"/>
+        </w:rPr>
+        <w:t>getCurrentUrl(</w:t>
+      </w:r>
+      <w:proofErr w:type="gramEnd"/>
+      <w:r>
+        <w:rPr>
+          <w:sz w:val="24"/>
+          <w:szCs w:val="22"/>
+        </w:rPr>
+        <w:t xml:space="preserve">) </w:t>
       </w:r>
       <w:r>
         <w:rPr>
@@ -4790,12 +4878,21 @@
           <w:szCs w:val="22"/>
         </w:rPr>
       </w:pPr>
-      <w:r>
-        <w:rPr>
-          <w:sz w:val="24"/>
-          <w:szCs w:val="22"/>
-        </w:rPr>
-        <w:t xml:space="preserve">getPageSource() </w:t>
+      <w:proofErr w:type="gramStart"/>
+      <w:r>
+        <w:rPr>
+          <w:sz w:val="24"/>
+          <w:szCs w:val="22"/>
+        </w:rPr>
+        <w:t>getPageSource(</w:t>
+      </w:r>
+      <w:proofErr w:type="gramEnd"/>
+      <w:r>
+        <w:rPr>
+          <w:sz w:val="24"/>
+          <w:szCs w:val="22"/>
+        </w:rPr>
+        <w:t xml:space="preserve">) </w:t>
       </w:r>
       <w:r>
         <w:rPr>
@@ -4824,12 +4921,21 @@
           <w:szCs w:val="22"/>
         </w:rPr>
       </w:pPr>
-      <w:r>
-        <w:rPr>
-          <w:sz w:val="24"/>
-          <w:szCs w:val="22"/>
-        </w:rPr>
-        <w:t xml:space="preserve">findElement() </w:t>
+      <w:proofErr w:type="gramStart"/>
+      <w:r>
+        <w:rPr>
+          <w:sz w:val="24"/>
+          <w:szCs w:val="22"/>
+        </w:rPr>
+        <w:t>findElement(</w:t>
+      </w:r>
+      <w:proofErr w:type="gramEnd"/>
+      <w:r>
+        <w:rPr>
+          <w:sz w:val="24"/>
+          <w:szCs w:val="22"/>
+        </w:rPr>
+        <w:t xml:space="preserve">) </w:t>
       </w:r>
       <w:r>
         <w:rPr>
@@ -4888,12 +4994,21 @@
           <w:szCs w:val="22"/>
         </w:rPr>
       </w:pPr>
-      <w:r>
-        <w:rPr>
-          <w:sz w:val="24"/>
-          <w:szCs w:val="22"/>
-        </w:rPr>
-        <w:t xml:space="preserve">findElements() </w:t>
+      <w:proofErr w:type="gramStart"/>
+      <w:r>
+        <w:rPr>
+          <w:sz w:val="24"/>
+          <w:szCs w:val="22"/>
+        </w:rPr>
+        <w:t>findElements(</w:t>
+      </w:r>
+      <w:proofErr w:type="gramEnd"/>
+      <w:r>
+        <w:rPr>
+          <w:sz w:val="24"/>
+          <w:szCs w:val="22"/>
+        </w:rPr>
+        <w:t xml:space="preserve">) </w:t>
       </w:r>
       <w:r>
         <w:rPr>
@@ -4922,12 +5037,21 @@
           <w:szCs w:val="22"/>
         </w:rPr>
       </w:pPr>
-      <w:r>
-        <w:rPr>
-          <w:sz w:val="24"/>
-          <w:szCs w:val="22"/>
-        </w:rPr>
-        <w:t xml:space="preserve">getWindowHandles() </w:t>
+      <w:proofErr w:type="gramStart"/>
+      <w:r>
+        <w:rPr>
+          <w:sz w:val="24"/>
+          <w:szCs w:val="22"/>
+        </w:rPr>
+        <w:t>getWindowHandles(</w:t>
+      </w:r>
+      <w:proofErr w:type="gramEnd"/>
+      <w:r>
+        <w:rPr>
+          <w:sz w:val="24"/>
+          <w:szCs w:val="22"/>
+        </w:rPr>
+        <w:t xml:space="preserve">) </w:t>
       </w:r>
       <w:r>
         <w:rPr>
@@ -5002,7 +5126,23 @@
           <w:sz w:val="24"/>
           <w:szCs w:val="22"/>
         </w:rPr>
-        <w:t xml:space="preserve"> You have passed relative URL. get() method expects absolute URL. Which starts with http</w:t>
+        <w:t xml:space="preserve"> You have passed relative URL. </w:t>
+      </w:r>
+      <w:proofErr w:type="gramStart"/>
+      <w:r>
+        <w:rPr>
+          <w:sz w:val="24"/>
+          <w:szCs w:val="22"/>
+        </w:rPr>
+        <w:t>get(</w:t>
+      </w:r>
+      <w:proofErr w:type="gramEnd"/>
+      <w:r>
+        <w:rPr>
+          <w:sz w:val="24"/>
+          <w:szCs w:val="22"/>
+        </w:rPr>
+        <w:t>) method expects absolute URL. Which starts with http</w:t>
       </w:r>
     </w:p>
     <w:p>
@@ -5173,7 +5313,38 @@
           <w:sz w:val="24"/>
           <w:szCs w:val="22"/>
         </w:rPr>
-        <w:t>Selenium waits for maximum 30 seconds to load the page via driver.get()</w:t>
+        <w:t xml:space="preserve">Selenium waits for maximum 30 seconds to load the page via </w:t>
+      </w:r>
+      <w:proofErr w:type="spellStart"/>
+      <w:proofErr w:type="gramStart"/>
+      <w:r>
+        <w:rPr>
+          <w:b/>
+          <w:bCs/>
+          <w:sz w:val="24"/>
+          <w:szCs w:val="22"/>
+        </w:rPr>
+        <w:t>driver.get</w:t>
+      </w:r>
+      <w:proofErr w:type="spellEnd"/>
+      <w:r>
+        <w:rPr>
+          <w:b/>
+          <w:bCs/>
+          <w:sz w:val="24"/>
+          <w:szCs w:val="22"/>
+        </w:rPr>
+        <w:t>(</w:t>
+      </w:r>
+      <w:proofErr w:type="gramEnd"/>
+      <w:r>
+        <w:rPr>
+          <w:b/>
+          <w:bCs/>
+          <w:sz w:val="24"/>
+          <w:szCs w:val="22"/>
+        </w:rPr>
+        <w:t>)</w:t>
       </w:r>
       <w:r>
         <w:rPr>
@@ -5448,12 +5619,21 @@
           <w:szCs w:val="22"/>
         </w:rPr>
       </w:pPr>
-      <w:r>
-        <w:rPr>
-          <w:sz w:val="24"/>
-          <w:szCs w:val="22"/>
-        </w:rPr>
-        <w:t xml:space="preserve">sendKeys() </w:t>
+      <w:proofErr w:type="gramStart"/>
+      <w:r>
+        <w:rPr>
+          <w:sz w:val="24"/>
+          <w:szCs w:val="22"/>
+        </w:rPr>
+        <w:t>sendKeys(</w:t>
+      </w:r>
+      <w:proofErr w:type="gramEnd"/>
+      <w:r>
+        <w:rPr>
+          <w:sz w:val="24"/>
+          <w:szCs w:val="22"/>
+        </w:rPr>
+        <w:t xml:space="preserve">) </w:t>
       </w:r>
       <w:r>
         <w:rPr>
@@ -5489,12 +5669,21 @@
           <w:szCs w:val="22"/>
         </w:rPr>
       </w:pPr>
-      <w:r>
-        <w:rPr>
-          <w:sz w:val="24"/>
-          <w:szCs w:val="22"/>
-        </w:rPr>
-        <w:t xml:space="preserve">click() </w:t>
+      <w:proofErr w:type="gramStart"/>
+      <w:r>
+        <w:rPr>
+          <w:sz w:val="24"/>
+          <w:szCs w:val="22"/>
+        </w:rPr>
+        <w:t>click(</w:t>
+      </w:r>
+      <w:proofErr w:type="gramEnd"/>
+      <w:r>
+        <w:rPr>
+          <w:sz w:val="24"/>
+          <w:szCs w:val="22"/>
+        </w:rPr>
+        <w:t xml:space="preserve">) </w:t>
       </w:r>
       <w:r>
         <w:rPr>
@@ -5523,12 +5712,21 @@
           <w:szCs w:val="22"/>
         </w:rPr>
       </w:pPr>
-      <w:r>
-        <w:rPr>
-          <w:sz w:val="24"/>
-          <w:szCs w:val="22"/>
-        </w:rPr>
-        <w:t xml:space="preserve">getText() </w:t>
+      <w:proofErr w:type="gramStart"/>
+      <w:r>
+        <w:rPr>
+          <w:sz w:val="24"/>
+          <w:szCs w:val="22"/>
+        </w:rPr>
+        <w:t>getText(</w:t>
+      </w:r>
+      <w:proofErr w:type="gramEnd"/>
+      <w:r>
+        <w:rPr>
+          <w:sz w:val="24"/>
+          <w:szCs w:val="22"/>
+        </w:rPr>
+        <w:t xml:space="preserve">) </w:t>
       </w:r>
       <w:r>
         <w:rPr>
@@ -5557,12 +5755,21 @@
           <w:szCs w:val="22"/>
         </w:rPr>
       </w:pPr>
-      <w:r>
-        <w:rPr>
-          <w:sz w:val="24"/>
-          <w:szCs w:val="22"/>
-        </w:rPr>
-        <w:t xml:space="preserve">getAttribute() </w:t>
+      <w:proofErr w:type="gramStart"/>
+      <w:r>
+        <w:rPr>
+          <w:sz w:val="24"/>
+          <w:szCs w:val="22"/>
+        </w:rPr>
+        <w:t>getAttribute(</w:t>
+      </w:r>
+      <w:proofErr w:type="gramEnd"/>
+      <w:r>
+        <w:rPr>
+          <w:sz w:val="24"/>
+          <w:szCs w:val="22"/>
+        </w:rPr>
+        <w:t xml:space="preserve">) </w:t>
       </w:r>
       <w:r>
         <w:rPr>
@@ -5591,13 +5798,22 @@
           <w:szCs w:val="22"/>
         </w:rPr>
       </w:pPr>
+      <w:proofErr w:type="gramStart"/>
       <w:r>
         <w:rPr>
           <w:sz w:val="24"/>
           <w:szCs w:val="22"/>
         </w:rPr>
         <w:lastRenderedPageBreak/>
-        <w:t xml:space="preserve">isSelected() </w:t>
+        <w:t>isSelected(</w:t>
+      </w:r>
+      <w:proofErr w:type="gramEnd"/>
+      <w:r>
+        <w:rPr>
+          <w:sz w:val="24"/>
+          <w:szCs w:val="22"/>
+        </w:rPr>
+        <w:t xml:space="preserve">) </w:t>
       </w:r>
       <w:r>
         <w:rPr>
@@ -5626,12 +5842,21 @@
           <w:szCs w:val="22"/>
         </w:rPr>
       </w:pPr>
-      <w:r>
-        <w:rPr>
-          <w:sz w:val="24"/>
-          <w:szCs w:val="22"/>
-        </w:rPr>
-        <w:t xml:space="preserve">isEnabled() </w:t>
+      <w:proofErr w:type="gramStart"/>
+      <w:r>
+        <w:rPr>
+          <w:sz w:val="24"/>
+          <w:szCs w:val="22"/>
+        </w:rPr>
+        <w:t>isEnabled(</w:t>
+      </w:r>
+      <w:proofErr w:type="gramEnd"/>
+      <w:r>
+        <w:rPr>
+          <w:sz w:val="24"/>
+          <w:szCs w:val="22"/>
+        </w:rPr>
+        <w:t xml:space="preserve">) </w:t>
       </w:r>
       <w:r>
         <w:rPr>
@@ -5760,7 +5985,23 @@
           <w:sz w:val="24"/>
           <w:szCs w:val="22"/>
         </w:rPr>
-        <w:t xml:space="preserve">Are the way to find out any control / WebElement on the page. </w:t>
+        <w:t xml:space="preserve">Are the way to find out any control / WebElement on the </w:t>
+      </w:r>
+      <w:proofErr w:type="gramStart"/>
+      <w:r>
+        <w:rPr>
+          <w:sz w:val="24"/>
+          <w:szCs w:val="22"/>
+        </w:rPr>
+        <w:t>page.</w:t>
+      </w:r>
+      <w:proofErr w:type="gramEnd"/>
+      <w:r>
+        <w:rPr>
+          <w:sz w:val="24"/>
+          <w:szCs w:val="22"/>
+        </w:rPr>
+        <w:t xml:space="preserve"> </w:t>
       </w:r>
     </w:p>
     <w:p>
@@ -6330,8 +6571,17 @@
           <w:sz w:val="24"/>
           <w:szCs w:val="22"/>
         </w:rPr>
-        <w:t>– Locates the control via class attrubute</w:t>
-      </w:r>
+        <w:t xml:space="preserve">– Locates the control via class </w:t>
+      </w:r>
+      <w:proofErr w:type="spellStart"/>
+      <w:r>
+        <w:rPr>
+          <w:sz w:val="24"/>
+          <w:szCs w:val="22"/>
+        </w:rPr>
+        <w:t>attrubute</w:t>
+      </w:r>
+      <w:proofErr w:type="spellEnd"/>
     </w:p>
     <w:p>
       <w:pPr>
@@ -6366,6 +6616,7 @@
         </w:rPr>
         <w:br/>
       </w:r>
+      <w:proofErr w:type="spellStart"/>
       <w:r>
         <w:rPr>
           <w:sz w:val="24"/>
@@ -6373,6 +6624,7 @@
         </w:rPr>
         <w:t>input#username</w:t>
       </w:r>
+      <w:proofErr w:type="spellEnd"/>
       <w:r>
         <w:rPr>
           <w:sz w:val="24"/>
@@ -6671,7 +6923,23 @@
           <w:sz w:val="24"/>
           <w:szCs w:val="22"/>
         </w:rPr>
-        <w:t xml:space="preserve">Selenium has a special class to handle such a drop down lists ie. </w:t>
+        <w:t xml:space="preserve">Selenium has a special class to handle such a drop down lists </w:t>
+      </w:r>
+      <w:proofErr w:type="spellStart"/>
+      <w:r>
+        <w:rPr>
+          <w:sz w:val="24"/>
+          <w:szCs w:val="22"/>
+        </w:rPr>
+        <w:t>ie</w:t>
+      </w:r>
+      <w:proofErr w:type="spellEnd"/>
+      <w:r>
+        <w:rPr>
+          <w:sz w:val="24"/>
+          <w:szCs w:val="22"/>
+        </w:rPr>
+        <w:t xml:space="preserve">. </w:t>
       </w:r>
       <w:r>
         <w:rPr>
@@ -6722,12 +6990,21 @@
           <w:szCs w:val="22"/>
         </w:rPr>
       </w:pPr>
-      <w:r>
-        <w:rPr>
-          <w:sz w:val="24"/>
-          <w:szCs w:val="22"/>
-        </w:rPr>
-        <w:t xml:space="preserve">getFirstSelectedOption() </w:t>
+      <w:proofErr w:type="gramStart"/>
+      <w:r>
+        <w:rPr>
+          <w:sz w:val="24"/>
+          <w:szCs w:val="22"/>
+        </w:rPr>
+        <w:t>getFirstSelectedOption(</w:t>
+      </w:r>
+      <w:proofErr w:type="gramEnd"/>
+      <w:r>
+        <w:rPr>
+          <w:sz w:val="24"/>
+          <w:szCs w:val="22"/>
+        </w:rPr>
+        <w:t xml:space="preserve">) </w:t>
       </w:r>
       <w:r>
         <w:rPr>
@@ -6763,12 +7040,21 @@
           <w:szCs w:val="22"/>
         </w:rPr>
       </w:pPr>
-      <w:r>
-        <w:rPr>
-          <w:sz w:val="24"/>
-          <w:szCs w:val="22"/>
-        </w:rPr>
-        <w:t xml:space="preserve">getOptions() </w:t>
+      <w:proofErr w:type="gramStart"/>
+      <w:r>
+        <w:rPr>
+          <w:sz w:val="24"/>
+          <w:szCs w:val="22"/>
+        </w:rPr>
+        <w:t>getOptions(</w:t>
+      </w:r>
+      <w:proofErr w:type="gramEnd"/>
+      <w:r>
+        <w:rPr>
+          <w:sz w:val="24"/>
+          <w:szCs w:val="22"/>
+        </w:rPr>
+        <w:t xml:space="preserve">) </w:t>
       </w:r>
       <w:r>
         <w:rPr>
@@ -6797,12 +7083,21 @@
           <w:szCs w:val="22"/>
         </w:rPr>
       </w:pPr>
-      <w:r>
-        <w:rPr>
-          <w:sz w:val="24"/>
-          <w:szCs w:val="22"/>
-        </w:rPr>
-        <w:t xml:space="preserve">selectByVisibleText() </w:t>
+      <w:proofErr w:type="gramStart"/>
+      <w:r>
+        <w:rPr>
+          <w:sz w:val="24"/>
+          <w:szCs w:val="22"/>
+        </w:rPr>
+        <w:t>selectByVisibleText(</w:t>
+      </w:r>
+      <w:proofErr w:type="gramEnd"/>
+      <w:r>
+        <w:rPr>
+          <w:sz w:val="24"/>
+          <w:szCs w:val="22"/>
+        </w:rPr>
+        <w:t xml:space="preserve">) </w:t>
       </w:r>
       <w:r>
         <w:rPr>
@@ -6831,12 +7126,21 @@
           <w:szCs w:val="22"/>
         </w:rPr>
       </w:pPr>
-      <w:r>
-        <w:rPr>
-          <w:sz w:val="24"/>
-          <w:szCs w:val="22"/>
-        </w:rPr>
-        <w:t xml:space="preserve">selectByContainsVisibleText() </w:t>
+      <w:proofErr w:type="gramStart"/>
+      <w:r>
+        <w:rPr>
+          <w:sz w:val="24"/>
+          <w:szCs w:val="22"/>
+        </w:rPr>
+        <w:t>selectByContainsVisibleText(</w:t>
+      </w:r>
+      <w:proofErr w:type="gramEnd"/>
+      <w:r>
+        <w:rPr>
+          <w:sz w:val="24"/>
+          <w:szCs w:val="22"/>
+        </w:rPr>
+        <w:t xml:space="preserve">) </w:t>
       </w:r>
       <w:r>
         <w:rPr>
@@ -6865,12 +7169,21 @@
           <w:szCs w:val="22"/>
         </w:rPr>
       </w:pPr>
-      <w:r>
-        <w:rPr>
-          <w:sz w:val="24"/>
-          <w:szCs w:val="22"/>
-        </w:rPr>
-        <w:t xml:space="preserve">selectByValue() </w:t>
+      <w:proofErr w:type="gramStart"/>
+      <w:r>
+        <w:rPr>
+          <w:sz w:val="24"/>
+          <w:szCs w:val="22"/>
+        </w:rPr>
+        <w:t>selectByValue(</w:t>
+      </w:r>
+      <w:proofErr w:type="gramEnd"/>
+      <w:r>
+        <w:rPr>
+          <w:sz w:val="24"/>
+          <w:szCs w:val="22"/>
+        </w:rPr>
+        <w:t xml:space="preserve">) </w:t>
       </w:r>
       <w:r>
         <w:rPr>
@@ -6906,12 +7219,21 @@
           <w:szCs w:val="22"/>
         </w:rPr>
       </w:pPr>
-      <w:r>
-        <w:rPr>
-          <w:sz w:val="24"/>
-          <w:szCs w:val="22"/>
-        </w:rPr>
-        <w:t xml:space="preserve">selectByIndex() </w:t>
+      <w:proofErr w:type="gramStart"/>
+      <w:r>
+        <w:rPr>
+          <w:sz w:val="24"/>
+          <w:szCs w:val="22"/>
+        </w:rPr>
+        <w:t>selectByIndex(</w:t>
+      </w:r>
+      <w:proofErr w:type="gramEnd"/>
+      <w:r>
+        <w:rPr>
+          <w:sz w:val="24"/>
+          <w:szCs w:val="22"/>
+        </w:rPr>
+        <w:t xml:space="preserve">) </w:t>
       </w:r>
       <w:r>
         <w:rPr>
@@ -6925,7 +7247,23 @@
           <w:sz w:val="24"/>
           <w:szCs w:val="22"/>
         </w:rPr>
-        <w:t xml:space="preserve"> Selects the element by using its zero based index. It accepts a integer value.</w:t>
+        <w:t xml:space="preserve"> Selects the element by using its zero based index. It accepts </w:t>
+      </w:r>
+      <w:proofErr w:type="gramStart"/>
+      <w:r>
+        <w:rPr>
+          <w:sz w:val="24"/>
+          <w:szCs w:val="22"/>
+        </w:rPr>
+        <w:t>a</w:t>
+      </w:r>
+      <w:proofErr w:type="gramEnd"/>
+      <w:r>
+        <w:rPr>
+          <w:sz w:val="24"/>
+          <w:szCs w:val="22"/>
+        </w:rPr>
+        <w:t xml:space="preserve"> integer value.</w:t>
       </w:r>
     </w:p>
     <w:p>
@@ -6974,13 +7312,22 @@
           <w:szCs w:val="22"/>
         </w:rPr>
       </w:pPr>
+      <w:proofErr w:type="gramStart"/>
       <w:r>
         <w:rPr>
           <w:sz w:val="24"/>
           <w:szCs w:val="22"/>
         </w:rPr>
         <w:lastRenderedPageBreak/>
-        <w:t xml:space="preserve">isMultiple() </w:t>
+        <w:t>isMultiple(</w:t>
+      </w:r>
+      <w:proofErr w:type="gramEnd"/>
+      <w:r>
+        <w:rPr>
+          <w:sz w:val="24"/>
+          <w:szCs w:val="22"/>
+        </w:rPr>
+        <w:t xml:space="preserve">) </w:t>
       </w:r>
       <w:r>
         <w:rPr>
@@ -7282,12 +7629,30 @@
           <w:szCs w:val="22"/>
         </w:rPr>
       </w:pPr>
-      <w:r>
-        <w:rPr>
-          <w:sz w:val="24"/>
-          <w:szCs w:val="22"/>
-        </w:rPr>
-        <w:t>Thread.sleep()</w:t>
+      <w:proofErr w:type="spellStart"/>
+      <w:proofErr w:type="gramStart"/>
+      <w:r>
+        <w:rPr>
+          <w:sz w:val="24"/>
+          <w:szCs w:val="22"/>
+        </w:rPr>
+        <w:t>Thread.sleep</w:t>
+      </w:r>
+      <w:proofErr w:type="spellEnd"/>
+      <w:r>
+        <w:rPr>
+          <w:sz w:val="24"/>
+          <w:szCs w:val="22"/>
+        </w:rPr>
+        <w:t>(</w:t>
+      </w:r>
+      <w:proofErr w:type="gramEnd"/>
+      <w:r>
+        <w:rPr>
+          <w:sz w:val="24"/>
+          <w:szCs w:val="22"/>
+        </w:rPr>
+        <w:t>)</w:t>
       </w:r>
       <w:r>
         <w:rPr>
@@ -7513,7 +7878,23 @@
           <w:sz w:val="24"/>
           <w:szCs w:val="22"/>
         </w:rPr>
-        <w:t xml:space="preserve">We can specify the condition for wait. (ElementToBeClickable, AlertIsPresent, VisibilityOfElementLocated) </w:t>
+        <w:t xml:space="preserve">We can specify the condition for wait. (ElementToBeClickable, AlertIsPresent, </w:t>
+      </w:r>
+      <w:proofErr w:type="spellStart"/>
+      <w:r>
+        <w:rPr>
+          <w:sz w:val="24"/>
+          <w:szCs w:val="22"/>
+        </w:rPr>
+        <w:t>VisibilityOfElementLocated</w:t>
+      </w:r>
+      <w:proofErr w:type="spellEnd"/>
+      <w:r>
+        <w:rPr>
+          <w:sz w:val="24"/>
+          <w:szCs w:val="22"/>
+        </w:rPr>
+        <w:t xml:space="preserve">) </w:t>
       </w:r>
       <w:r>
         <w:rPr>
@@ -7536,8 +7917,9 @@
           <w:sz w:val="24"/>
           <w:szCs w:val="22"/>
         </w:rPr>
-        <w:t>WebDriverWait wait = new WebDriverWait(driver, Duration.ofSeconds(15));</w:t>
-      </w:r>
+        <w:t xml:space="preserve">WebDriverWait wait = new WebDriverWait(driver, </w:t>
+      </w:r>
+      <w:proofErr w:type="spellStart"/>
       <w:r>
         <w:rPr>
           <w:b/>
@@ -7545,21 +7927,18 @@
           <w:sz w:val="24"/>
           <w:szCs w:val="22"/>
         </w:rPr>
-        <w:br/>
-        <w:t>wait.until(ExpectedConditions.elementToBeClickable(chkBox));</w:t>
-      </w:r>
-    </w:p>
-    <w:p>
-      <w:pPr>
-        <w:pStyle w:val="ListParagraph"/>
-        <w:ind w:left="1440"/>
+        <w:t>Duration.ofSeconds</w:t>
+      </w:r>
+      <w:proofErr w:type="spellEnd"/>
+      <w:r>
         <w:rPr>
           <w:b/>
           <w:bCs/>
           <w:sz w:val="24"/>
           <w:szCs w:val="22"/>
         </w:rPr>
-      </w:pPr>
+        <w:t>(15));</w:t>
+      </w:r>
       <w:r>
         <w:rPr>
           <w:b/>
@@ -7567,8 +7946,9 @@
           <w:sz w:val="24"/>
           <w:szCs w:val="22"/>
         </w:rPr>
-        <w:t>chkBox.click();</w:t>
-      </w:r>
+        <w:br/>
+      </w:r>
+      <w:proofErr w:type="spellStart"/>
       <w:r>
         <w:rPr>
           <w:b/>
@@ -7576,8 +7956,9 @@
           <w:sz w:val="24"/>
           <w:szCs w:val="22"/>
         </w:rPr>
-        <w:br/>
-      </w:r>
+        <w:t>wait.until</w:t>
+      </w:r>
+      <w:proofErr w:type="spellEnd"/>
       <w:r>
         <w:rPr>
           <w:b/>
@@ -7585,6 +7966,107 @@
           <w:sz w:val="24"/>
           <w:szCs w:val="22"/>
         </w:rPr>
+        <w:t>(</w:t>
+      </w:r>
+      <w:proofErr w:type="spellStart"/>
+      <w:r>
+        <w:rPr>
+          <w:b/>
+          <w:bCs/>
+          <w:sz w:val="24"/>
+          <w:szCs w:val="22"/>
+        </w:rPr>
+        <w:t>ExpectedConditions.elementToBeClickable</w:t>
+      </w:r>
+      <w:proofErr w:type="spellEnd"/>
+      <w:r>
+        <w:rPr>
+          <w:b/>
+          <w:bCs/>
+          <w:sz w:val="24"/>
+          <w:szCs w:val="22"/>
+        </w:rPr>
+        <w:t>(</w:t>
+      </w:r>
+      <w:proofErr w:type="spellStart"/>
+      <w:r>
+        <w:rPr>
+          <w:b/>
+          <w:bCs/>
+          <w:sz w:val="24"/>
+          <w:szCs w:val="22"/>
+        </w:rPr>
+        <w:t>chkBox</w:t>
+      </w:r>
+      <w:proofErr w:type="spellEnd"/>
+      <w:r>
+        <w:rPr>
+          <w:b/>
+          <w:bCs/>
+          <w:sz w:val="24"/>
+          <w:szCs w:val="22"/>
+        </w:rPr>
+        <w:t>));</w:t>
+      </w:r>
+    </w:p>
+    <w:p>
+      <w:pPr>
+        <w:pStyle w:val="ListParagraph"/>
+        <w:ind w:left="1440"/>
+        <w:rPr>
+          <w:b/>
+          <w:bCs/>
+          <w:sz w:val="24"/>
+          <w:szCs w:val="22"/>
+        </w:rPr>
+      </w:pPr>
+      <w:proofErr w:type="spellStart"/>
+      <w:proofErr w:type="gramStart"/>
+      <w:r>
+        <w:rPr>
+          <w:b/>
+          <w:bCs/>
+          <w:sz w:val="24"/>
+          <w:szCs w:val="22"/>
+        </w:rPr>
+        <w:t>chkBox.click</w:t>
+      </w:r>
+      <w:proofErr w:type="spellEnd"/>
+      <w:r>
+        <w:rPr>
+          <w:b/>
+          <w:bCs/>
+          <w:sz w:val="24"/>
+          <w:szCs w:val="22"/>
+        </w:rPr>
+        <w:t>(</w:t>
+      </w:r>
+      <w:proofErr w:type="gramEnd"/>
+      <w:r>
+        <w:rPr>
+          <w:b/>
+          <w:bCs/>
+          <w:sz w:val="24"/>
+          <w:szCs w:val="22"/>
+        </w:rPr>
+        <w:t>);</w:t>
+      </w:r>
+      <w:r>
+        <w:rPr>
+          <w:b/>
+          <w:bCs/>
+          <w:sz w:val="24"/>
+          <w:szCs w:val="22"/>
+        </w:rPr>
+        <w:br/>
+      </w:r>
+      <w:r>
+        <w:rPr>
+          <w:b/>
+          <w:bCs/>
+          <w:sz w:val="24"/>
+          <w:szCs w:val="22"/>
+        </w:rPr>
         <w:br/>
         <w:t>OR</w:t>
       </w:r>
@@ -7701,7 +8183,23 @@
           <w:sz w:val="24"/>
           <w:szCs w:val="22"/>
         </w:rPr>
-        <w:t>We can specify the condition for wait. (ElementToBeClickable, AlertIsPresent, VisibilityOfElementLocated)</w:t>
+        <w:t xml:space="preserve">We can specify the condition for wait. (ElementToBeClickable, AlertIsPresent, </w:t>
+      </w:r>
+      <w:proofErr w:type="spellStart"/>
+      <w:r>
+        <w:rPr>
+          <w:sz w:val="24"/>
+          <w:szCs w:val="22"/>
+        </w:rPr>
+        <w:t>VisibilityOfElementLocated</w:t>
+      </w:r>
+      <w:proofErr w:type="spellEnd"/>
+      <w:r>
+        <w:rPr>
+          <w:sz w:val="24"/>
+          <w:szCs w:val="22"/>
+        </w:rPr>
+        <w:t>)</w:t>
       </w:r>
     </w:p>
     <w:p>
@@ -7737,7 +8235,22 @@
           <w:szCs w:val="22"/>
         </w:rPr>
         <w:br/>
-        <w:t xml:space="preserve">i – ignoring </w:t>
+      </w:r>
+      <w:proofErr w:type="spellStart"/>
+      <w:r>
+        <w:rPr>
+          <w:sz w:val="24"/>
+          <w:szCs w:val="22"/>
+        </w:rPr>
+        <w:t>i</w:t>
+      </w:r>
+      <w:proofErr w:type="spellEnd"/>
+      <w:r>
+        <w:rPr>
+          <w:sz w:val="24"/>
+          <w:szCs w:val="22"/>
+        </w:rPr>
+        <w:t xml:space="preserve"> – ignoring </w:t>
       </w:r>
       <w:r>
         <w:rPr>
@@ -7797,7 +8310,23 @@
           <w:sz w:val="24"/>
           <w:szCs w:val="22"/>
         </w:rPr>
-        <w:t>FluentWait&lt;WebDriver&gt;wait = new FluentWait&lt;&gt;(driver);</w:t>
+        <w:t>FluentWait&lt;WebDriver&gt;wait = new FluentWait&lt;</w:t>
+      </w:r>
+      <w:proofErr w:type="gramStart"/>
+      <w:r>
+        <w:rPr>
+          <w:sz w:val="24"/>
+          <w:szCs w:val="22"/>
+        </w:rPr>
+        <w:t>&gt;(</w:t>
+      </w:r>
+      <w:proofErr w:type="gramEnd"/>
+      <w:r>
+        <w:rPr>
+          <w:sz w:val="24"/>
+          <w:szCs w:val="22"/>
+        </w:rPr>
+        <w:t>driver);</w:t>
       </w:r>
     </w:p>
     <w:p>
@@ -7813,7 +8342,41 @@
           <w:sz w:val="24"/>
           <w:szCs w:val="22"/>
         </w:rPr>
-        <w:t xml:space="preserve">        wait.withTimeout(Duration.ofSeconds(10))</w:t>
+        <w:t xml:space="preserve">        </w:t>
+      </w:r>
+      <w:proofErr w:type="spellStart"/>
+      <w:proofErr w:type="gramStart"/>
+      <w:r>
+        <w:rPr>
+          <w:sz w:val="24"/>
+          <w:szCs w:val="22"/>
+        </w:rPr>
+        <w:t>wait.withTimeout</w:t>
+      </w:r>
+      <w:proofErr w:type="spellEnd"/>
+      <w:r>
+        <w:rPr>
+          <w:sz w:val="24"/>
+          <w:szCs w:val="22"/>
+        </w:rPr>
+        <w:t>(</w:t>
+      </w:r>
+      <w:proofErr w:type="spellStart"/>
+      <w:proofErr w:type="gramEnd"/>
+      <w:r>
+        <w:rPr>
+          <w:sz w:val="24"/>
+          <w:szCs w:val="22"/>
+        </w:rPr>
+        <w:t>Duration.ofSeconds</w:t>
+      </w:r>
+      <w:proofErr w:type="spellEnd"/>
+      <w:r>
+        <w:rPr>
+          <w:sz w:val="24"/>
+          <w:szCs w:val="22"/>
+        </w:rPr>
+        <w:t>(10))</w:t>
       </w:r>
     </w:p>
     <w:p>
@@ -7836,7 +8399,32 @@
           <w:sz w:val="24"/>
           <w:szCs w:val="22"/>
         </w:rPr>
-        <w:t>.ignoring(NoSuchElementException.class)</w:t>
+        <w:t>.</w:t>
+      </w:r>
+      <w:proofErr w:type="gramStart"/>
+      <w:r>
+        <w:rPr>
+          <w:sz w:val="24"/>
+          <w:szCs w:val="22"/>
+        </w:rPr>
+        <w:t>ignoring(</w:t>
+      </w:r>
+      <w:proofErr w:type="spellStart"/>
+      <w:proofErr w:type="gramEnd"/>
+      <w:r>
+        <w:rPr>
+          <w:sz w:val="24"/>
+          <w:szCs w:val="22"/>
+        </w:rPr>
+        <w:t>NoSuchElementException.class</w:t>
+      </w:r>
+      <w:proofErr w:type="spellEnd"/>
+      <w:r>
+        <w:rPr>
+          <w:sz w:val="24"/>
+          <w:szCs w:val="22"/>
+        </w:rPr>
+        <w:t>)</w:t>
       </w:r>
     </w:p>
     <w:p>
@@ -7852,7 +8440,32 @@
           <w:sz w:val="24"/>
           <w:szCs w:val="22"/>
         </w:rPr>
-        <w:t>.pollingEvery(Duration.ofMillis(1))                .until(ExpectedConditions.visibilityOfElementLocated(By.name("username"))).sendKeys("admin");</w:t>
+        <w:t>.</w:t>
+      </w:r>
+      <w:proofErr w:type="gramStart"/>
+      <w:r>
+        <w:rPr>
+          <w:sz w:val="24"/>
+          <w:szCs w:val="22"/>
+        </w:rPr>
+        <w:t>pollingEvery(</w:t>
+      </w:r>
+      <w:proofErr w:type="spellStart"/>
+      <w:proofErr w:type="gramEnd"/>
+      <w:r>
+        <w:rPr>
+          <w:sz w:val="24"/>
+          <w:szCs w:val="22"/>
+        </w:rPr>
+        <w:t>Duration.ofMillis</w:t>
+      </w:r>
+      <w:proofErr w:type="spellEnd"/>
+      <w:r>
+        <w:rPr>
+          <w:sz w:val="24"/>
+          <w:szCs w:val="22"/>
+        </w:rPr>
+        <w:t>(1))                .until(ExpectedConditions.visibilityOfElementLocated(By.name("username"))).sendKeys("admin");</w:t>
       </w:r>
     </w:p>
     <w:p>
@@ -7922,6 +8535,8 @@
           <w:szCs w:val="22"/>
         </w:rPr>
       </w:pPr>
+      <w:proofErr w:type="spellStart"/>
+      <w:proofErr w:type="gramStart"/>
       <w:r>
         <w:rPr>
           <w:b/>
@@ -7929,16 +8544,9 @@
           <w:sz w:val="24"/>
           <w:szCs w:val="22"/>
         </w:rPr>
-        <w:t>driver.get("https://omayo.blogspot.com/");</w:t>
-      </w:r>
-    </w:p>
-    <w:p>
-      <w:pPr>
-        <w:rPr>
-          <w:sz w:val="24"/>
-          <w:szCs w:val="22"/>
-        </w:rPr>
-      </w:pPr>
+        <w:t>driver.get</w:t>
+      </w:r>
+      <w:proofErr w:type="spellEnd"/>
       <w:r>
         <w:rPr>
           <w:b/>
@@ -7946,7 +8554,54 @@
           <w:sz w:val="24"/>
           <w:szCs w:val="22"/>
         </w:rPr>
-        <w:t xml:space="preserve">        driver.manage().timeouts().pageLoadTimeout(Duration.ofSeconds(20));</w:t>
+        <w:t>(</w:t>
+      </w:r>
+      <w:proofErr w:type="gramEnd"/>
+      <w:r>
+        <w:rPr>
+          <w:b/>
+          <w:bCs/>
+          <w:sz w:val="24"/>
+          <w:szCs w:val="22"/>
+        </w:rPr>
+        <w:t>"https://omayo.blogspot.com/");</w:t>
+      </w:r>
+    </w:p>
+    <w:p>
+      <w:pPr>
+        <w:rPr>
+          <w:sz w:val="24"/>
+          <w:szCs w:val="22"/>
+        </w:rPr>
+      </w:pPr>
+      <w:r>
+        <w:rPr>
+          <w:b/>
+          <w:bCs/>
+          <w:sz w:val="24"/>
+          <w:szCs w:val="22"/>
+        </w:rPr>
+        <w:t xml:space="preserve">        </w:t>
+      </w:r>
+      <w:proofErr w:type="gramStart"/>
+      <w:r>
+        <w:rPr>
+          <w:b/>
+          <w:bCs/>
+          <w:sz w:val="24"/>
+          <w:szCs w:val="22"/>
+        </w:rPr>
+        <w:t>driver.manage(</w:t>
+      </w:r>
+      <w:proofErr w:type="gramEnd"/>
+      <w:r>
+        <w:rPr>
+          <w:b/>
+          <w:bCs/>
+          <w:sz w:val="24"/>
+          <w:szCs w:val="22"/>
+        </w:rPr>
+        <w:t>).timeouts().pageLoadTimeout(Duration.ofSeconds(20));</w:t>
       </w:r>
       <w:r>
         <w:rPr>
@@ -8138,8 +8793,9 @@
           <w:szCs w:val="23"/>
           <w:lang w:eastAsia="en-IN"/>
         </w:rPr>
-        <w:t>Set&lt;String&gt;windows = driver.getWindowHandles();</w:t>
-      </w:r>
+        <w:t xml:space="preserve">Set&lt;String&gt;windows = </w:t>
+      </w:r>
+      <w:proofErr w:type="spellStart"/>
       <w:r>
         <w:rPr>
           <w:rFonts w:ascii="Courier New" w:eastAsia="Times New Roman" w:hAnsi="Courier New" w:cs="Courier New"/>
@@ -8148,7 +8804,38 @@
           <w:szCs w:val="23"/>
           <w:lang w:eastAsia="en-IN"/>
         </w:rPr>
+        <w:t>driver.getWindowHandles</w:t>
+      </w:r>
+      <w:proofErr w:type="spellEnd"/>
+      <w:r>
+        <w:rPr>
+          <w:rFonts w:ascii="Courier New" w:eastAsia="Times New Roman" w:hAnsi="Courier New" w:cs="Courier New"/>
+          <w:color w:val="BCBEC4"/>
+          <w:sz w:val="23"/>
+          <w:szCs w:val="23"/>
+          <w:lang w:eastAsia="en-IN"/>
+        </w:rPr>
+        <w:t>();</w:t>
+      </w:r>
+      <w:r>
+        <w:rPr>
+          <w:rFonts w:ascii="Courier New" w:eastAsia="Times New Roman" w:hAnsi="Courier New" w:cs="Courier New"/>
+          <w:color w:val="BCBEC4"/>
+          <w:sz w:val="23"/>
+          <w:szCs w:val="23"/>
+          <w:lang w:eastAsia="en-IN"/>
+        </w:rPr>
         <w:br/>
+      </w:r>
+      <w:proofErr w:type="spellStart"/>
+      <w:r>
+        <w:rPr>
+          <w:rFonts w:ascii="Courier New" w:eastAsia="Times New Roman" w:hAnsi="Courier New" w:cs="Courier New"/>
+          <w:color w:val="BCBEC4"/>
+          <w:sz w:val="23"/>
+          <w:szCs w:val="23"/>
+          <w:lang w:eastAsia="en-IN"/>
+        </w:rPr>
         <w:t>System.</w:t>
       </w:r>
       <w:r>
@@ -8171,8 +8858,9 @@
           <w:szCs w:val="23"/>
           <w:lang w:eastAsia="en-IN"/>
         </w:rPr>
-        <w:t>.println(windows);</w:t>
-      </w:r>
+        <w:t>.println</w:t>
+      </w:r>
+      <w:proofErr w:type="spellEnd"/>
       <w:r>
         <w:rPr>
           <w:rFonts w:ascii="Courier New" w:eastAsia="Times New Roman" w:hAnsi="Courier New" w:cs="Courier New"/>
@@ -8181,7 +8869,7 @@
           <w:szCs w:val="23"/>
           <w:lang w:eastAsia="en-IN"/>
         </w:rPr>
-        <w:br/>
+        <w:t>(windows);</w:t>
       </w:r>
       <w:r>
         <w:rPr>
@@ -8192,7 +8880,6 @@
           <w:lang w:eastAsia="en-IN"/>
         </w:rPr>
         <w:br/>
-        <w:t>Object[] winArray = windows.toArray();</w:t>
       </w:r>
       <w:r>
         <w:rPr>
@@ -8203,7 +8890,84 @@
           <w:lang w:eastAsia="en-IN"/>
         </w:rPr>
         <w:br/>
-        <w:t>String win1 = winArray[</w:t>
+        <w:t xml:space="preserve">Object[] </w:t>
+      </w:r>
+      <w:proofErr w:type="spellStart"/>
+      <w:r>
+        <w:rPr>
+          <w:rFonts w:ascii="Courier New" w:eastAsia="Times New Roman" w:hAnsi="Courier New" w:cs="Courier New"/>
+          <w:color w:val="BCBEC4"/>
+          <w:sz w:val="23"/>
+          <w:szCs w:val="23"/>
+          <w:lang w:eastAsia="en-IN"/>
+        </w:rPr>
+        <w:t>winArray</w:t>
+      </w:r>
+      <w:proofErr w:type="spellEnd"/>
+      <w:r>
+        <w:rPr>
+          <w:rFonts w:ascii="Courier New" w:eastAsia="Times New Roman" w:hAnsi="Courier New" w:cs="Courier New"/>
+          <w:color w:val="BCBEC4"/>
+          <w:sz w:val="23"/>
+          <w:szCs w:val="23"/>
+          <w:lang w:eastAsia="en-IN"/>
+        </w:rPr>
+        <w:t xml:space="preserve"> = </w:t>
+      </w:r>
+      <w:proofErr w:type="spellStart"/>
+      <w:r>
+        <w:rPr>
+          <w:rFonts w:ascii="Courier New" w:eastAsia="Times New Roman" w:hAnsi="Courier New" w:cs="Courier New"/>
+          <w:color w:val="BCBEC4"/>
+          <w:sz w:val="23"/>
+          <w:szCs w:val="23"/>
+          <w:lang w:eastAsia="en-IN"/>
+        </w:rPr>
+        <w:t>windows.toArray</w:t>
+      </w:r>
+      <w:proofErr w:type="spellEnd"/>
+      <w:r>
+        <w:rPr>
+          <w:rFonts w:ascii="Courier New" w:eastAsia="Times New Roman" w:hAnsi="Courier New" w:cs="Courier New"/>
+          <w:color w:val="BCBEC4"/>
+          <w:sz w:val="23"/>
+          <w:szCs w:val="23"/>
+          <w:lang w:eastAsia="en-IN"/>
+        </w:rPr>
+        <w:t>();</w:t>
+      </w:r>
+      <w:r>
+        <w:rPr>
+          <w:rFonts w:ascii="Courier New" w:eastAsia="Times New Roman" w:hAnsi="Courier New" w:cs="Courier New"/>
+          <w:color w:val="BCBEC4"/>
+          <w:sz w:val="23"/>
+          <w:szCs w:val="23"/>
+          <w:lang w:eastAsia="en-IN"/>
+        </w:rPr>
+        <w:br/>
+        <w:t xml:space="preserve">String win1 = </w:t>
+      </w:r>
+      <w:proofErr w:type="spellStart"/>
+      <w:r>
+        <w:rPr>
+          <w:rFonts w:ascii="Courier New" w:eastAsia="Times New Roman" w:hAnsi="Courier New" w:cs="Courier New"/>
+          <w:color w:val="BCBEC4"/>
+          <w:sz w:val="23"/>
+          <w:szCs w:val="23"/>
+          <w:lang w:eastAsia="en-IN"/>
+        </w:rPr>
+        <w:t>winArray</w:t>
+      </w:r>
+      <w:proofErr w:type="spellEnd"/>
+      <w:r>
+        <w:rPr>
+          <w:rFonts w:ascii="Courier New" w:eastAsia="Times New Roman" w:hAnsi="Courier New" w:cs="Courier New"/>
+          <w:color w:val="BCBEC4"/>
+          <w:sz w:val="23"/>
+          <w:szCs w:val="23"/>
+          <w:lang w:eastAsia="en-IN"/>
+        </w:rPr>
+        <w:t>[</w:t>
       </w:r>
       <w:r>
         <w:rPr>
@@ -8223,7 +8987,29 @@
           <w:szCs w:val="23"/>
           <w:lang w:eastAsia="en-IN"/>
         </w:rPr>
-        <w:t xml:space="preserve">].toString();       </w:t>
+        <w:t>].</w:t>
+      </w:r>
+      <w:proofErr w:type="spellStart"/>
+      <w:r>
+        <w:rPr>
+          <w:rFonts w:ascii="Courier New" w:eastAsia="Times New Roman" w:hAnsi="Courier New" w:cs="Courier New"/>
+          <w:color w:val="BCBEC4"/>
+          <w:sz w:val="23"/>
+          <w:szCs w:val="23"/>
+          <w:lang w:eastAsia="en-IN"/>
+        </w:rPr>
+        <w:t>toString</w:t>
+      </w:r>
+      <w:proofErr w:type="spellEnd"/>
+      <w:r>
+        <w:rPr>
+          <w:rFonts w:ascii="Courier New" w:eastAsia="Times New Roman" w:hAnsi="Courier New" w:cs="Courier New"/>
+          <w:color w:val="BCBEC4"/>
+          <w:sz w:val="23"/>
+          <w:szCs w:val="23"/>
+          <w:lang w:eastAsia="en-IN"/>
+        </w:rPr>
+        <w:t xml:space="preserve">();       </w:t>
       </w:r>
       <w:r>
         <w:rPr>
@@ -8254,7 +9040,29 @@
           <w:lang w:eastAsia="en-IN"/>
         </w:rPr>
         <w:lastRenderedPageBreak/>
-        <w:t>String win2 = winArray[</w:t>
+        <w:t xml:space="preserve">String win2 = </w:t>
+      </w:r>
+      <w:proofErr w:type="spellStart"/>
+      <w:r>
+        <w:rPr>
+          <w:rFonts w:ascii="Courier New" w:eastAsia="Times New Roman" w:hAnsi="Courier New" w:cs="Courier New"/>
+          <w:color w:val="BCBEC4"/>
+          <w:sz w:val="23"/>
+          <w:szCs w:val="23"/>
+          <w:lang w:eastAsia="en-IN"/>
+        </w:rPr>
+        <w:t>winArray</w:t>
+      </w:r>
+      <w:proofErr w:type="spellEnd"/>
+      <w:r>
+        <w:rPr>
+          <w:rFonts w:ascii="Courier New" w:eastAsia="Times New Roman" w:hAnsi="Courier New" w:cs="Courier New"/>
+          <w:color w:val="BCBEC4"/>
+          <w:sz w:val="23"/>
+          <w:szCs w:val="23"/>
+          <w:lang w:eastAsia="en-IN"/>
+        </w:rPr>
+        <w:t>[</w:t>
       </w:r>
       <w:r>
         <w:rPr>
@@ -8274,7 +9082,29 @@
           <w:szCs w:val="23"/>
           <w:lang w:eastAsia="en-IN"/>
         </w:rPr>
-        <w:t xml:space="preserve">].toString();       </w:t>
+        <w:t>].</w:t>
+      </w:r>
+      <w:proofErr w:type="spellStart"/>
+      <w:r>
+        <w:rPr>
+          <w:rFonts w:ascii="Courier New" w:eastAsia="Times New Roman" w:hAnsi="Courier New" w:cs="Courier New"/>
+          <w:color w:val="BCBEC4"/>
+          <w:sz w:val="23"/>
+          <w:szCs w:val="23"/>
+          <w:lang w:eastAsia="en-IN"/>
+        </w:rPr>
+        <w:t>toString</w:t>
+      </w:r>
+      <w:proofErr w:type="spellEnd"/>
+      <w:r>
+        <w:rPr>
+          <w:rFonts w:ascii="Courier New" w:eastAsia="Times New Roman" w:hAnsi="Courier New" w:cs="Courier New"/>
+          <w:color w:val="BCBEC4"/>
+          <w:sz w:val="23"/>
+          <w:szCs w:val="23"/>
+          <w:lang w:eastAsia="en-IN"/>
+        </w:rPr>
+        <w:t xml:space="preserve">();       </w:t>
       </w:r>
       <w:r>
         <w:rPr>
@@ -8306,6 +9136,7 @@
         </w:rPr>
         <w:br/>
       </w:r>
+      <w:proofErr w:type="spellStart"/>
       <w:r>
         <w:rPr>
           <w:rFonts w:ascii="Courier New" w:eastAsia="Times New Roman" w:hAnsi="Courier New" w:cs="Courier New"/>
@@ -8314,7 +9145,18 @@
           <w:szCs w:val="23"/>
           <w:lang w:eastAsia="en-IN"/>
         </w:rPr>
-        <w:t>driver.switchTo().window(win2);</w:t>
+        <w:t>driver.switchTo</w:t>
+      </w:r>
+      <w:proofErr w:type="spellEnd"/>
+      <w:r>
+        <w:rPr>
+          <w:rFonts w:ascii="Courier New" w:eastAsia="Times New Roman" w:hAnsi="Courier New" w:cs="Courier New"/>
+          <w:color w:val="BCBEC4"/>
+          <w:sz w:val="23"/>
+          <w:szCs w:val="23"/>
+          <w:lang w:eastAsia="en-IN"/>
+        </w:rPr>
+        <w:t>().window(win2);</w:t>
       </w:r>
     </w:p>
     <w:p>
@@ -8384,8 +9226,9 @@
           <w:szCs w:val="23"/>
           <w:lang w:eastAsia="en-IN"/>
         </w:rPr>
-        <w:t>Iterator&lt;String&gt;itr = windows.iterator();</w:t>
-      </w:r>
+        <w:t>Iterator&lt;String&gt;</w:t>
+      </w:r>
+      <w:proofErr w:type="spellStart"/>
       <w:r>
         <w:rPr>
           <w:rFonts w:ascii="Courier New" w:eastAsia="Times New Roman" w:hAnsi="Courier New" w:cs="Courier New"/>
@@ -8394,6 +9237,61 @@
           <w:szCs w:val="23"/>
           <w:lang w:eastAsia="en-IN"/>
         </w:rPr>
+        <w:t>itr</w:t>
+      </w:r>
+      <w:proofErr w:type="spellEnd"/>
+      <w:r>
+        <w:rPr>
+          <w:rFonts w:ascii="Courier New" w:eastAsia="Times New Roman" w:hAnsi="Courier New" w:cs="Courier New"/>
+          <w:color w:val="BCBEC4"/>
+          <w:sz w:val="23"/>
+          <w:szCs w:val="23"/>
+          <w:lang w:eastAsia="en-IN"/>
+        </w:rPr>
+        <w:t xml:space="preserve"> = </w:t>
+      </w:r>
+      <w:proofErr w:type="spellStart"/>
+      <w:proofErr w:type="gramStart"/>
+      <w:r>
+        <w:rPr>
+          <w:rFonts w:ascii="Courier New" w:eastAsia="Times New Roman" w:hAnsi="Courier New" w:cs="Courier New"/>
+          <w:color w:val="BCBEC4"/>
+          <w:sz w:val="23"/>
+          <w:szCs w:val="23"/>
+          <w:lang w:eastAsia="en-IN"/>
+        </w:rPr>
+        <w:t>windows.iterator</w:t>
+      </w:r>
+      <w:proofErr w:type="spellEnd"/>
+      <w:r>
+        <w:rPr>
+          <w:rFonts w:ascii="Courier New" w:eastAsia="Times New Roman" w:hAnsi="Courier New" w:cs="Courier New"/>
+          <w:color w:val="BCBEC4"/>
+          <w:sz w:val="23"/>
+          <w:szCs w:val="23"/>
+          <w:lang w:eastAsia="en-IN"/>
+        </w:rPr>
+        <w:t>(</w:t>
+      </w:r>
+      <w:proofErr w:type="gramEnd"/>
+      <w:r>
+        <w:rPr>
+          <w:rFonts w:ascii="Courier New" w:eastAsia="Times New Roman" w:hAnsi="Courier New" w:cs="Courier New"/>
+          <w:color w:val="BCBEC4"/>
+          <w:sz w:val="23"/>
+          <w:szCs w:val="23"/>
+          <w:lang w:eastAsia="en-IN"/>
+        </w:rPr>
+        <w:t>);</w:t>
+      </w:r>
+      <w:r>
+        <w:rPr>
+          <w:rFonts w:ascii="Courier New" w:eastAsia="Times New Roman" w:hAnsi="Courier New" w:cs="Courier New"/>
+          <w:color w:val="BCBEC4"/>
+          <w:sz w:val="23"/>
+          <w:szCs w:val="23"/>
+          <w:lang w:eastAsia="en-IN"/>
+        </w:rPr>
         <w:br/>
       </w:r>
       <w:r>
@@ -8424,8 +9322,9 @@
           <w:szCs w:val="23"/>
           <w:lang w:eastAsia="en-IN"/>
         </w:rPr>
-        <w:t>String win1 = itr.next();</w:t>
-      </w:r>
+        <w:t xml:space="preserve">String win1 = </w:t>
+      </w:r>
+      <w:proofErr w:type="spellStart"/>
       <w:r>
         <w:rPr>
           <w:rFonts w:ascii="Courier New" w:eastAsia="Times New Roman" w:hAnsi="Courier New" w:cs="Courier New"/>
@@ -8434,8 +9333,51 @@
           <w:szCs w:val="23"/>
           <w:lang w:eastAsia="en-IN"/>
         </w:rPr>
+        <w:t>itr.next</w:t>
+      </w:r>
+      <w:proofErr w:type="spellEnd"/>
+      <w:r>
+        <w:rPr>
+          <w:rFonts w:ascii="Courier New" w:eastAsia="Times New Roman" w:hAnsi="Courier New" w:cs="Courier New"/>
+          <w:color w:val="BCBEC4"/>
+          <w:sz w:val="23"/>
+          <w:szCs w:val="23"/>
+          <w:lang w:eastAsia="en-IN"/>
+        </w:rPr>
+        <w:t>();</w:t>
+      </w:r>
+      <w:r>
+        <w:rPr>
+          <w:rFonts w:ascii="Courier New" w:eastAsia="Times New Roman" w:hAnsi="Courier New" w:cs="Courier New"/>
+          <w:color w:val="BCBEC4"/>
+          <w:sz w:val="23"/>
+          <w:szCs w:val="23"/>
+          <w:lang w:eastAsia="en-IN"/>
+        </w:rPr>
         <w:br/>
-        <w:t>String win2 = itr.next();</w:t>
+        <w:t xml:space="preserve">String win2 = </w:t>
+      </w:r>
+      <w:proofErr w:type="spellStart"/>
+      <w:r>
+        <w:rPr>
+          <w:rFonts w:ascii="Courier New" w:eastAsia="Times New Roman" w:hAnsi="Courier New" w:cs="Courier New"/>
+          <w:color w:val="BCBEC4"/>
+          <w:sz w:val="23"/>
+          <w:szCs w:val="23"/>
+          <w:lang w:eastAsia="en-IN"/>
+        </w:rPr>
+        <w:t>itr.next</w:t>
+      </w:r>
+      <w:proofErr w:type="spellEnd"/>
+      <w:r>
+        <w:rPr>
+          <w:rFonts w:ascii="Courier New" w:eastAsia="Times New Roman" w:hAnsi="Courier New" w:cs="Courier New"/>
+          <w:color w:val="BCBEC4"/>
+          <w:sz w:val="23"/>
+          <w:szCs w:val="23"/>
+          <w:lang w:eastAsia="en-IN"/>
+        </w:rPr>
+        <w:t>();</w:t>
       </w:r>
     </w:p>
     <w:p>
@@ -8720,12 +9662,30 @@
           <w:szCs w:val="22"/>
         </w:rPr>
       </w:pPr>
-      <w:r>
-        <w:rPr>
-          <w:sz w:val="24"/>
-          <w:szCs w:val="22"/>
-        </w:rPr>
-        <w:t xml:space="preserve">driver.switchTo().alert() </w:t>
+      <w:proofErr w:type="spellStart"/>
+      <w:proofErr w:type="gramStart"/>
+      <w:r>
+        <w:rPr>
+          <w:sz w:val="24"/>
+          <w:szCs w:val="22"/>
+        </w:rPr>
+        <w:t>driver.switchTo</w:t>
+      </w:r>
+      <w:proofErr w:type="spellEnd"/>
+      <w:r>
+        <w:rPr>
+          <w:sz w:val="24"/>
+          <w:szCs w:val="22"/>
+        </w:rPr>
+        <w:t>(</w:t>
+      </w:r>
+      <w:proofErr w:type="gramEnd"/>
+      <w:r>
+        <w:rPr>
+          <w:sz w:val="24"/>
+          <w:szCs w:val="22"/>
+        </w:rPr>
+        <w:t xml:space="preserve">).alert() </w:t>
       </w:r>
       <w:r>
         <w:rPr>
@@ -8756,12 +9716,21 @@
           <w:szCs w:val="22"/>
         </w:rPr>
       </w:pPr>
-      <w:r>
-        <w:rPr>
-          <w:sz w:val="24"/>
-          <w:szCs w:val="22"/>
-        </w:rPr>
-        <w:t xml:space="preserve">getText() </w:t>
+      <w:proofErr w:type="gramStart"/>
+      <w:r>
+        <w:rPr>
+          <w:sz w:val="24"/>
+          <w:szCs w:val="22"/>
+        </w:rPr>
+        <w:t>getText(</w:t>
+      </w:r>
+      <w:proofErr w:type="gramEnd"/>
+      <w:r>
+        <w:rPr>
+          <w:sz w:val="24"/>
+          <w:szCs w:val="22"/>
+        </w:rPr>
+        <w:t xml:space="preserve">) </w:t>
       </w:r>
       <w:r>
         <w:rPr>
@@ -9128,12 +10097,21 @@
           <w:szCs w:val="22"/>
         </w:rPr>
       </w:pPr>
-      <w:r>
-        <w:rPr>
-          <w:sz w:val="24"/>
-          <w:szCs w:val="22"/>
-        </w:rPr>
-        <w:t xml:space="preserve">moveToElement() </w:t>
+      <w:proofErr w:type="gramStart"/>
+      <w:r>
+        <w:rPr>
+          <w:sz w:val="24"/>
+          <w:szCs w:val="22"/>
+        </w:rPr>
+        <w:t>moveToElement(</w:t>
+      </w:r>
+      <w:proofErr w:type="gramEnd"/>
+      <w:r>
+        <w:rPr>
+          <w:sz w:val="24"/>
+          <w:szCs w:val="22"/>
+        </w:rPr>
+        <w:t xml:space="preserve">) </w:t>
       </w:r>
       <w:r>
         <w:rPr>
@@ -9162,12 +10140,21 @@
           <w:szCs w:val="22"/>
         </w:rPr>
       </w:pPr>
-      <w:r>
-        <w:rPr>
-          <w:sz w:val="24"/>
-          <w:szCs w:val="22"/>
-        </w:rPr>
-        <w:t xml:space="preserve">perform() </w:t>
+      <w:proofErr w:type="gramStart"/>
+      <w:r>
+        <w:rPr>
+          <w:sz w:val="24"/>
+          <w:szCs w:val="22"/>
+        </w:rPr>
+        <w:t>perform(</w:t>
+      </w:r>
+      <w:proofErr w:type="gramEnd"/>
+      <w:r>
+        <w:rPr>
+          <w:sz w:val="24"/>
+          <w:szCs w:val="22"/>
+        </w:rPr>
+        <w:t xml:space="preserve">) </w:t>
       </w:r>
       <w:r>
         <w:rPr>
@@ -9298,12 +10285,30 @@
           <w:szCs w:val="22"/>
         </w:rPr>
       </w:pPr>
-      <w:r>
-        <w:rPr>
-          <w:sz w:val="24"/>
-          <w:szCs w:val="22"/>
-        </w:rPr>
-        <w:t xml:space="preserve">dragAndDropBy() </w:t>
+      <w:proofErr w:type="spellStart"/>
+      <w:proofErr w:type="gramStart"/>
+      <w:r>
+        <w:rPr>
+          <w:sz w:val="24"/>
+          <w:szCs w:val="22"/>
+        </w:rPr>
+        <w:t>dragAndDropBy</w:t>
+      </w:r>
+      <w:proofErr w:type="spellEnd"/>
+      <w:r>
+        <w:rPr>
+          <w:sz w:val="24"/>
+          <w:szCs w:val="22"/>
+        </w:rPr>
+        <w:t>(</w:t>
+      </w:r>
+      <w:proofErr w:type="gramEnd"/>
+      <w:r>
+        <w:rPr>
+          <w:sz w:val="24"/>
+          <w:szCs w:val="22"/>
+        </w:rPr>
+        <w:t xml:space="preserve">) </w:t>
       </w:r>
       <w:r>
         <w:rPr>
@@ -9365,7 +10370,39 @@
           <w:sz w:val="24"/>
           <w:szCs w:val="22"/>
         </w:rPr>
-        <w:t>For handling #shadow-root(open) first read the parent tag of #shadow-root control and then using getShadowRoot() method read the control</w:t>
+        <w:t>For handling #shadow-</w:t>
+      </w:r>
+      <w:proofErr w:type="gramStart"/>
+      <w:r>
+        <w:rPr>
+          <w:sz w:val="24"/>
+          <w:szCs w:val="22"/>
+        </w:rPr>
+        <w:t>root(</w:t>
+      </w:r>
+      <w:proofErr w:type="gramEnd"/>
+      <w:r>
+        <w:rPr>
+          <w:sz w:val="24"/>
+          <w:szCs w:val="22"/>
+        </w:rPr>
+        <w:t xml:space="preserve">open) first read the parent tag of #shadow-root control and then using </w:t>
+      </w:r>
+      <w:proofErr w:type="spellStart"/>
+      <w:r>
+        <w:rPr>
+          <w:sz w:val="24"/>
+          <w:szCs w:val="22"/>
+        </w:rPr>
+        <w:t>getShadowRoot</w:t>
+      </w:r>
+      <w:proofErr w:type="spellEnd"/>
+      <w:r>
+        <w:rPr>
+          <w:sz w:val="24"/>
+          <w:szCs w:val="22"/>
+        </w:rPr>
+        <w:t>() method read the control</w:t>
       </w:r>
     </w:p>
     <w:p>
@@ -9398,6 +10435,7 @@
           <w:lang w:eastAsia="en-IN"/>
         </w:rPr>
       </w:pPr>
+      <w:proofErr w:type="spellStart"/>
       <w:r>
         <w:rPr>
           <w:rFonts w:ascii="Courier New" w:eastAsia="Times New Roman" w:hAnsi="Courier New" w:cs="Courier New"/>
@@ -9406,7 +10444,74 @@
           <w:szCs w:val="23"/>
           <w:lang w:eastAsia="en-IN"/>
         </w:rPr>
-        <w:t>SearchContext ss = driver.findElement(By.</w:t>
+        <w:t>SearchContext</w:t>
+      </w:r>
+      <w:proofErr w:type="spellEnd"/>
+      <w:r>
+        <w:rPr>
+          <w:rFonts w:ascii="Courier New" w:eastAsia="Times New Roman" w:hAnsi="Courier New" w:cs="Courier New"/>
+          <w:color w:val="BCBEC4"/>
+          <w:sz w:val="23"/>
+          <w:szCs w:val="23"/>
+          <w:lang w:eastAsia="en-IN"/>
+        </w:rPr>
+        <w:t xml:space="preserve"> </w:t>
+      </w:r>
+      <w:proofErr w:type="spellStart"/>
+      <w:r>
+        <w:rPr>
+          <w:rFonts w:ascii="Courier New" w:eastAsia="Times New Roman" w:hAnsi="Courier New" w:cs="Courier New"/>
+          <w:color w:val="BCBEC4"/>
+          <w:sz w:val="23"/>
+          <w:szCs w:val="23"/>
+          <w:lang w:eastAsia="en-IN"/>
+        </w:rPr>
+        <w:t>ss</w:t>
+      </w:r>
+      <w:proofErr w:type="spellEnd"/>
+      <w:r>
+        <w:rPr>
+          <w:rFonts w:ascii="Courier New" w:eastAsia="Times New Roman" w:hAnsi="Courier New" w:cs="Courier New"/>
+          <w:color w:val="BCBEC4"/>
+          <w:sz w:val="23"/>
+          <w:szCs w:val="23"/>
+          <w:lang w:eastAsia="en-IN"/>
+        </w:rPr>
+        <w:t xml:space="preserve"> = </w:t>
+      </w:r>
+      <w:proofErr w:type="spellStart"/>
+      <w:proofErr w:type="gramStart"/>
+      <w:r>
+        <w:rPr>
+          <w:rFonts w:ascii="Courier New" w:eastAsia="Times New Roman" w:hAnsi="Courier New" w:cs="Courier New"/>
+          <w:color w:val="BCBEC4"/>
+          <w:sz w:val="23"/>
+          <w:szCs w:val="23"/>
+          <w:lang w:eastAsia="en-IN"/>
+        </w:rPr>
+        <w:t>driver.findElement</w:t>
+      </w:r>
+      <w:proofErr w:type="spellEnd"/>
+      <w:r>
+        <w:rPr>
+          <w:rFonts w:ascii="Courier New" w:eastAsia="Times New Roman" w:hAnsi="Courier New" w:cs="Courier New"/>
+          <w:color w:val="BCBEC4"/>
+          <w:sz w:val="23"/>
+          <w:szCs w:val="23"/>
+          <w:lang w:eastAsia="en-IN"/>
+        </w:rPr>
+        <w:t>(</w:t>
+      </w:r>
+      <w:proofErr w:type="gramEnd"/>
+      <w:r>
+        <w:rPr>
+          <w:rFonts w:ascii="Courier New" w:eastAsia="Times New Roman" w:hAnsi="Courier New" w:cs="Courier New"/>
+          <w:color w:val="BCBEC4"/>
+          <w:sz w:val="23"/>
+          <w:szCs w:val="23"/>
+          <w:lang w:eastAsia="en-IN"/>
+        </w:rPr>
+        <w:t>By.</w:t>
       </w:r>
       <w:r>
         <w:rPr>
@@ -9438,7 +10543,29 @@
           <w:szCs w:val="23"/>
           <w:lang w:eastAsia="en-IN"/>
         </w:rPr>
-        <w:t>"shadow_host"</w:t>
+        <w:t>"</w:t>
+      </w:r>
+      <w:proofErr w:type="spellStart"/>
+      <w:r>
+        <w:rPr>
+          <w:rFonts w:ascii="Courier New" w:eastAsia="Times New Roman" w:hAnsi="Courier New" w:cs="Courier New"/>
+          <w:color w:val="6AAB73"/>
+          <w:sz w:val="23"/>
+          <w:szCs w:val="23"/>
+          <w:lang w:eastAsia="en-IN"/>
+        </w:rPr>
+        <w:t>shadow_host</w:t>
+      </w:r>
+      <w:proofErr w:type="spellEnd"/>
+      <w:r>
+        <w:rPr>
+          <w:rFonts w:ascii="Courier New" w:eastAsia="Times New Roman" w:hAnsi="Courier New" w:cs="Courier New"/>
+          <w:color w:val="6AAB73"/>
+          <w:sz w:val="23"/>
+          <w:szCs w:val="23"/>
+          <w:lang w:eastAsia="en-IN"/>
+        </w:rPr>
+        <w:t>"</w:t>
       </w:r>
       <w:r>
         <w:rPr>
@@ -9448,7 +10575,29 @@
           <w:szCs w:val="23"/>
           <w:lang w:eastAsia="en-IN"/>
         </w:rPr>
-        <w:t>)).getShadowRoot();</w:t>
+        <w:t>)).</w:t>
+      </w:r>
+      <w:proofErr w:type="spellStart"/>
+      <w:r>
+        <w:rPr>
+          <w:rFonts w:ascii="Courier New" w:eastAsia="Times New Roman" w:hAnsi="Courier New" w:cs="Courier New"/>
+          <w:color w:val="BCBEC4"/>
+          <w:sz w:val="23"/>
+          <w:szCs w:val="23"/>
+          <w:lang w:eastAsia="en-IN"/>
+        </w:rPr>
+        <w:t>getShadowRoot</w:t>
+      </w:r>
+      <w:proofErr w:type="spellEnd"/>
+      <w:r>
+        <w:rPr>
+          <w:rFonts w:ascii="Courier New" w:eastAsia="Times New Roman" w:hAnsi="Courier New" w:cs="Courier New"/>
+          <w:color w:val="BCBEC4"/>
+          <w:sz w:val="23"/>
+          <w:szCs w:val="23"/>
+          <w:lang w:eastAsia="en-IN"/>
+        </w:rPr>
+        <w:t>();</w:t>
       </w:r>
       <w:r>
         <w:rPr>
@@ -9551,7 +10700,29 @@
           <w:szCs w:val="23"/>
           <w:lang w:eastAsia="en-IN"/>
         </w:rPr>
-        <w:t>"Ila Vashishth"</w:t>
+        <w:t xml:space="preserve">"Ila </w:t>
+      </w:r>
+      <w:proofErr w:type="spellStart"/>
+      <w:r>
+        <w:rPr>
+          <w:rFonts w:ascii="Courier New" w:eastAsia="Times New Roman" w:hAnsi="Courier New" w:cs="Courier New"/>
+          <w:color w:val="6AAB73"/>
+          <w:sz w:val="23"/>
+          <w:szCs w:val="23"/>
+          <w:lang w:eastAsia="en-IN"/>
+        </w:rPr>
+        <w:t>Vashishth</w:t>
+      </w:r>
+      <w:proofErr w:type="spellEnd"/>
+      <w:r>
+        <w:rPr>
+          <w:rFonts w:ascii="Courier New" w:eastAsia="Times New Roman" w:hAnsi="Courier New" w:cs="Courier New"/>
+          <w:color w:val="6AAB73"/>
+          <w:sz w:val="23"/>
+          <w:szCs w:val="23"/>
+          <w:lang w:eastAsia="en-IN"/>
+        </w:rPr>
+        <w:t>"</w:t>
       </w:r>
       <w:r>
         <w:rPr>
@@ -9629,7 +10800,96 @@
           <w:szCs w:val="23"/>
           <w:lang w:eastAsia="en-IN"/>
         </w:rPr>
-        <w:t>File screenShot = ((TakesScreenshot)driver).getScreenshotAs(OutputType.</w:t>
+        <w:t xml:space="preserve">File </w:t>
+      </w:r>
+      <w:proofErr w:type="spellStart"/>
+      <w:r>
+        <w:rPr>
+          <w:rFonts w:ascii="Courier New" w:eastAsia="Times New Roman" w:hAnsi="Courier New" w:cs="Courier New"/>
+          <w:color w:val="BCBEC4"/>
+          <w:sz w:val="23"/>
+          <w:szCs w:val="23"/>
+          <w:lang w:eastAsia="en-IN"/>
+        </w:rPr>
+        <w:t>screenShot</w:t>
+      </w:r>
+      <w:proofErr w:type="spellEnd"/>
+      <w:r>
+        <w:rPr>
+          <w:rFonts w:ascii="Courier New" w:eastAsia="Times New Roman" w:hAnsi="Courier New" w:cs="Courier New"/>
+          <w:color w:val="BCBEC4"/>
+          <w:sz w:val="23"/>
+          <w:szCs w:val="23"/>
+          <w:lang w:eastAsia="en-IN"/>
+        </w:rPr>
+        <w:t xml:space="preserve"> = ((</w:t>
+      </w:r>
+      <w:proofErr w:type="spellStart"/>
+      <w:r>
+        <w:rPr>
+          <w:rFonts w:ascii="Courier New" w:eastAsia="Times New Roman" w:hAnsi="Courier New" w:cs="Courier New"/>
+          <w:color w:val="BCBEC4"/>
+          <w:sz w:val="23"/>
+          <w:szCs w:val="23"/>
+          <w:lang w:eastAsia="en-IN"/>
+        </w:rPr>
+        <w:t>TakesScreenshot</w:t>
+      </w:r>
+      <w:proofErr w:type="spellEnd"/>
+      <w:proofErr w:type="gramStart"/>
+      <w:r>
+        <w:rPr>
+          <w:rFonts w:ascii="Courier New" w:eastAsia="Times New Roman" w:hAnsi="Courier New" w:cs="Courier New"/>
+          <w:color w:val="BCBEC4"/>
+          <w:sz w:val="23"/>
+          <w:szCs w:val="23"/>
+          <w:lang w:eastAsia="en-IN"/>
+        </w:rPr>
+        <w:t>)driver</w:t>
+      </w:r>
+      <w:proofErr w:type="gramEnd"/>
+      <w:r>
+        <w:rPr>
+          <w:rFonts w:ascii="Courier New" w:eastAsia="Times New Roman" w:hAnsi="Courier New" w:cs="Courier New"/>
+          <w:color w:val="BCBEC4"/>
+          <w:sz w:val="23"/>
+          <w:szCs w:val="23"/>
+          <w:lang w:eastAsia="en-IN"/>
+        </w:rPr>
+        <w:t>).</w:t>
+      </w:r>
+      <w:proofErr w:type="spellStart"/>
+      <w:r>
+        <w:rPr>
+          <w:rFonts w:ascii="Courier New" w:eastAsia="Times New Roman" w:hAnsi="Courier New" w:cs="Courier New"/>
+          <w:color w:val="BCBEC4"/>
+          <w:sz w:val="23"/>
+          <w:szCs w:val="23"/>
+          <w:lang w:eastAsia="en-IN"/>
+        </w:rPr>
+        <w:t>getScreenshotAs</w:t>
+      </w:r>
+      <w:proofErr w:type="spellEnd"/>
+      <w:r>
+        <w:rPr>
+          <w:rFonts w:ascii="Courier New" w:eastAsia="Times New Roman" w:hAnsi="Courier New" w:cs="Courier New"/>
+          <w:color w:val="BCBEC4"/>
+          <w:sz w:val="23"/>
+          <w:szCs w:val="23"/>
+          <w:lang w:eastAsia="en-IN"/>
+        </w:rPr>
+        <w:t>(</w:t>
+      </w:r>
+      <w:proofErr w:type="spellStart"/>
+      <w:r>
+        <w:rPr>
+          <w:rFonts w:ascii="Courier New" w:eastAsia="Times New Roman" w:hAnsi="Courier New" w:cs="Courier New"/>
+          <w:color w:val="BCBEC4"/>
+          <w:sz w:val="23"/>
+          <w:szCs w:val="23"/>
+          <w:lang w:eastAsia="en-IN"/>
+        </w:rPr>
+        <w:t>OutputType.</w:t>
       </w:r>
       <w:r>
         <w:rPr>
@@ -9643,6 +10903,7 @@
         </w:rPr>
         <w:t>FILE</w:t>
       </w:r>
+      <w:proofErr w:type="spellEnd"/>
       <w:r>
         <w:rPr>
           <w:rFonts w:ascii="Courier New" w:eastAsia="Times New Roman" w:hAnsi="Courier New" w:cs="Courier New"/>
@@ -9662,6 +10923,16 @@
           <w:lang w:eastAsia="en-IN"/>
         </w:rPr>
         <w:br/>
+      </w:r>
+      <w:proofErr w:type="spellStart"/>
+      <w:r>
+        <w:rPr>
+          <w:rFonts w:ascii="Courier New" w:eastAsia="Times New Roman" w:hAnsi="Courier New" w:cs="Courier New"/>
+          <w:color w:val="BCBEC4"/>
+          <w:sz w:val="23"/>
+          <w:szCs w:val="23"/>
+          <w:lang w:eastAsia="en-IN"/>
+        </w:rPr>
         <w:t>FileHandler.</w:t>
       </w:r>
       <w:r>
@@ -9676,6 +10947,7 @@
         </w:rPr>
         <w:t>copy</w:t>
       </w:r>
+      <w:proofErr w:type="spellEnd"/>
       <w:r>
         <w:rPr>
           <w:rFonts w:ascii="Courier New" w:eastAsia="Times New Roman" w:hAnsi="Courier New" w:cs="Courier New"/>
@@ -9684,7 +10956,29 @@
           <w:szCs w:val="23"/>
           <w:lang w:eastAsia="en-IN"/>
         </w:rPr>
-        <w:t xml:space="preserve">(screenShot, </w:t>
+        <w:t>(</w:t>
+      </w:r>
+      <w:proofErr w:type="spellStart"/>
+      <w:r>
+        <w:rPr>
+          <w:rFonts w:ascii="Courier New" w:eastAsia="Times New Roman" w:hAnsi="Courier New" w:cs="Courier New"/>
+          <w:color w:val="BCBEC4"/>
+          <w:sz w:val="23"/>
+          <w:szCs w:val="23"/>
+          <w:lang w:eastAsia="en-IN"/>
+        </w:rPr>
+        <w:t>screenShot</w:t>
+      </w:r>
+      <w:proofErr w:type="spellEnd"/>
+      <w:r>
+        <w:rPr>
+          <w:rFonts w:ascii="Courier New" w:eastAsia="Times New Roman" w:hAnsi="Courier New" w:cs="Courier New"/>
+          <w:color w:val="BCBEC4"/>
+          <w:sz w:val="23"/>
+          <w:szCs w:val="23"/>
+          <w:lang w:eastAsia="en-IN"/>
+        </w:rPr>
+        <w:t xml:space="preserve">, </w:t>
       </w:r>
       <w:r>
         <w:rPr>
@@ -9807,8 +11101,17 @@
           <w:sz w:val="24"/>
           <w:szCs w:val="22"/>
         </w:rPr>
-        <w:t>Is a testing framework which will help to make automation testing easy.</w:t>
-      </w:r>
+        <w:t xml:space="preserve">Is a testing framework which will help to make automation testing </w:t>
+      </w:r>
+      <w:proofErr w:type="gramStart"/>
+      <w:r>
+        <w:rPr>
+          <w:sz w:val="24"/>
+          <w:szCs w:val="22"/>
+        </w:rPr>
+        <w:t>easy.</w:t>
+      </w:r>
+      <w:proofErr w:type="gramEnd"/>
     </w:p>
     <w:p>
       <w:pPr>
@@ -9849,7 +11152,23 @@
           <w:sz w:val="24"/>
           <w:szCs w:val="22"/>
         </w:rPr>
-        <w:t>It is the set of rules, guidelines, best practices for automation testing.</w:t>
+        <w:t xml:space="preserve">It is the set of rules, guidelines, </w:t>
+      </w:r>
+      <w:proofErr w:type="gramStart"/>
+      <w:r>
+        <w:rPr>
+          <w:sz w:val="24"/>
+          <w:szCs w:val="22"/>
+        </w:rPr>
+        <w:t>best</w:t>
+      </w:r>
+      <w:proofErr w:type="gramEnd"/>
+      <w:r>
+        <w:rPr>
+          <w:sz w:val="24"/>
+          <w:szCs w:val="22"/>
+        </w:rPr>
+        <w:t xml:space="preserve"> practices for automation testing.</w:t>
       </w:r>
     </w:p>
     <w:p>
@@ -11040,6 +12359,168 @@
           <w:szCs w:val="22"/>
         </w:rPr>
         <w:t>Types</w:t>
+      </w:r>
+    </w:p>
+    <w:p>
+      <w:pPr>
+        <w:rPr>
+          <w:sz w:val="24"/>
+          <w:szCs w:val="22"/>
+        </w:rPr>
+      </w:pPr>
+    </w:p>
+    <w:p>
+      <w:pPr>
+        <w:rPr>
+          <w:b/>
+          <w:bCs/>
+          <w:sz w:val="24"/>
+          <w:szCs w:val="22"/>
+        </w:rPr>
+      </w:pPr>
+      <w:r>
+        <w:rPr>
+          <w:b/>
+          <w:bCs/>
+          <w:sz w:val="24"/>
+          <w:szCs w:val="22"/>
+        </w:rPr>
+        <w:t>Page Object Model (POM)</w:t>
+      </w:r>
+    </w:p>
+    <w:p>
+      <w:pPr>
+        <w:rPr>
+          <w:sz w:val="24"/>
+          <w:szCs w:val="22"/>
+        </w:rPr>
+      </w:pPr>
+      <w:r>
+        <w:rPr>
+          <w:sz w:val="24"/>
+          <w:szCs w:val="22"/>
+        </w:rPr>
+        <w:lastRenderedPageBreak/>
+        <w:t>It is the technique of converting the script in two classes</w:t>
+      </w:r>
+    </w:p>
+    <w:p>
+      <w:pPr>
+        <w:pStyle w:val="ListParagraph"/>
+        <w:numPr>
+          <w:ilvl w:val="0"/>
+          <w:numId w:val="34"/>
+        </w:numPr>
+        <w:rPr>
+          <w:sz w:val="24"/>
+          <w:szCs w:val="22"/>
+        </w:rPr>
+      </w:pPr>
+      <w:r>
+        <w:rPr>
+          <w:sz w:val="24"/>
+          <w:szCs w:val="22"/>
+        </w:rPr>
+        <w:t>Utility class – this class contains the logic of the script. The logic is created using separate methods.</w:t>
+      </w:r>
+    </w:p>
+    <w:p>
+      <w:pPr>
+        <w:pStyle w:val="ListParagraph"/>
+        <w:numPr>
+          <w:ilvl w:val="0"/>
+          <w:numId w:val="34"/>
+        </w:numPr>
+        <w:rPr>
+          <w:sz w:val="24"/>
+          <w:szCs w:val="22"/>
+        </w:rPr>
+      </w:pPr>
+      <w:r>
+        <w:rPr>
+          <w:sz w:val="24"/>
+          <w:szCs w:val="22"/>
+        </w:rPr>
+        <w:t>Client Class – this class contains @Test method those are used for execution of the script.</w:t>
+      </w:r>
+    </w:p>
+    <w:p>
+      <w:pPr>
+        <w:rPr>
+          <w:b/>
+          <w:bCs/>
+          <w:sz w:val="24"/>
+          <w:szCs w:val="22"/>
+        </w:rPr>
+      </w:pPr>
+      <w:r>
+        <w:rPr>
+          <w:b/>
+          <w:bCs/>
+          <w:sz w:val="24"/>
+          <w:szCs w:val="22"/>
+        </w:rPr>
+        <w:t>Page Factory</w:t>
+      </w:r>
+    </w:p>
+    <w:p>
+      <w:pPr>
+        <w:pStyle w:val="ListParagraph"/>
+        <w:numPr>
+          <w:ilvl w:val="0"/>
+          <w:numId w:val="35"/>
+        </w:numPr>
+        <w:rPr>
+          <w:sz w:val="24"/>
+          <w:szCs w:val="22"/>
+        </w:rPr>
+      </w:pPr>
+      <w:r>
+        <w:rPr>
+          <w:sz w:val="24"/>
+          <w:szCs w:val="22"/>
+        </w:rPr>
+        <w:t>It is the subset of Page Object Model</w:t>
+      </w:r>
+    </w:p>
+    <w:p>
+      <w:pPr>
+        <w:pStyle w:val="ListParagraph"/>
+        <w:numPr>
+          <w:ilvl w:val="0"/>
+          <w:numId w:val="35"/>
+        </w:numPr>
+        <w:rPr>
+          <w:sz w:val="24"/>
+          <w:szCs w:val="22"/>
+        </w:rPr>
+      </w:pPr>
+      <w:r>
+        <w:rPr>
+          <w:sz w:val="24"/>
+          <w:szCs w:val="22"/>
+        </w:rPr>
+        <w:t xml:space="preserve">It is actually object repository for the controls (WebElements) which are supposed to be used in the script. </w:t>
+      </w:r>
+    </w:p>
+    <w:p>
+      <w:pPr>
+        <w:pStyle w:val="ListParagraph"/>
+        <w:numPr>
+          <w:ilvl w:val="0"/>
+          <w:numId w:val="35"/>
+        </w:numPr>
+        <w:rPr>
+          <w:sz w:val="24"/>
+          <w:szCs w:val="22"/>
+        </w:rPr>
+      </w:pPr>
+      <w:r>
+        <w:rPr>
+          <w:sz w:val="24"/>
+          <w:szCs w:val="22"/>
+        </w:rPr>
+        <w:t>These objects / controls can be reused for multiple times</w:t>
       </w:r>
       <w:bookmarkStart w:id="0" w:name="_GoBack"/>
       <w:bookmarkEnd w:id="0"/>
@@ -11348,6 +12829,119 @@
     </w:lvl>
   </w:abstractNum>
   <w:abstractNum w:abstractNumId="3">
+    <w:nsid w:val="0B2F3F01"/>
+    <w:multiLevelType w:val="hybridMultilevel"/>
+    <w:tmpl w:val="CADC07B4"/>
+    <w:lvl w:ilvl="0" w:tplc="40090001">
+      <w:start w:val="1"/>
+      <w:numFmt w:val="bullet"/>
+      <w:lvlText w:val=""/>
+      <w:lvlJc w:val="left"/>
+      <w:pPr>
+        <w:ind w:left="720" w:hanging="360"/>
+      </w:pPr>
+      <w:rPr>
+        <w:rFonts w:ascii="Symbol" w:hAnsi="Symbol" w:hint="default"/>
+      </w:rPr>
+    </w:lvl>
+    <w:lvl w:ilvl="1" w:tplc="40090003" w:tentative="1">
+      <w:start w:val="1"/>
+      <w:numFmt w:val="bullet"/>
+      <w:lvlText w:val="o"/>
+      <w:lvlJc w:val="left"/>
+      <w:pPr>
+        <w:ind w:left="1440" w:hanging="360"/>
+      </w:pPr>
+      <w:rPr>
+        <w:rFonts w:ascii="Courier New" w:hAnsi="Courier New" w:cs="Courier New" w:hint="default"/>
+      </w:rPr>
+    </w:lvl>
+    <w:lvl w:ilvl="2" w:tplc="40090005" w:tentative="1">
+      <w:start w:val="1"/>
+      <w:numFmt w:val="bullet"/>
+      <w:lvlText w:val=""/>
+      <w:lvlJc w:val="left"/>
+      <w:pPr>
+        <w:ind w:left="2160" w:hanging="360"/>
+      </w:pPr>
+      <w:rPr>
+        <w:rFonts w:ascii="Wingdings" w:hAnsi="Wingdings" w:hint="default"/>
+      </w:rPr>
+    </w:lvl>
+    <w:lvl w:ilvl="3" w:tplc="40090001" w:tentative="1">
+      <w:start w:val="1"/>
+      <w:numFmt w:val="bullet"/>
+      <w:lvlText w:val=""/>
+      <w:lvlJc w:val="left"/>
+      <w:pPr>
+        <w:ind w:left="2880" w:hanging="360"/>
+      </w:pPr>
+      <w:rPr>
+        <w:rFonts w:ascii="Symbol" w:hAnsi="Symbol" w:hint="default"/>
+      </w:rPr>
+    </w:lvl>
+    <w:lvl w:ilvl="4" w:tplc="40090003" w:tentative="1">
+      <w:start w:val="1"/>
+      <w:numFmt w:val="bullet"/>
+      <w:lvlText w:val="o"/>
+      <w:lvlJc w:val="left"/>
+      <w:pPr>
+        <w:ind w:left="3600" w:hanging="360"/>
+      </w:pPr>
+      <w:rPr>
+        <w:rFonts w:ascii="Courier New" w:hAnsi="Courier New" w:cs="Courier New" w:hint="default"/>
+      </w:rPr>
+    </w:lvl>
+    <w:lvl w:ilvl="5" w:tplc="40090005" w:tentative="1">
+      <w:start w:val="1"/>
+      <w:numFmt w:val="bullet"/>
+      <w:lvlText w:val=""/>
+      <w:lvlJc w:val="left"/>
+      <w:pPr>
+        <w:ind w:left="4320" w:hanging="360"/>
+      </w:pPr>
+      <w:rPr>
+        <w:rFonts w:ascii="Wingdings" w:hAnsi="Wingdings" w:hint="default"/>
+      </w:rPr>
+    </w:lvl>
+    <w:lvl w:ilvl="6" w:tplc="40090001" w:tentative="1">
+      <w:start w:val="1"/>
+      <w:numFmt w:val="bullet"/>
+      <w:lvlText w:val=""/>
+      <w:lvlJc w:val="left"/>
+      <w:pPr>
+        <w:ind w:left="5040" w:hanging="360"/>
+      </w:pPr>
+      <w:rPr>
+        <w:rFonts w:ascii="Symbol" w:hAnsi="Symbol" w:hint="default"/>
+      </w:rPr>
+    </w:lvl>
+    <w:lvl w:ilvl="7" w:tplc="40090003" w:tentative="1">
+      <w:start w:val="1"/>
+      <w:numFmt w:val="bullet"/>
+      <w:lvlText w:val="o"/>
+      <w:lvlJc w:val="left"/>
+      <w:pPr>
+        <w:ind w:left="5760" w:hanging="360"/>
+      </w:pPr>
+      <w:rPr>
+        <w:rFonts w:ascii="Courier New" w:hAnsi="Courier New" w:cs="Courier New" w:hint="default"/>
+      </w:rPr>
+    </w:lvl>
+    <w:lvl w:ilvl="8" w:tplc="40090005" w:tentative="1">
+      <w:start w:val="1"/>
+      <w:numFmt w:val="bullet"/>
+      <w:lvlText w:val=""/>
+      <w:lvlJc w:val="left"/>
+      <w:pPr>
+        <w:ind w:left="6480" w:hanging="360"/>
+      </w:pPr>
+      <w:rPr>
+        <w:rFonts w:ascii="Wingdings" w:hAnsi="Wingdings" w:hint="default"/>
+      </w:rPr>
+    </w:lvl>
+  </w:abstractNum>
+  <w:abstractNum w:abstractNumId="4">
     <w:nsid w:val="0F571F41"/>
     <w:multiLevelType w:val="hybridMultilevel"/>
     <w:tmpl w:val="5036BC26"/>
@@ -11436,7 +13030,7 @@
       </w:pPr>
     </w:lvl>
   </w:abstractNum>
-  <w:abstractNum w:abstractNumId="4">
+  <w:abstractNum w:abstractNumId="5">
     <w:nsid w:val="101C421F"/>
     <w:multiLevelType w:val="hybridMultilevel"/>
     <w:tmpl w:val="E8023388"/>
@@ -11525,7 +13119,7 @@
       </w:pPr>
     </w:lvl>
   </w:abstractNum>
-  <w:abstractNum w:abstractNumId="5">
+  <w:abstractNum w:abstractNumId="6">
     <w:nsid w:val="20231B0F"/>
     <w:multiLevelType w:val="hybridMultilevel"/>
     <w:tmpl w:val="8B444104"/>
@@ -11638,7 +13232,7 @@
       </w:rPr>
     </w:lvl>
   </w:abstractNum>
-  <w:abstractNum w:abstractNumId="6">
+  <w:abstractNum w:abstractNumId="7">
     <w:nsid w:val="2AD0394C"/>
     <w:multiLevelType w:val="hybridMultilevel"/>
     <w:tmpl w:val="A36CD096"/>
@@ -11751,7 +13345,7 @@
       </w:rPr>
     </w:lvl>
   </w:abstractNum>
-  <w:abstractNum w:abstractNumId="7">
+  <w:abstractNum w:abstractNumId="8">
     <w:nsid w:val="2AD16229"/>
     <w:multiLevelType w:val="hybridMultilevel"/>
     <w:tmpl w:val="C5364E86"/>
@@ -11840,7 +13434,7 @@
       </w:pPr>
     </w:lvl>
   </w:abstractNum>
-  <w:abstractNum w:abstractNumId="8">
+  <w:abstractNum w:abstractNumId="9">
     <w:nsid w:val="2AF0639C"/>
     <w:multiLevelType w:val="hybridMultilevel"/>
     <w:tmpl w:val="54A22318"/>
@@ -11926,7 +13520,96 @@
       </w:pPr>
     </w:lvl>
   </w:abstractNum>
-  <w:abstractNum w:abstractNumId="9">
+  <w:abstractNum w:abstractNumId="10">
+    <w:nsid w:val="2C027330"/>
+    <w:multiLevelType w:val="hybridMultilevel"/>
+    <w:tmpl w:val="347E56F4"/>
+    <w:lvl w:ilvl="0" w:tplc="4009000F">
+      <w:start w:val="1"/>
+      <w:numFmt w:val="decimal"/>
+      <w:lvlText w:val="%1."/>
+      <w:lvlJc w:val="left"/>
+      <w:pPr>
+        <w:ind w:left="720" w:hanging="360"/>
+      </w:pPr>
+      <w:rPr>
+        <w:rFonts w:hint="default"/>
+      </w:rPr>
+    </w:lvl>
+    <w:lvl w:ilvl="1" w:tplc="40090019" w:tentative="1">
+      <w:start w:val="1"/>
+      <w:numFmt w:val="lowerLetter"/>
+      <w:lvlText w:val="%2."/>
+      <w:lvlJc w:val="left"/>
+      <w:pPr>
+        <w:ind w:left="1440" w:hanging="360"/>
+      </w:pPr>
+    </w:lvl>
+    <w:lvl w:ilvl="2" w:tplc="4009001B" w:tentative="1">
+      <w:start w:val="1"/>
+      <w:numFmt w:val="lowerRoman"/>
+      <w:lvlText w:val="%3."/>
+      <w:lvlJc w:val="right"/>
+      <w:pPr>
+        <w:ind w:left="2160" w:hanging="180"/>
+      </w:pPr>
+    </w:lvl>
+    <w:lvl w:ilvl="3" w:tplc="4009000F" w:tentative="1">
+      <w:start w:val="1"/>
+      <w:numFmt w:val="decimal"/>
+      <w:lvlText w:val="%4."/>
+      <w:lvlJc w:val="left"/>
+      <w:pPr>
+        <w:ind w:left="2880" w:hanging="360"/>
+      </w:pPr>
+    </w:lvl>
+    <w:lvl w:ilvl="4" w:tplc="40090019" w:tentative="1">
+      <w:start w:val="1"/>
+      <w:numFmt w:val="lowerLetter"/>
+      <w:lvlText w:val="%5."/>
+      <w:lvlJc w:val="left"/>
+      <w:pPr>
+        <w:ind w:left="3600" w:hanging="360"/>
+      </w:pPr>
+    </w:lvl>
+    <w:lvl w:ilvl="5" w:tplc="4009001B" w:tentative="1">
+      <w:start w:val="1"/>
+      <w:numFmt w:val="lowerRoman"/>
+      <w:lvlText w:val="%6."/>
+      <w:lvlJc w:val="right"/>
+      <w:pPr>
+        <w:ind w:left="4320" w:hanging="180"/>
+      </w:pPr>
+    </w:lvl>
+    <w:lvl w:ilvl="6" w:tplc="4009000F" w:tentative="1">
+      <w:start w:val="1"/>
+      <w:numFmt w:val="decimal"/>
+      <w:lvlText w:val="%7."/>
+      <w:lvlJc w:val="left"/>
+      <w:pPr>
+        <w:ind w:left="5040" w:hanging="360"/>
+      </w:pPr>
+    </w:lvl>
+    <w:lvl w:ilvl="7" w:tplc="40090019" w:tentative="1">
+      <w:start w:val="1"/>
+      <w:numFmt w:val="lowerLetter"/>
+      <w:lvlText w:val="%8."/>
+      <w:lvlJc w:val="left"/>
+      <w:pPr>
+        <w:ind w:left="5760" w:hanging="360"/>
+      </w:pPr>
+    </w:lvl>
+    <w:lvl w:ilvl="8" w:tplc="4009001B" w:tentative="1">
+      <w:start w:val="1"/>
+      <w:numFmt w:val="lowerRoman"/>
+      <w:lvlText w:val="%9."/>
+      <w:lvlJc w:val="right"/>
+      <w:pPr>
+        <w:ind w:left="6480" w:hanging="180"/>
+      </w:pPr>
+    </w:lvl>
+  </w:abstractNum>
+  <w:abstractNum w:abstractNumId="11">
     <w:nsid w:val="2EEE2462"/>
     <w:multiLevelType w:val="hybridMultilevel"/>
     <w:tmpl w:val="1FFC74BE"/>
@@ -12015,7 +13698,7 @@
       </w:pPr>
     </w:lvl>
   </w:abstractNum>
-  <w:abstractNum w:abstractNumId="10">
+  <w:abstractNum w:abstractNumId="12">
     <w:nsid w:val="333F2421"/>
     <w:multiLevelType w:val="hybridMultilevel"/>
     <w:tmpl w:val="85128FF8"/>
@@ -12128,7 +13811,7 @@
       </w:rPr>
     </w:lvl>
   </w:abstractNum>
-  <w:abstractNum w:abstractNumId="11">
+  <w:abstractNum w:abstractNumId="13">
     <w:nsid w:val="335B6CD0"/>
     <w:multiLevelType w:val="hybridMultilevel"/>
     <w:tmpl w:val="B8EA9D4C"/>
@@ -12217,7 +13900,7 @@
       </w:pPr>
     </w:lvl>
   </w:abstractNum>
-  <w:abstractNum w:abstractNumId="12">
+  <w:abstractNum w:abstractNumId="14">
     <w:nsid w:val="340F729A"/>
     <w:multiLevelType w:val="hybridMultilevel"/>
     <w:tmpl w:val="B2C2407E"/>
@@ -12330,7 +14013,7 @@
       </w:rPr>
     </w:lvl>
   </w:abstractNum>
-  <w:abstractNum w:abstractNumId="13">
+  <w:abstractNum w:abstractNumId="15">
     <w:nsid w:val="34DF0944"/>
     <w:multiLevelType w:val="hybridMultilevel"/>
     <w:tmpl w:val="5C885224"/>
@@ -12419,7 +14102,7 @@
       </w:pPr>
     </w:lvl>
   </w:abstractNum>
-  <w:abstractNum w:abstractNumId="14">
+  <w:abstractNum w:abstractNumId="16">
     <w:nsid w:val="35124045"/>
     <w:multiLevelType w:val="hybridMultilevel"/>
     <w:tmpl w:val="9B08084E"/>
@@ -12532,7 +14215,7 @@
       </w:rPr>
     </w:lvl>
   </w:abstractNum>
-  <w:abstractNum w:abstractNumId="15">
+  <w:abstractNum w:abstractNumId="17">
     <w:nsid w:val="4316625C"/>
     <w:multiLevelType w:val="hybridMultilevel"/>
     <w:tmpl w:val="B75E34FE"/>
@@ -12621,7 +14304,7 @@
       </w:pPr>
     </w:lvl>
   </w:abstractNum>
-  <w:abstractNum w:abstractNumId="16">
+  <w:abstractNum w:abstractNumId="18">
     <w:nsid w:val="45E943CF"/>
     <w:multiLevelType w:val="hybridMultilevel"/>
     <w:tmpl w:val="8DB25A28"/>
@@ -12710,7 +14393,7 @@
       </w:pPr>
     </w:lvl>
   </w:abstractNum>
-  <w:abstractNum w:abstractNumId="17">
+  <w:abstractNum w:abstractNumId="19">
     <w:nsid w:val="49F86A57"/>
     <w:multiLevelType w:val="hybridMultilevel"/>
     <w:tmpl w:val="0BF29674"/>
@@ -12799,7 +14482,7 @@
       </w:pPr>
     </w:lvl>
   </w:abstractNum>
-  <w:abstractNum w:abstractNumId="18">
+  <w:abstractNum w:abstractNumId="20">
     <w:nsid w:val="4AC94DD4"/>
     <w:multiLevelType w:val="hybridMultilevel"/>
     <w:tmpl w:val="5324F4FE"/>
@@ -12888,7 +14571,7 @@
       </w:pPr>
     </w:lvl>
   </w:abstractNum>
-  <w:abstractNum w:abstractNumId="19">
+  <w:abstractNum w:abstractNumId="21">
     <w:nsid w:val="5CBE3725"/>
     <w:multiLevelType w:val="hybridMultilevel"/>
     <w:tmpl w:val="4D3C6A2A"/>
@@ -12977,7 +14660,7 @@
       </w:pPr>
     </w:lvl>
   </w:abstractNum>
-  <w:abstractNum w:abstractNumId="20">
+  <w:abstractNum w:abstractNumId="22">
     <w:nsid w:val="5D6B0CD5"/>
     <w:multiLevelType w:val="hybridMultilevel"/>
     <w:tmpl w:val="FF8AE80C"/>
@@ -13090,7 +14773,7 @@
       </w:rPr>
     </w:lvl>
   </w:abstractNum>
-  <w:abstractNum w:abstractNumId="21">
+  <w:abstractNum w:abstractNumId="23">
     <w:nsid w:val="60B95D02"/>
     <w:multiLevelType w:val="hybridMultilevel"/>
     <w:tmpl w:val="D9DEA214"/>
@@ -13203,7 +14886,7 @@
       </w:rPr>
     </w:lvl>
   </w:abstractNum>
-  <w:abstractNum w:abstractNumId="22">
+  <w:abstractNum w:abstractNumId="24">
     <w:nsid w:val="6277321E"/>
     <w:multiLevelType w:val="hybridMultilevel"/>
     <w:tmpl w:val="09F2E114"/>
@@ -13292,7 +14975,7 @@
       </w:pPr>
     </w:lvl>
   </w:abstractNum>
-  <w:abstractNum w:abstractNumId="23">
+  <w:abstractNum w:abstractNumId="25">
     <w:nsid w:val="635E69DF"/>
     <w:multiLevelType w:val="hybridMultilevel"/>
     <w:tmpl w:val="7CCC2E94"/>
@@ -13381,7 +15064,7 @@
       </w:pPr>
     </w:lvl>
   </w:abstractNum>
-  <w:abstractNum w:abstractNumId="24">
+  <w:abstractNum w:abstractNumId="26">
     <w:nsid w:val="63A8624B"/>
     <w:multiLevelType w:val="hybridMultilevel"/>
     <w:tmpl w:val="ABE4FA34"/>
@@ -13470,7 +15153,7 @@
       </w:pPr>
     </w:lvl>
   </w:abstractNum>
-  <w:abstractNum w:abstractNumId="25">
+  <w:abstractNum w:abstractNumId="27">
     <w:nsid w:val="64456C49"/>
     <w:multiLevelType w:val="hybridMultilevel"/>
     <w:tmpl w:val="5F629F92"/>
@@ -13559,7 +15242,7 @@
       </w:pPr>
     </w:lvl>
   </w:abstractNum>
-  <w:abstractNum w:abstractNumId="26">
+  <w:abstractNum w:abstractNumId="28">
     <w:nsid w:val="67516CAF"/>
     <w:multiLevelType w:val="hybridMultilevel"/>
     <w:tmpl w:val="67A466EC"/>
@@ -13672,7 +15355,7 @@
       </w:rPr>
     </w:lvl>
   </w:abstractNum>
-  <w:abstractNum w:abstractNumId="27">
+  <w:abstractNum w:abstractNumId="29">
     <w:nsid w:val="698F6573"/>
     <w:multiLevelType w:val="hybridMultilevel"/>
     <w:tmpl w:val="538221D2"/>
@@ -13785,7 +15468,7 @@
       </w:rPr>
     </w:lvl>
   </w:abstractNum>
-  <w:abstractNum w:abstractNumId="28">
+  <w:abstractNum w:abstractNumId="30">
     <w:nsid w:val="6C8D1D8E"/>
     <w:multiLevelType w:val="hybridMultilevel"/>
     <w:tmpl w:val="3300155A"/>
@@ -13898,7 +15581,7 @@
       </w:rPr>
     </w:lvl>
   </w:abstractNum>
-  <w:abstractNum w:abstractNumId="29">
+  <w:abstractNum w:abstractNumId="31">
     <w:nsid w:val="6D03627E"/>
     <w:multiLevelType w:val="hybridMultilevel"/>
     <w:tmpl w:val="AF6072B4"/>
@@ -14011,7 +15694,7 @@
       </w:rPr>
     </w:lvl>
   </w:abstractNum>
-  <w:abstractNum w:abstractNumId="30">
+  <w:abstractNum w:abstractNumId="32">
     <w:nsid w:val="6F4D3C22"/>
     <w:multiLevelType w:val="hybridMultilevel"/>
     <w:tmpl w:val="2D660700"/>
@@ -14124,7 +15807,7 @@
       </w:rPr>
     </w:lvl>
   </w:abstractNum>
-  <w:abstractNum w:abstractNumId="31">
+  <w:abstractNum w:abstractNumId="33">
     <w:nsid w:val="76363541"/>
     <w:multiLevelType w:val="hybridMultilevel"/>
     <w:tmpl w:val="9D845514"/>
@@ -14237,7 +15920,7 @@
       </w:rPr>
     </w:lvl>
   </w:abstractNum>
-  <w:abstractNum w:abstractNumId="32">
+  <w:abstractNum w:abstractNumId="34">
     <w:nsid w:val="77CF24AB"/>
     <w:multiLevelType w:val="hybridMultilevel"/>
     <w:tmpl w:val="5FD02720"/>
@@ -14327,103 +16010,109 @@
     </w:lvl>
   </w:abstractNum>
   <w:num w:numId="1">
-    <w:abstractNumId w:val="27"/>
+    <w:abstractNumId w:val="29"/>
   </w:num>
   <w:num w:numId="2">
-    <w:abstractNumId w:val="23"/>
+    <w:abstractNumId w:val="25"/>
   </w:num>
   <w:num w:numId="3">
-    <w:abstractNumId w:val="8"/>
+    <w:abstractNumId w:val="9"/>
   </w:num>
   <w:num w:numId="4">
-    <w:abstractNumId w:val="10"/>
+    <w:abstractNumId w:val="12"/>
   </w:num>
   <w:num w:numId="5">
-    <w:abstractNumId w:val="29"/>
+    <w:abstractNumId w:val="31"/>
   </w:num>
   <w:num w:numId="6">
-    <w:abstractNumId w:val="17"/>
+    <w:abstractNumId w:val="19"/>
   </w:num>
   <w:num w:numId="7">
-    <w:abstractNumId w:val="15"/>
+    <w:abstractNumId w:val="17"/>
   </w:num>
   <w:num w:numId="8">
     <w:abstractNumId w:val="0"/>
   </w:num>
   <w:num w:numId="9">
-    <w:abstractNumId w:val="11"/>
+    <w:abstractNumId w:val="13"/>
   </w:num>
   <w:num w:numId="10">
+    <w:abstractNumId w:val="23"/>
+  </w:num>
+  <w:num w:numId="11">
+    <w:abstractNumId w:val="24"/>
+  </w:num>
+  <w:num w:numId="12">
     <w:abstractNumId w:val="21"/>
   </w:num>
-  <w:num w:numId="11">
-    <w:abstractNumId w:val="22"/>
-  </w:num>
-  <w:num w:numId="12">
-    <w:abstractNumId w:val="19"/>
-  </w:num>
   <w:num w:numId="13">
-    <w:abstractNumId w:val="13"/>
+    <w:abstractNumId w:val="15"/>
   </w:num>
   <w:num w:numId="14">
-    <w:abstractNumId w:val="16"/>
+    <w:abstractNumId w:val="18"/>
   </w:num>
   <w:num w:numId="15">
+    <w:abstractNumId w:val="32"/>
+  </w:num>
+  <w:num w:numId="16">
     <w:abstractNumId w:val="30"/>
   </w:num>
-  <w:num w:numId="16">
-    <w:abstractNumId w:val="28"/>
-  </w:num>
   <w:num w:numId="17">
-    <w:abstractNumId w:val="24"/>
+    <w:abstractNumId w:val="26"/>
   </w:num>
   <w:num w:numId="18">
-    <w:abstractNumId w:val="6"/>
+    <w:abstractNumId w:val="7"/>
   </w:num>
   <w:num w:numId="19">
     <w:abstractNumId w:val="1"/>
   </w:num>
   <w:num w:numId="20">
-    <w:abstractNumId w:val="25"/>
+    <w:abstractNumId w:val="27"/>
   </w:num>
   <w:num w:numId="21">
-    <w:abstractNumId w:val="26"/>
+    <w:abstractNumId w:val="28"/>
   </w:num>
   <w:num w:numId="22">
+    <w:abstractNumId w:val="5"/>
+  </w:num>
+  <w:num w:numId="23">
     <w:abstractNumId w:val="4"/>
   </w:num>
-  <w:num w:numId="23">
-    <w:abstractNumId w:val="3"/>
-  </w:num>
   <w:num w:numId="24">
-    <w:abstractNumId w:val="32"/>
+    <w:abstractNumId w:val="34"/>
   </w:num>
   <w:num w:numId="25">
-    <w:abstractNumId w:val="5"/>
+    <w:abstractNumId w:val="6"/>
   </w:num>
   <w:num w:numId="26">
-    <w:abstractNumId w:val="31"/>
+    <w:abstractNumId w:val="33"/>
   </w:num>
   <w:num w:numId="27">
-    <w:abstractNumId w:val="7"/>
+    <w:abstractNumId w:val="8"/>
   </w:num>
   <w:num w:numId="28">
-    <w:abstractNumId w:val="14"/>
+    <w:abstractNumId w:val="16"/>
   </w:num>
   <w:num w:numId="29">
-    <w:abstractNumId w:val="18"/>
+    <w:abstractNumId w:val="20"/>
   </w:num>
   <w:num w:numId="30">
     <w:abstractNumId w:val="2"/>
   </w:num>
   <w:num w:numId="31">
-    <w:abstractNumId w:val="9"/>
+    <w:abstractNumId w:val="11"/>
   </w:num>
   <w:num w:numId="32">
-    <w:abstractNumId w:val="12"/>
+    <w:abstractNumId w:val="14"/>
   </w:num>
   <w:num w:numId="33">
-    <w:abstractNumId w:val="20"/>
+    <w:abstractNumId w:val="22"/>
+  </w:num>
+  <w:num w:numId="34">
+    <w:abstractNumId w:val="10"/>
+  </w:num>
+  <w:num w:numId="35">
+    <w:abstractNumId w:val="3"/>
   </w:num>
 </w:numbering>
 </file>

</xml_diff>

<commit_message>
Date: 24 Mar 2026
</commit_message>
<xml_diff>
--- a/Notes.docx
+++ b/Notes.docx
@@ -15277,8 +15277,6 @@
           <w:szCs w:val="22"/>
         </w:rPr>
       </w:pPr>
-      <w:bookmarkStart w:id="0" w:name="_GoBack"/>
-      <w:bookmarkEnd w:id="0"/>
       <w:r>
         <w:rPr>
           <w:sz w:val="24"/>
@@ -15831,10 +15829,321 @@
           <w:tab w:val="left" w:pos="1320"/>
         </w:tabs>
         <w:rPr>
-          <w:sz w:val="24"/>
-          <w:szCs w:val="22"/>
-        </w:rPr>
-      </w:pPr>
+          <w:b/>
+          <w:bCs/>
+          <w:sz w:val="24"/>
+          <w:szCs w:val="22"/>
+        </w:rPr>
+      </w:pPr>
+    </w:p>
+    <w:p>
+      <w:pPr>
+        <w:tabs>
+          <w:tab w:val="left" w:pos="1320"/>
+        </w:tabs>
+        <w:rPr>
+          <w:b/>
+          <w:bCs/>
+          <w:sz w:val="24"/>
+          <w:szCs w:val="22"/>
+        </w:rPr>
+      </w:pPr>
+      <w:r>
+        <w:rPr>
+          <w:b/>
+          <w:bCs/>
+          <w:sz w:val="24"/>
+          <w:szCs w:val="22"/>
+        </w:rPr>
+        <w:t>Tags in Cucumber</w:t>
+      </w:r>
+    </w:p>
+    <w:p>
+      <w:pPr>
+        <w:pStyle w:val="ListParagraph"/>
+        <w:numPr>
+          <w:ilvl w:val="0"/>
+          <w:numId w:val="42"/>
+        </w:numPr>
+        <w:tabs>
+          <w:tab w:val="left" w:pos="1320"/>
+        </w:tabs>
+        <w:rPr>
+          <w:sz w:val="24"/>
+          <w:szCs w:val="22"/>
+        </w:rPr>
+      </w:pPr>
+      <w:r>
+        <w:rPr>
+          <w:sz w:val="24"/>
+          <w:szCs w:val="22"/>
+        </w:rPr>
+        <w:t>Tag</w:t>
+      </w:r>
+      <w:r>
+        <w:rPr>
+          <w:sz w:val="24"/>
+          <w:szCs w:val="22"/>
+        </w:rPr>
+        <w:t xml:space="preserve"> allows you to execute of skip single / multiple scenarios</w:t>
+      </w:r>
+    </w:p>
+    <w:p>
+      <w:pPr>
+        <w:pStyle w:val="ListParagraph"/>
+        <w:numPr>
+          <w:ilvl w:val="0"/>
+          <w:numId w:val="42"/>
+        </w:numPr>
+        <w:tabs>
+          <w:tab w:val="left" w:pos="1320"/>
+        </w:tabs>
+        <w:rPr>
+          <w:sz w:val="24"/>
+          <w:szCs w:val="22"/>
+        </w:rPr>
+      </w:pPr>
+      <w:r>
+        <w:rPr>
+          <w:sz w:val="24"/>
+          <w:szCs w:val="22"/>
+        </w:rPr>
+        <w:t>Every tag starts with @</w:t>
+      </w:r>
+    </w:p>
+    <w:p>
+      <w:pPr>
+        <w:pStyle w:val="ListParagraph"/>
+        <w:numPr>
+          <w:ilvl w:val="0"/>
+          <w:numId w:val="42"/>
+        </w:numPr>
+        <w:tabs>
+          <w:tab w:val="left" w:pos="1320"/>
+        </w:tabs>
+        <w:rPr>
+          <w:sz w:val="24"/>
+          <w:szCs w:val="22"/>
+        </w:rPr>
+      </w:pPr>
+      <w:r>
+        <w:rPr>
+          <w:sz w:val="24"/>
+          <w:szCs w:val="22"/>
+        </w:rPr>
+        <w:lastRenderedPageBreak/>
+        <w:t>Tags needs to be specified in Feature file only</w:t>
+      </w:r>
+    </w:p>
+    <w:p>
+      <w:pPr>
+        <w:pStyle w:val="ListParagraph"/>
+        <w:numPr>
+          <w:ilvl w:val="0"/>
+          <w:numId w:val="42"/>
+        </w:numPr>
+        <w:tabs>
+          <w:tab w:val="left" w:pos="1320"/>
+        </w:tabs>
+        <w:rPr>
+          <w:sz w:val="24"/>
+          <w:szCs w:val="22"/>
+        </w:rPr>
+      </w:pPr>
+      <w:r>
+        <w:rPr>
+          <w:sz w:val="24"/>
+          <w:szCs w:val="22"/>
+        </w:rPr>
+        <w:t>But the execution criteria needs to be specified in runner class</w:t>
+      </w:r>
+    </w:p>
+    <w:p>
+      <w:pPr>
+        <w:tabs>
+          <w:tab w:val="left" w:pos="1320"/>
+        </w:tabs>
+        <w:rPr>
+          <w:sz w:val="24"/>
+          <w:szCs w:val="22"/>
+        </w:rPr>
+      </w:pPr>
+    </w:p>
+    <w:p>
+      <w:pPr>
+        <w:tabs>
+          <w:tab w:val="left" w:pos="1320"/>
+        </w:tabs>
+        <w:rPr>
+          <w:b/>
+          <w:bCs/>
+          <w:sz w:val="24"/>
+          <w:szCs w:val="22"/>
+        </w:rPr>
+      </w:pPr>
+      <w:r>
+        <w:rPr>
+          <w:b/>
+          <w:bCs/>
+          <w:sz w:val="24"/>
+          <w:szCs w:val="22"/>
+        </w:rPr>
+        <w:t>Hooks in Cucumber</w:t>
+      </w:r>
+    </w:p>
+    <w:p>
+      <w:pPr>
+        <w:pStyle w:val="ListParagraph"/>
+        <w:numPr>
+          <w:ilvl w:val="0"/>
+          <w:numId w:val="43"/>
+        </w:numPr>
+        <w:tabs>
+          <w:tab w:val="left" w:pos="1320"/>
+        </w:tabs>
+        <w:rPr>
+          <w:sz w:val="24"/>
+          <w:szCs w:val="22"/>
+        </w:rPr>
+      </w:pPr>
+      <w:r>
+        <w:rPr>
+          <w:sz w:val="24"/>
+          <w:szCs w:val="22"/>
+        </w:rPr>
+        <w:t xml:space="preserve">These are the methods those will get executed before and after </w:t>
+      </w:r>
+      <w:r>
+        <w:rPr>
+          <w:b/>
+          <w:bCs/>
+          <w:sz w:val="24"/>
+          <w:szCs w:val="22"/>
+        </w:rPr>
+        <w:t>every scenario.</w:t>
+      </w:r>
+    </w:p>
+    <w:p>
+      <w:pPr>
+        <w:pStyle w:val="ListParagraph"/>
+        <w:numPr>
+          <w:ilvl w:val="1"/>
+          <w:numId w:val="43"/>
+        </w:numPr>
+        <w:tabs>
+          <w:tab w:val="left" w:pos="1320"/>
+        </w:tabs>
+        <w:rPr>
+          <w:sz w:val="24"/>
+          <w:szCs w:val="22"/>
+        </w:rPr>
+      </w:pPr>
+      <w:r>
+        <w:rPr>
+          <w:sz w:val="24"/>
+          <w:szCs w:val="22"/>
+        </w:rPr>
+        <w:t>Like @BeforeMethod and @AfterMethod from TestNG</w:t>
+      </w:r>
+    </w:p>
+    <w:p>
+      <w:pPr>
+        <w:pStyle w:val="ListParagraph"/>
+        <w:numPr>
+          <w:ilvl w:val="0"/>
+          <w:numId w:val="43"/>
+        </w:numPr>
+        <w:tabs>
+          <w:tab w:val="left" w:pos="1320"/>
+        </w:tabs>
+        <w:rPr>
+          <w:sz w:val="24"/>
+          <w:szCs w:val="22"/>
+        </w:rPr>
+      </w:pPr>
+      <w:r>
+        <w:rPr>
+          <w:sz w:val="24"/>
+          <w:szCs w:val="22"/>
+        </w:rPr>
+        <w:t>There are two hooks</w:t>
+      </w:r>
+    </w:p>
+    <w:p>
+      <w:pPr>
+        <w:pStyle w:val="ListParagraph"/>
+        <w:numPr>
+          <w:ilvl w:val="1"/>
+          <w:numId w:val="43"/>
+        </w:numPr>
+        <w:tabs>
+          <w:tab w:val="left" w:pos="1320"/>
+        </w:tabs>
+        <w:rPr>
+          <w:sz w:val="24"/>
+          <w:szCs w:val="22"/>
+        </w:rPr>
+      </w:pPr>
+      <w:r>
+        <w:rPr>
+          <w:sz w:val="24"/>
+          <w:szCs w:val="22"/>
+        </w:rPr>
+        <w:t xml:space="preserve">@Before </w:t>
+      </w:r>
+      <w:r>
+        <w:rPr>
+          <w:sz w:val="24"/>
+          <w:szCs w:val="22"/>
+        </w:rPr>
+        <w:sym w:font="Wingdings" w:char="F0E0"/>
+      </w:r>
+      <w:r>
+        <w:rPr>
+          <w:sz w:val="24"/>
+          <w:szCs w:val="22"/>
+        </w:rPr>
+        <w:t xml:space="preserve"> will execute before every scenario</w:t>
+      </w:r>
+    </w:p>
+    <w:p>
+      <w:pPr>
+        <w:pStyle w:val="ListParagraph"/>
+        <w:numPr>
+          <w:ilvl w:val="1"/>
+          <w:numId w:val="43"/>
+        </w:numPr>
+        <w:tabs>
+          <w:tab w:val="left" w:pos="1320"/>
+        </w:tabs>
+        <w:rPr>
+          <w:sz w:val="24"/>
+          <w:szCs w:val="22"/>
+        </w:rPr>
+      </w:pPr>
+      <w:r>
+        <w:rPr>
+          <w:sz w:val="24"/>
+          <w:szCs w:val="22"/>
+        </w:rPr>
+        <w:t xml:space="preserve">@After </w:t>
+      </w:r>
+      <w:r>
+        <w:rPr>
+          <w:sz w:val="24"/>
+          <w:szCs w:val="22"/>
+        </w:rPr>
+        <w:sym w:font="Wingdings" w:char="F0E0"/>
+      </w:r>
+      <w:r>
+        <w:rPr>
+          <w:sz w:val="24"/>
+          <w:szCs w:val="22"/>
+        </w:rPr>
+        <w:t xml:space="preserve"> Will execute after every scenario</w:t>
+      </w:r>
+      <w:bookmarkStart w:id="0" w:name="_GoBack"/>
+      <w:bookmarkEnd w:id="0"/>
     </w:p>
     <w:sectPr>
       <w:pgSz w:w="11906" w:h="16838"/>
@@ -16303,6 +16612,119 @@
     </w:lvl>
   </w:abstractNum>
   <w:abstractNum w:abstractNumId="4">
+    <w:nsid w:val="09F24A47"/>
+    <w:multiLevelType w:val="hybridMultilevel"/>
+    <w:tmpl w:val="85F69F26"/>
+    <w:lvl w:ilvl="0" w:tplc="40090001">
+      <w:start w:val="1"/>
+      <w:numFmt w:val="bullet"/>
+      <w:lvlText w:val=""/>
+      <w:lvlJc w:val="left"/>
+      <w:pPr>
+        <w:ind w:left="720" w:hanging="360"/>
+      </w:pPr>
+      <w:rPr>
+        <w:rFonts w:ascii="Symbol" w:hAnsi="Symbol" w:hint="default"/>
+      </w:rPr>
+    </w:lvl>
+    <w:lvl w:ilvl="1" w:tplc="40090003" w:tentative="1">
+      <w:start w:val="1"/>
+      <w:numFmt w:val="bullet"/>
+      <w:lvlText w:val="o"/>
+      <w:lvlJc w:val="left"/>
+      <w:pPr>
+        <w:ind w:left="1440" w:hanging="360"/>
+      </w:pPr>
+      <w:rPr>
+        <w:rFonts w:ascii="Courier New" w:hAnsi="Courier New" w:cs="Courier New" w:hint="default"/>
+      </w:rPr>
+    </w:lvl>
+    <w:lvl w:ilvl="2" w:tplc="40090005" w:tentative="1">
+      <w:start w:val="1"/>
+      <w:numFmt w:val="bullet"/>
+      <w:lvlText w:val=""/>
+      <w:lvlJc w:val="left"/>
+      <w:pPr>
+        <w:ind w:left="2160" w:hanging="360"/>
+      </w:pPr>
+      <w:rPr>
+        <w:rFonts w:ascii="Wingdings" w:hAnsi="Wingdings" w:hint="default"/>
+      </w:rPr>
+    </w:lvl>
+    <w:lvl w:ilvl="3" w:tplc="40090001" w:tentative="1">
+      <w:start w:val="1"/>
+      <w:numFmt w:val="bullet"/>
+      <w:lvlText w:val=""/>
+      <w:lvlJc w:val="left"/>
+      <w:pPr>
+        <w:ind w:left="2880" w:hanging="360"/>
+      </w:pPr>
+      <w:rPr>
+        <w:rFonts w:ascii="Symbol" w:hAnsi="Symbol" w:hint="default"/>
+      </w:rPr>
+    </w:lvl>
+    <w:lvl w:ilvl="4" w:tplc="40090003" w:tentative="1">
+      <w:start w:val="1"/>
+      <w:numFmt w:val="bullet"/>
+      <w:lvlText w:val="o"/>
+      <w:lvlJc w:val="left"/>
+      <w:pPr>
+        <w:ind w:left="3600" w:hanging="360"/>
+      </w:pPr>
+      <w:rPr>
+        <w:rFonts w:ascii="Courier New" w:hAnsi="Courier New" w:cs="Courier New" w:hint="default"/>
+      </w:rPr>
+    </w:lvl>
+    <w:lvl w:ilvl="5" w:tplc="40090005" w:tentative="1">
+      <w:start w:val="1"/>
+      <w:numFmt w:val="bullet"/>
+      <w:lvlText w:val=""/>
+      <w:lvlJc w:val="left"/>
+      <w:pPr>
+        <w:ind w:left="4320" w:hanging="360"/>
+      </w:pPr>
+      <w:rPr>
+        <w:rFonts w:ascii="Wingdings" w:hAnsi="Wingdings" w:hint="default"/>
+      </w:rPr>
+    </w:lvl>
+    <w:lvl w:ilvl="6" w:tplc="40090001" w:tentative="1">
+      <w:start w:val="1"/>
+      <w:numFmt w:val="bullet"/>
+      <w:lvlText w:val=""/>
+      <w:lvlJc w:val="left"/>
+      <w:pPr>
+        <w:ind w:left="5040" w:hanging="360"/>
+      </w:pPr>
+      <w:rPr>
+        <w:rFonts w:ascii="Symbol" w:hAnsi="Symbol" w:hint="default"/>
+      </w:rPr>
+    </w:lvl>
+    <w:lvl w:ilvl="7" w:tplc="40090003" w:tentative="1">
+      <w:start w:val="1"/>
+      <w:numFmt w:val="bullet"/>
+      <w:lvlText w:val="o"/>
+      <w:lvlJc w:val="left"/>
+      <w:pPr>
+        <w:ind w:left="5760" w:hanging="360"/>
+      </w:pPr>
+      <w:rPr>
+        <w:rFonts w:ascii="Courier New" w:hAnsi="Courier New" w:cs="Courier New" w:hint="default"/>
+      </w:rPr>
+    </w:lvl>
+    <w:lvl w:ilvl="8" w:tplc="40090005" w:tentative="1">
+      <w:start w:val="1"/>
+      <w:numFmt w:val="bullet"/>
+      <w:lvlText w:val=""/>
+      <w:lvlJc w:val="left"/>
+      <w:pPr>
+        <w:ind w:left="6480" w:hanging="360"/>
+      </w:pPr>
+      <w:rPr>
+        <w:rFonts w:ascii="Wingdings" w:hAnsi="Wingdings" w:hint="default"/>
+      </w:rPr>
+    </w:lvl>
+  </w:abstractNum>
+  <w:abstractNum w:abstractNumId="5">
     <w:nsid w:val="0B2F3F01"/>
     <w:multiLevelType w:val="hybridMultilevel"/>
     <w:tmpl w:val="CADC07B4"/>
@@ -16415,7 +16837,7 @@
       </w:rPr>
     </w:lvl>
   </w:abstractNum>
-  <w:abstractNum w:abstractNumId="5">
+  <w:abstractNum w:abstractNumId="6">
     <w:nsid w:val="0F571F41"/>
     <w:multiLevelType w:val="hybridMultilevel"/>
     <w:tmpl w:val="5036BC26"/>
@@ -16504,7 +16926,7 @@
       </w:pPr>
     </w:lvl>
   </w:abstractNum>
-  <w:abstractNum w:abstractNumId="6">
+  <w:abstractNum w:abstractNumId="7">
     <w:nsid w:val="101C421F"/>
     <w:multiLevelType w:val="hybridMultilevel"/>
     <w:tmpl w:val="E8023388"/>
@@ -16593,7 +17015,7 @@
       </w:pPr>
     </w:lvl>
   </w:abstractNum>
-  <w:abstractNum w:abstractNumId="7">
+  <w:abstractNum w:abstractNumId="8">
     <w:nsid w:val="20231B0F"/>
     <w:multiLevelType w:val="hybridMultilevel"/>
     <w:tmpl w:val="8B444104"/>
@@ -16706,7 +17128,7 @@
       </w:rPr>
     </w:lvl>
   </w:abstractNum>
-  <w:abstractNum w:abstractNumId="8">
+  <w:abstractNum w:abstractNumId="9">
     <w:nsid w:val="25921597"/>
     <w:multiLevelType w:val="hybridMultilevel"/>
     <w:tmpl w:val="228C97DE"/>
@@ -16795,7 +17217,7 @@
       </w:pPr>
     </w:lvl>
   </w:abstractNum>
-  <w:abstractNum w:abstractNumId="9">
+  <w:abstractNum w:abstractNumId="10">
     <w:nsid w:val="2AD0394C"/>
     <w:multiLevelType w:val="hybridMultilevel"/>
     <w:tmpl w:val="A36CD096"/>
@@ -16908,7 +17330,7 @@
       </w:rPr>
     </w:lvl>
   </w:abstractNum>
-  <w:abstractNum w:abstractNumId="10">
+  <w:abstractNum w:abstractNumId="11">
     <w:nsid w:val="2AD16229"/>
     <w:multiLevelType w:val="hybridMultilevel"/>
     <w:tmpl w:val="C5364E86"/>
@@ -16997,7 +17419,7 @@
       </w:pPr>
     </w:lvl>
   </w:abstractNum>
-  <w:abstractNum w:abstractNumId="11">
+  <w:abstractNum w:abstractNumId="12">
     <w:nsid w:val="2AF0639C"/>
     <w:multiLevelType w:val="hybridMultilevel"/>
     <w:tmpl w:val="54A22318"/>
@@ -17083,7 +17505,7 @@
       </w:pPr>
     </w:lvl>
   </w:abstractNum>
-  <w:abstractNum w:abstractNumId="12">
+  <w:abstractNum w:abstractNumId="13">
     <w:nsid w:val="2C027330"/>
     <w:multiLevelType w:val="hybridMultilevel"/>
     <w:tmpl w:val="347E56F4"/>
@@ -17172,7 +17594,7 @@
       </w:pPr>
     </w:lvl>
   </w:abstractNum>
-  <w:abstractNum w:abstractNumId="13">
+  <w:abstractNum w:abstractNumId="14">
     <w:nsid w:val="2EEE2462"/>
     <w:multiLevelType w:val="hybridMultilevel"/>
     <w:tmpl w:val="1FFC74BE"/>
@@ -17261,7 +17683,7 @@
       </w:pPr>
     </w:lvl>
   </w:abstractNum>
-  <w:abstractNum w:abstractNumId="14">
+  <w:abstractNum w:abstractNumId="15">
     <w:nsid w:val="333F2421"/>
     <w:multiLevelType w:val="hybridMultilevel"/>
     <w:tmpl w:val="85128FF8"/>
@@ -17374,7 +17796,7 @@
       </w:rPr>
     </w:lvl>
   </w:abstractNum>
-  <w:abstractNum w:abstractNumId="15">
+  <w:abstractNum w:abstractNumId="16">
     <w:nsid w:val="335B6CD0"/>
     <w:multiLevelType w:val="hybridMultilevel"/>
     <w:tmpl w:val="B8EA9D4C"/>
@@ -17463,7 +17885,7 @@
       </w:pPr>
     </w:lvl>
   </w:abstractNum>
-  <w:abstractNum w:abstractNumId="16">
+  <w:abstractNum w:abstractNumId="17">
     <w:nsid w:val="340F729A"/>
     <w:multiLevelType w:val="hybridMultilevel"/>
     <w:tmpl w:val="B2C2407E"/>
@@ -17576,7 +17998,7 @@
       </w:rPr>
     </w:lvl>
   </w:abstractNum>
-  <w:abstractNum w:abstractNumId="17">
+  <w:abstractNum w:abstractNumId="18">
     <w:nsid w:val="34DF0944"/>
     <w:multiLevelType w:val="hybridMultilevel"/>
     <w:tmpl w:val="5C885224"/>
@@ -17665,7 +18087,7 @@
       </w:pPr>
     </w:lvl>
   </w:abstractNum>
-  <w:abstractNum w:abstractNumId="18">
+  <w:abstractNum w:abstractNumId="19">
     <w:nsid w:val="35124045"/>
     <w:multiLevelType w:val="hybridMultilevel"/>
     <w:tmpl w:val="9B08084E"/>
@@ -17778,7 +18200,7 @@
       </w:rPr>
     </w:lvl>
   </w:abstractNum>
-  <w:abstractNum w:abstractNumId="19">
+  <w:abstractNum w:abstractNumId="20">
     <w:nsid w:val="37C9636B"/>
     <w:multiLevelType w:val="hybridMultilevel"/>
     <w:tmpl w:val="1C58E17C"/>
@@ -17867,7 +18289,7 @@
       </w:pPr>
     </w:lvl>
   </w:abstractNum>
-  <w:abstractNum w:abstractNumId="20">
+  <w:abstractNum w:abstractNumId="21">
     <w:nsid w:val="3A89575F"/>
     <w:multiLevelType w:val="hybridMultilevel"/>
     <w:tmpl w:val="450C4570"/>
@@ -17980,7 +18402,7 @@
       </w:rPr>
     </w:lvl>
   </w:abstractNum>
-  <w:abstractNum w:abstractNumId="21">
+  <w:abstractNum w:abstractNumId="22">
     <w:nsid w:val="4316625C"/>
     <w:multiLevelType w:val="hybridMultilevel"/>
     <w:tmpl w:val="B75E34FE"/>
@@ -18069,7 +18491,7 @@
       </w:pPr>
     </w:lvl>
   </w:abstractNum>
-  <w:abstractNum w:abstractNumId="22">
+  <w:abstractNum w:abstractNumId="23">
     <w:nsid w:val="45E943CF"/>
     <w:multiLevelType w:val="hybridMultilevel"/>
     <w:tmpl w:val="8DB25A28"/>
@@ -18158,7 +18580,120 @@
       </w:pPr>
     </w:lvl>
   </w:abstractNum>
-  <w:abstractNum w:abstractNumId="23">
+  <w:abstractNum w:abstractNumId="24">
+    <w:nsid w:val="48313F64"/>
+    <w:multiLevelType w:val="hybridMultilevel"/>
+    <w:tmpl w:val="25882988"/>
+    <w:lvl w:ilvl="0" w:tplc="40090001">
+      <w:start w:val="1"/>
+      <w:numFmt w:val="bullet"/>
+      <w:lvlText w:val=""/>
+      <w:lvlJc w:val="left"/>
+      <w:pPr>
+        <w:ind w:left="720" w:hanging="360"/>
+      </w:pPr>
+      <w:rPr>
+        <w:rFonts w:ascii="Symbol" w:hAnsi="Symbol" w:hint="default"/>
+      </w:rPr>
+    </w:lvl>
+    <w:lvl w:ilvl="1" w:tplc="40090003">
+      <w:start w:val="1"/>
+      <w:numFmt w:val="bullet"/>
+      <w:lvlText w:val="o"/>
+      <w:lvlJc w:val="left"/>
+      <w:pPr>
+        <w:ind w:left="1440" w:hanging="360"/>
+      </w:pPr>
+      <w:rPr>
+        <w:rFonts w:ascii="Courier New" w:hAnsi="Courier New" w:cs="Courier New" w:hint="default"/>
+      </w:rPr>
+    </w:lvl>
+    <w:lvl w:ilvl="2" w:tplc="40090005" w:tentative="1">
+      <w:start w:val="1"/>
+      <w:numFmt w:val="bullet"/>
+      <w:lvlText w:val=""/>
+      <w:lvlJc w:val="left"/>
+      <w:pPr>
+        <w:ind w:left="2160" w:hanging="360"/>
+      </w:pPr>
+      <w:rPr>
+        <w:rFonts w:ascii="Wingdings" w:hAnsi="Wingdings" w:hint="default"/>
+      </w:rPr>
+    </w:lvl>
+    <w:lvl w:ilvl="3" w:tplc="40090001" w:tentative="1">
+      <w:start w:val="1"/>
+      <w:numFmt w:val="bullet"/>
+      <w:lvlText w:val=""/>
+      <w:lvlJc w:val="left"/>
+      <w:pPr>
+        <w:ind w:left="2880" w:hanging="360"/>
+      </w:pPr>
+      <w:rPr>
+        <w:rFonts w:ascii="Symbol" w:hAnsi="Symbol" w:hint="default"/>
+      </w:rPr>
+    </w:lvl>
+    <w:lvl w:ilvl="4" w:tplc="40090003" w:tentative="1">
+      <w:start w:val="1"/>
+      <w:numFmt w:val="bullet"/>
+      <w:lvlText w:val="o"/>
+      <w:lvlJc w:val="left"/>
+      <w:pPr>
+        <w:ind w:left="3600" w:hanging="360"/>
+      </w:pPr>
+      <w:rPr>
+        <w:rFonts w:ascii="Courier New" w:hAnsi="Courier New" w:cs="Courier New" w:hint="default"/>
+      </w:rPr>
+    </w:lvl>
+    <w:lvl w:ilvl="5" w:tplc="40090005" w:tentative="1">
+      <w:start w:val="1"/>
+      <w:numFmt w:val="bullet"/>
+      <w:lvlText w:val=""/>
+      <w:lvlJc w:val="left"/>
+      <w:pPr>
+        <w:ind w:left="4320" w:hanging="360"/>
+      </w:pPr>
+      <w:rPr>
+        <w:rFonts w:ascii="Wingdings" w:hAnsi="Wingdings" w:hint="default"/>
+      </w:rPr>
+    </w:lvl>
+    <w:lvl w:ilvl="6" w:tplc="40090001" w:tentative="1">
+      <w:start w:val="1"/>
+      <w:numFmt w:val="bullet"/>
+      <w:lvlText w:val=""/>
+      <w:lvlJc w:val="left"/>
+      <w:pPr>
+        <w:ind w:left="5040" w:hanging="360"/>
+      </w:pPr>
+      <w:rPr>
+        <w:rFonts w:ascii="Symbol" w:hAnsi="Symbol" w:hint="default"/>
+      </w:rPr>
+    </w:lvl>
+    <w:lvl w:ilvl="7" w:tplc="40090003" w:tentative="1">
+      <w:start w:val="1"/>
+      <w:numFmt w:val="bullet"/>
+      <w:lvlText w:val="o"/>
+      <w:lvlJc w:val="left"/>
+      <w:pPr>
+        <w:ind w:left="5760" w:hanging="360"/>
+      </w:pPr>
+      <w:rPr>
+        <w:rFonts w:ascii="Courier New" w:hAnsi="Courier New" w:cs="Courier New" w:hint="default"/>
+      </w:rPr>
+    </w:lvl>
+    <w:lvl w:ilvl="8" w:tplc="40090005" w:tentative="1">
+      <w:start w:val="1"/>
+      <w:numFmt w:val="bullet"/>
+      <w:lvlText w:val=""/>
+      <w:lvlJc w:val="left"/>
+      <w:pPr>
+        <w:ind w:left="6480" w:hanging="360"/>
+      </w:pPr>
+      <w:rPr>
+        <w:rFonts w:ascii="Wingdings" w:hAnsi="Wingdings" w:hint="default"/>
+      </w:rPr>
+    </w:lvl>
+  </w:abstractNum>
+  <w:abstractNum w:abstractNumId="25">
     <w:nsid w:val="49F86A57"/>
     <w:multiLevelType w:val="hybridMultilevel"/>
     <w:tmpl w:val="0BF29674"/>
@@ -18247,7 +18782,7 @@
       </w:pPr>
     </w:lvl>
   </w:abstractNum>
-  <w:abstractNum w:abstractNumId="24">
+  <w:abstractNum w:abstractNumId="26">
     <w:nsid w:val="4AC94DD4"/>
     <w:multiLevelType w:val="hybridMultilevel"/>
     <w:tmpl w:val="5324F4FE"/>
@@ -18336,7 +18871,7 @@
       </w:pPr>
     </w:lvl>
   </w:abstractNum>
-  <w:abstractNum w:abstractNumId="25">
+  <w:abstractNum w:abstractNumId="27">
     <w:nsid w:val="5CBE3725"/>
     <w:multiLevelType w:val="hybridMultilevel"/>
     <w:tmpl w:val="4D3C6A2A"/>
@@ -18425,7 +18960,7 @@
       </w:pPr>
     </w:lvl>
   </w:abstractNum>
-  <w:abstractNum w:abstractNumId="26">
+  <w:abstractNum w:abstractNumId="28">
     <w:nsid w:val="5D6B0CD5"/>
     <w:multiLevelType w:val="hybridMultilevel"/>
     <w:tmpl w:val="FF8AE80C"/>
@@ -18538,7 +19073,7 @@
       </w:rPr>
     </w:lvl>
   </w:abstractNum>
-  <w:abstractNum w:abstractNumId="27">
+  <w:abstractNum w:abstractNumId="29">
     <w:nsid w:val="60B95D02"/>
     <w:multiLevelType w:val="hybridMultilevel"/>
     <w:tmpl w:val="D9DEA214"/>
@@ -18651,7 +19186,7 @@
       </w:rPr>
     </w:lvl>
   </w:abstractNum>
-  <w:abstractNum w:abstractNumId="28">
+  <w:abstractNum w:abstractNumId="30">
     <w:nsid w:val="6277321E"/>
     <w:multiLevelType w:val="hybridMultilevel"/>
     <w:tmpl w:val="09F2E114"/>
@@ -18740,7 +19275,7 @@
       </w:pPr>
     </w:lvl>
   </w:abstractNum>
-  <w:abstractNum w:abstractNumId="29">
+  <w:abstractNum w:abstractNumId="31">
     <w:nsid w:val="635E69DF"/>
     <w:multiLevelType w:val="hybridMultilevel"/>
     <w:tmpl w:val="7CCC2E94"/>
@@ -18829,7 +19364,7 @@
       </w:pPr>
     </w:lvl>
   </w:abstractNum>
-  <w:abstractNum w:abstractNumId="30">
+  <w:abstractNum w:abstractNumId="32">
     <w:nsid w:val="63A8624B"/>
     <w:multiLevelType w:val="hybridMultilevel"/>
     <w:tmpl w:val="ABE4FA34"/>
@@ -18918,7 +19453,7 @@
       </w:pPr>
     </w:lvl>
   </w:abstractNum>
-  <w:abstractNum w:abstractNumId="31">
+  <w:abstractNum w:abstractNumId="33">
     <w:nsid w:val="64456C49"/>
     <w:multiLevelType w:val="hybridMultilevel"/>
     <w:tmpl w:val="5F629F92"/>
@@ -19007,7 +19542,7 @@
       </w:pPr>
     </w:lvl>
   </w:abstractNum>
-  <w:abstractNum w:abstractNumId="32">
+  <w:abstractNum w:abstractNumId="34">
     <w:nsid w:val="67516CAF"/>
     <w:multiLevelType w:val="hybridMultilevel"/>
     <w:tmpl w:val="67A466EC"/>
@@ -19120,7 +19655,7 @@
       </w:rPr>
     </w:lvl>
   </w:abstractNum>
-  <w:abstractNum w:abstractNumId="33">
+  <w:abstractNum w:abstractNumId="35">
     <w:nsid w:val="698F6573"/>
     <w:multiLevelType w:val="hybridMultilevel"/>
     <w:tmpl w:val="538221D2"/>
@@ -19233,7 +19768,7 @@
       </w:rPr>
     </w:lvl>
   </w:abstractNum>
-  <w:abstractNum w:abstractNumId="34">
+  <w:abstractNum w:abstractNumId="36">
     <w:nsid w:val="6C8D1D8E"/>
     <w:multiLevelType w:val="hybridMultilevel"/>
     <w:tmpl w:val="3300155A"/>
@@ -19346,7 +19881,7 @@
       </w:rPr>
     </w:lvl>
   </w:abstractNum>
-  <w:abstractNum w:abstractNumId="35">
+  <w:abstractNum w:abstractNumId="37">
     <w:nsid w:val="6D03627E"/>
     <w:multiLevelType w:val="hybridMultilevel"/>
     <w:tmpl w:val="AF6072B4"/>
@@ -19459,7 +19994,7 @@
       </w:rPr>
     </w:lvl>
   </w:abstractNum>
-  <w:abstractNum w:abstractNumId="36">
+  <w:abstractNum w:abstractNumId="38">
     <w:nsid w:val="6F1D0862"/>
     <w:multiLevelType w:val="hybridMultilevel"/>
     <w:tmpl w:val="8132F692"/>
@@ -19572,7 +20107,7 @@
       </w:rPr>
     </w:lvl>
   </w:abstractNum>
-  <w:abstractNum w:abstractNumId="37">
+  <w:abstractNum w:abstractNumId="39">
     <w:nsid w:val="6F4D3C22"/>
     <w:multiLevelType w:val="hybridMultilevel"/>
     <w:tmpl w:val="2D660700"/>
@@ -19685,7 +20220,7 @@
       </w:rPr>
     </w:lvl>
   </w:abstractNum>
-  <w:abstractNum w:abstractNumId="38">
+  <w:abstractNum w:abstractNumId="40">
     <w:nsid w:val="76363541"/>
     <w:multiLevelType w:val="hybridMultilevel"/>
     <w:tmpl w:val="9D845514"/>
@@ -19798,7 +20333,7 @@
       </w:rPr>
     </w:lvl>
   </w:abstractNum>
-  <w:abstractNum w:abstractNumId="39">
+  <w:abstractNum w:abstractNumId="41">
     <w:nsid w:val="77CF24AB"/>
     <w:multiLevelType w:val="hybridMultilevel"/>
     <w:tmpl w:val="5FD02720"/>
@@ -19887,7 +20422,7 @@
       </w:pPr>
     </w:lvl>
   </w:abstractNum>
-  <w:abstractNum w:abstractNumId="40">
+  <w:abstractNum w:abstractNumId="42">
     <w:nsid w:val="7E2B7C9A"/>
     <w:multiLevelType w:val="hybridMultilevel"/>
     <w:tmpl w:val="29306C98"/>
@@ -19977,127 +20512,133 @@
     </w:lvl>
   </w:abstractNum>
   <w:num w:numId="1">
-    <w:abstractNumId w:val="33"/>
+    <w:abstractNumId w:val="35"/>
   </w:num>
   <w:num w:numId="2">
-    <w:abstractNumId w:val="29"/>
+    <w:abstractNumId w:val="31"/>
   </w:num>
   <w:num w:numId="3">
-    <w:abstractNumId w:val="11"/>
+    <w:abstractNumId w:val="12"/>
   </w:num>
   <w:num w:numId="4">
-    <w:abstractNumId w:val="14"/>
+    <w:abstractNumId w:val="15"/>
   </w:num>
   <w:num w:numId="5">
-    <w:abstractNumId w:val="35"/>
+    <w:abstractNumId w:val="37"/>
   </w:num>
   <w:num w:numId="6">
-    <w:abstractNumId w:val="23"/>
+    <w:abstractNumId w:val="25"/>
   </w:num>
   <w:num w:numId="7">
-    <w:abstractNumId w:val="21"/>
+    <w:abstractNumId w:val="22"/>
   </w:num>
   <w:num w:numId="8">
     <w:abstractNumId w:val="1"/>
   </w:num>
   <w:num w:numId="9">
-    <w:abstractNumId w:val="15"/>
+    <w:abstractNumId w:val="16"/>
   </w:num>
   <w:num w:numId="10">
+    <w:abstractNumId w:val="29"/>
+  </w:num>
+  <w:num w:numId="11">
+    <w:abstractNumId w:val="30"/>
+  </w:num>
+  <w:num w:numId="12">
     <w:abstractNumId w:val="27"/>
   </w:num>
-  <w:num w:numId="11">
-    <w:abstractNumId w:val="28"/>
-  </w:num>
-  <w:num w:numId="12">
-    <w:abstractNumId w:val="25"/>
-  </w:num>
   <w:num w:numId="13">
-    <w:abstractNumId w:val="17"/>
+    <w:abstractNumId w:val="18"/>
   </w:num>
   <w:num w:numId="14">
-    <w:abstractNumId w:val="22"/>
+    <w:abstractNumId w:val="23"/>
   </w:num>
   <w:num w:numId="15">
-    <w:abstractNumId w:val="37"/>
+    <w:abstractNumId w:val="39"/>
   </w:num>
   <w:num w:numId="16">
-    <w:abstractNumId w:val="34"/>
+    <w:abstractNumId w:val="36"/>
   </w:num>
   <w:num w:numId="17">
-    <w:abstractNumId w:val="30"/>
+    <w:abstractNumId w:val="32"/>
   </w:num>
   <w:num w:numId="18">
-    <w:abstractNumId w:val="9"/>
+    <w:abstractNumId w:val="10"/>
   </w:num>
   <w:num w:numId="19">
     <w:abstractNumId w:val="2"/>
   </w:num>
   <w:num w:numId="20">
-    <w:abstractNumId w:val="31"/>
+    <w:abstractNumId w:val="33"/>
   </w:num>
   <w:num w:numId="21">
-    <w:abstractNumId w:val="32"/>
+    <w:abstractNumId w:val="34"/>
   </w:num>
   <w:num w:numId="22">
+    <w:abstractNumId w:val="7"/>
+  </w:num>
+  <w:num w:numId="23">
     <w:abstractNumId w:val="6"/>
   </w:num>
-  <w:num w:numId="23">
-    <w:abstractNumId w:val="5"/>
-  </w:num>
   <w:num w:numId="24">
-    <w:abstractNumId w:val="39"/>
+    <w:abstractNumId w:val="41"/>
   </w:num>
   <w:num w:numId="25">
-    <w:abstractNumId w:val="7"/>
+    <w:abstractNumId w:val="8"/>
   </w:num>
   <w:num w:numId="26">
-    <w:abstractNumId w:val="38"/>
+    <w:abstractNumId w:val="40"/>
   </w:num>
   <w:num w:numId="27">
-    <w:abstractNumId w:val="10"/>
+    <w:abstractNumId w:val="11"/>
   </w:num>
   <w:num w:numId="28">
-    <w:abstractNumId w:val="18"/>
+    <w:abstractNumId w:val="19"/>
   </w:num>
   <w:num w:numId="29">
-    <w:abstractNumId w:val="24"/>
+    <w:abstractNumId w:val="26"/>
   </w:num>
   <w:num w:numId="30">
     <w:abstractNumId w:val="3"/>
   </w:num>
   <w:num w:numId="31">
+    <w:abstractNumId w:val="14"/>
+  </w:num>
+  <w:num w:numId="32">
+    <w:abstractNumId w:val="17"/>
+  </w:num>
+  <w:num w:numId="33">
+    <w:abstractNumId w:val="28"/>
+  </w:num>
+  <w:num w:numId="34">
     <w:abstractNumId w:val="13"/>
   </w:num>
-  <w:num w:numId="32">
-    <w:abstractNumId w:val="16"/>
-  </w:num>
-  <w:num w:numId="33">
-    <w:abstractNumId w:val="26"/>
-  </w:num>
-  <w:num w:numId="34">
-    <w:abstractNumId w:val="12"/>
-  </w:num>
   <w:num w:numId="35">
-    <w:abstractNumId w:val="4"/>
+    <w:abstractNumId w:val="5"/>
   </w:num>
   <w:num w:numId="36">
-    <w:abstractNumId w:val="36"/>
+    <w:abstractNumId w:val="38"/>
   </w:num>
   <w:num w:numId="37">
-    <w:abstractNumId w:val="40"/>
+    <w:abstractNumId w:val="42"/>
   </w:num>
   <w:num w:numId="38">
     <w:abstractNumId w:val="0"/>
   </w:num>
   <w:num w:numId="39">
+    <w:abstractNumId w:val="21"/>
+  </w:num>
+  <w:num w:numId="40">
     <w:abstractNumId w:val="20"/>
   </w:num>
-  <w:num w:numId="40">
-    <w:abstractNumId w:val="19"/>
+  <w:num w:numId="41">
+    <w:abstractNumId w:val="9"/>
   </w:num>
-  <w:num w:numId="41">
-    <w:abstractNumId w:val="8"/>
+  <w:num w:numId="42">
+    <w:abstractNumId w:val="4"/>
+  </w:num>
+  <w:num w:numId="43">
+    <w:abstractNumId w:val="24"/>
   </w:num>
 </w:numbering>
 </file>

</xml_diff>